<commit_message>
Dodanie przykładu przypadku użycia dla zarząd
</commit_message>
<xml_diff>
--- a/TC (p. 4.1)/Przypadek użycia1.docx
+++ b/TC (p. 4.1)/Przypadek użycia1.docx
@@ -2,7 +2,7 @@
 <file path=word/document.xml><?xml version="1.0" encoding="utf-8"?>
 <w:document xmlns:o="urn:schemas-microsoft-com:office:office" xmlns:r="http://schemas.openxmlformats.org/officeDocument/2006/relationships" xmlns:v="urn:schemas-microsoft-com:vml" xmlns:w="http://schemas.openxmlformats.org/wordprocessingml/2006/main" xmlns:w10="urn:schemas-microsoft-com:office:word" xmlns:wp="http://schemas.openxmlformats.org/drawingml/2006/wordprocessingDrawing" xmlns:pic="http://schemas.openxmlformats.org/drawingml/2006/picture" xmlns:wps="http://schemas.microsoft.com/office/word/2010/wordprocessingShape" xmlns:wpg="http://schemas.microsoft.com/office/word/2010/wordprocessingGroup" xmlns:mc="http://schemas.openxmlformats.org/markup-compatibility/2006" xmlns:wp14="http://schemas.microsoft.com/office/word/2010/wordprocessingDrawing" xmlns:w14="http://schemas.microsoft.com/office/word/2010/wordml" xmlns:w15="http://schemas.microsoft.com/office/word/2012/wordml" mc:Ignorable="w14 wp14 w15">
   <w:body>
-    <w:p>
+    <w:p xmlns:wp14="http://schemas.microsoft.com/office/word/2010/wordml" wp14:textId="77777777">
       <w:pPr>
         <w:pStyle w:val="Normal"/>
         <w:spacing w:before="0" w:afterAutospacing="1"/>
@@ -21,7 +21,7 @@
         <w:t>Przypadek użycia: Opłacenie składki</w:t>
       </w:r>
     </w:p>
-    <w:p>
+    <w:p xmlns:wp14="http://schemas.microsoft.com/office/word/2010/wordml" wp14:textId="77777777">
       <w:pPr>
         <w:pStyle w:val="Normal"/>
         <w:spacing w:before="0" w:afterAutospacing="1"/>
@@ -40,7 +40,7 @@
         <w:t>1. Aktorzy:</w:t>
       </w:r>
     </w:p>
-    <w:p>
+    <w:p xmlns:wp14="http://schemas.microsoft.com/office/word/2010/wordml" wp14:textId="77777777">
       <w:pPr>
         <w:pStyle w:val="Normal"/>
         <w:numPr>
@@ -61,7 +61,7 @@
         <w:t xml:space="preserve">Rodzic/Opiekun </w:t>
       </w:r>
     </w:p>
-    <w:p>
+    <w:p xmlns:wp14="http://schemas.microsoft.com/office/word/2010/wordml" wp14:textId="77777777">
       <w:pPr>
         <w:pStyle w:val="Normal"/>
         <w:spacing w:before="0" w:afterAutospacing="1"/>
@@ -80,7 +80,7 @@
         <w:t>2. Scenariusz podstawowy:</w:t>
       </w:r>
     </w:p>
-    <w:p>
+    <w:p xmlns:wp14="http://schemas.microsoft.com/office/word/2010/wordml" wp14:textId="77777777">
       <w:pPr>
         <w:pStyle w:val="Normal"/>
         <w:numPr>
@@ -101,7 +101,7 @@
         <w:t xml:space="preserve">System wymaga uwierzytelnienia użytkownika (przypadek użycia: Logowanie). </w:t>
       </w:r>
     </w:p>
-    <w:p>
+    <w:p xmlns:wp14="http://schemas.microsoft.com/office/word/2010/wordml" wp14:textId="77777777">
       <w:pPr>
         <w:pStyle w:val="Normal"/>
         <w:numPr>
@@ -122,7 +122,7 @@
         <w:t xml:space="preserve">System prezentuje panel płatności zawierający informacje o zaległościach. </w:t>
       </w:r>
     </w:p>
-    <w:p>
+    <w:p xmlns:wp14="http://schemas.microsoft.com/office/word/2010/wordml" wp14:textId="77777777">
       <w:pPr>
         <w:pStyle w:val="Normal"/>
         <w:numPr>
@@ -143,7 +143,7 @@
         <w:t xml:space="preserve">Rodzic/Opiekun wybiera miesiąc, którego dotyczy płatność, oraz metodę jej realizacji. </w:t>
       </w:r>
     </w:p>
-    <w:p>
+    <w:p xmlns:wp14="http://schemas.microsoft.com/office/word/2010/wordml" wp14:textId="77777777">
       <w:pPr>
         <w:pStyle w:val="Normal"/>
         <w:numPr>
@@ -164,7 +164,7 @@
         <w:t xml:space="preserve">Rodzic/Opiekun dokonuje płatność. </w:t>
       </w:r>
     </w:p>
-    <w:p>
+    <w:p xmlns:wp14="http://schemas.microsoft.com/office/word/2010/wordml" wp14:textId="77777777">
       <w:pPr>
         <w:pStyle w:val="Normal"/>
         <w:numPr>
@@ -185,7 +185,7 @@
         <w:t xml:space="preserve">Po pozytywnej weryfikacji system rejestruje wpłatę w systemie finansowym. </w:t>
       </w:r>
     </w:p>
-    <w:p>
+    <w:p xmlns:wp14="http://schemas.microsoft.com/office/word/2010/wordml" wp14:textId="77777777">
       <w:pPr>
         <w:pStyle w:val="Normal"/>
         <w:numPr>
@@ -206,7 +206,7 @@
         <w:t xml:space="preserve">System informuje użytkownika o wyniku operacji. </w:t>
       </w:r>
     </w:p>
-    <w:p>
+    <w:p xmlns:wp14="http://schemas.microsoft.com/office/word/2010/wordml" wp14:textId="77777777">
       <w:pPr>
         <w:pStyle w:val="Normal"/>
         <w:spacing w:before="0" w:afterAutospacing="1"/>
@@ -230,10 +230,16 @@
           <w:szCs w:val="20"/>
         </w:rPr>
         <w:br/>
+      </w:r>
+      <w:r>
+        <w:rPr>
+          <w:sz w:val="20"/>
+          <w:szCs w:val="20"/>
+        </w:rPr>
         <w:t>a) Odrzucenie transakcji:</w:t>
       </w:r>
     </w:p>
-    <w:p>
+    <w:p xmlns:wp14="http://schemas.microsoft.com/office/word/2010/wordml" wp14:textId="77777777">
       <w:pPr>
         <w:pStyle w:val="Normal"/>
         <w:numPr>
@@ -254,7 +260,7 @@
         <w:t xml:space="preserve">System wyświetla komunikat o błędzie. </w:t>
       </w:r>
     </w:p>
-    <w:p>
+    <w:p xmlns:wp14="http://schemas.microsoft.com/office/word/2010/wordml" wp14:textId="77777777">
       <w:pPr>
         <w:pStyle w:val="Normal"/>
         <w:numPr>
@@ -275,7 +281,7 @@
         <w:t xml:space="preserve">Status składki pozostaje „nieopłacona”. </w:t>
       </w:r>
     </w:p>
-    <w:p>
+    <w:p xmlns:wp14="http://schemas.microsoft.com/office/word/2010/wordml" wp14:textId="77777777">
       <w:pPr>
         <w:pStyle w:val="Normal"/>
         <w:spacing w:before="0" w:afterAutospacing="1"/>
@@ -292,7 +298,7 @@
         <w:t>b) Rezygnacja użytkownika:</w:t>
       </w:r>
     </w:p>
-    <w:p>
+    <w:p xmlns:wp14="http://schemas.microsoft.com/office/word/2010/wordml" wp14:textId="77777777">
       <w:pPr>
         <w:pStyle w:val="Normal"/>
         <w:numPr>
@@ -313,7 +319,7 @@
         <w:t xml:space="preserve">Rodzic/Opiekun wybiera opcję „Anuluj”. </w:t>
       </w:r>
     </w:p>
-    <w:p>
+    <w:p xmlns:wp14="http://schemas.microsoft.com/office/word/2010/wordml" wp14:textId="77777777">
       <w:pPr>
         <w:pStyle w:val="Normal"/>
         <w:numPr>
@@ -334,7 +340,7 @@
         <w:t xml:space="preserve">System przerywa proces i przywraca stan sprzed rozpoczęcia operacji. </w:t>
       </w:r>
     </w:p>
-    <w:p>
+    <w:p xmlns:wp14="http://schemas.microsoft.com/office/word/2010/wordml" wp14:textId="77777777">
       <w:pPr>
         <w:pStyle w:val="Normal"/>
         <w:spacing w:before="0" w:afterAutospacing="1"/>
@@ -353,7 +359,7 @@
         <w:t>4. Uwarunkowania czasowe:</w:t>
       </w:r>
     </w:p>
-    <w:p>
+    <w:p xmlns:wp14="http://schemas.microsoft.com/office/word/2010/wordml" wp14:textId="77777777">
       <w:pPr>
         <w:pStyle w:val="Normal"/>
         <w:numPr>
@@ -374,7 +380,7 @@
         <w:t xml:space="preserve">Częstotliwość: średnio raz w miesiącu dla każdego dziecka. </w:t>
       </w:r>
     </w:p>
-    <w:p>
+    <w:p xmlns:wp14="http://schemas.microsoft.com/office/word/2010/wordml" wp14:textId="77777777">
       <w:pPr>
         <w:pStyle w:val="Normal"/>
         <w:numPr>
@@ -395,7 +401,7 @@
         <w:t xml:space="preserve">Okresy wzmożonego użycia: początek miesiąca (terminy płatności). </w:t>
       </w:r>
     </w:p>
-    <w:p>
+    <w:p xmlns:wp14="http://schemas.microsoft.com/office/word/2010/wordml" wp14:textId="77777777">
       <w:pPr>
         <w:pStyle w:val="Normal"/>
         <w:numPr>
@@ -416,7 +422,7 @@
         <w:t xml:space="preserve">Średni czas realizacji: ok. 2 minuty. </w:t>
       </w:r>
     </w:p>
-    <w:p>
+    <w:p xmlns:wp14="http://schemas.microsoft.com/office/word/2010/wordml" wp14:textId="77777777">
       <w:pPr>
         <w:pStyle w:val="Normal"/>
         <w:numPr>
@@ -437,7 +443,7 @@
         <w:t xml:space="preserve">Maksymalny czas realizacji: zależny od czasu autoryzacji w systemie bankowym. </w:t>
       </w:r>
     </w:p>
-    <w:p>
+    <w:p xmlns:wp14="http://schemas.microsoft.com/office/word/2010/wordml" wp14:textId="77777777">
       <w:pPr>
         <w:pStyle w:val="Normal"/>
         <w:spacing w:before="0" w:afterAutospacing="1"/>
@@ -456,7 +462,7 @@
         <w:t>5. Rezultaty dla aktora:</w:t>
       </w:r>
     </w:p>
-    <w:p>
+    <w:p xmlns:wp14="http://schemas.microsoft.com/office/word/2010/wordml" wp14:textId="77777777">
       <w:pPr>
         <w:pStyle w:val="Normal"/>
         <w:numPr>
@@ -477,7 +483,7 @@
         <w:t xml:space="preserve">Informacja o powodzeniu lub niepowodzeniu operacji. </w:t>
       </w:r>
     </w:p>
-    <w:p>
+    <w:p xmlns:wp14="http://schemas.microsoft.com/office/word/2010/wordml" wp14:textId="77777777">
       <w:pPr>
         <w:pStyle w:val="Normal"/>
         <w:numPr>
@@ -498,7 +504,7 @@
         <w:t>Zmiana statusu składek na opłacone.</w:t>
       </w:r>
     </w:p>
-    <w:p>
+    <w:p xmlns:wp14="http://schemas.microsoft.com/office/word/2010/wordml" wp14:textId="77777777">
       <w:pPr>
         <w:pStyle w:val="Normal"/>
         <w:rPr/>
@@ -507,7 +513,7 @@
         <w:rPr/>
       </w:r>
     </w:p>
-    <w:p>
+    <w:p xmlns:wp14="http://schemas.microsoft.com/office/word/2010/wordml" wp14:textId="77777777">
       <w:pPr>
         <w:pStyle w:val="Normal"/>
         <w:rPr/>
@@ -516,7 +522,7 @@
         <w:rPr/>
       </w:r>
     </w:p>
-    <w:p>
+    <w:p xmlns:wp14="http://schemas.microsoft.com/office/word/2010/wordml" wp14:textId="77777777">
       <w:pPr>
         <w:pStyle w:val="Normal"/>
         <w:rPr/>
@@ -525,7 +531,7 @@
         <w:rPr/>
       </w:r>
     </w:p>
-    <w:p>
+    <w:p xmlns:wp14="http://schemas.microsoft.com/office/word/2010/wordml" wp14:textId="77777777">
       <w:pPr>
         <w:pStyle w:val="Normal"/>
         <w:rPr/>
@@ -534,7 +540,7 @@
         <w:rPr/>
       </w:r>
     </w:p>
-    <w:p>
+    <w:p xmlns:wp14="http://schemas.microsoft.com/office/word/2010/wordml" wp14:textId="77777777">
       <w:pPr>
         <w:pStyle w:val="Normal"/>
         <w:rPr/>
@@ -543,7 +549,7 @@
         <w:rPr/>
       </w:r>
     </w:p>
-    <w:p>
+    <w:p xmlns:wp14="http://schemas.microsoft.com/office/word/2010/wordml" wp14:textId="77777777">
       <w:pPr>
         <w:pStyle w:val="Normal"/>
         <w:rPr/>
@@ -552,7 +558,7 @@
         <w:rPr/>
       </w:r>
     </w:p>
-    <w:p>
+    <w:p xmlns:wp14="http://schemas.microsoft.com/office/word/2010/wordml" wp14:textId="77777777">
       <w:pPr>
         <w:pStyle w:val="Normal"/>
         <w:rPr/>
@@ -561,33 +567,45 @@
         <w:rPr/>
       </w:r>
     </w:p>
-    <w:p>
+    <w:p xmlns:wp14="http://schemas.microsoft.com/office/word/2010/wordml" wp14:textId="77777777">
       <w:pPr>
         <w:pStyle w:val="BodyText"/>
-        <w:spacing w:lineRule="auto" w:line="278" w:before="0" w:after="160"/>
-        <w:rPr/>
-      </w:pPr>
-      <w:r>
+        <w:spacing w:before="0" w:after="160" w:line="278" w:lineRule="auto"/>
         <w:rPr>
           <w:rStyle w:val="Strong"/>
+          <w:sz w:val="20"/>
+          <w:szCs w:val="20"/>
+        </w:rPr>
+      </w:pPr>
+      <w:r>
+        <w:rPr>
+          <w:rStyle w:val="Strong"/>
+          <w:sz w:val="20"/>
+          <w:szCs w:val="20"/>
         </w:rPr>
         <w:t>Opis przypadku użycia: „Powołanie zawodnika”</w:t>
       </w:r>
     </w:p>
-    <w:p>
+    <w:p xmlns:wp14="http://schemas.microsoft.com/office/word/2010/wordml" wp14:textId="77777777">
       <w:pPr>
         <w:pStyle w:val="BodyText"/>
-        <w:spacing w:lineRule="auto" w:line="278" w:before="0" w:after="160"/>
-        <w:rPr/>
-      </w:pPr>
-      <w:r>
+        <w:spacing w:before="0" w:after="160" w:line="278" w:lineRule="auto"/>
         <w:rPr>
           <w:rStyle w:val="Strong"/>
+          <w:sz w:val="20"/>
+          <w:szCs w:val="20"/>
+        </w:rPr>
+      </w:pPr>
+      <w:r>
+        <w:rPr>
+          <w:rStyle w:val="Strong"/>
+          <w:sz w:val="20"/>
+          <w:szCs w:val="20"/>
         </w:rPr>
         <w:t>1. Aktorzy</w:t>
       </w:r>
     </w:p>
-    <w:p>
+    <w:p xmlns:wp14="http://schemas.microsoft.com/office/word/2010/wordml" wp14:textId="77777777">
       <w:pPr>
         <w:pStyle w:val="BodyText"/>
         <w:numPr>
@@ -596,31 +614,43 @@
         </w:numPr>
         <w:tabs>
           <w:tab w:val="clear" w:pos="708"/>
-          <w:tab w:val="left" w:pos="0" w:leader="none"/>
-        </w:tabs>
-        <w:spacing w:lineRule="auto" w:line="278"/>
-        <w:ind w:hanging="283" w:start="709"/>
-        <w:rPr/>
-      </w:pPr>
-      <w:r>
-        <w:rPr/>
+          <w:tab w:val="left" w:leader="none" w:pos="0"/>
+        </w:tabs>
+        <w:spacing w:line="278" w:lineRule="auto"/>
+        <w:ind w:start="709" w:hanging="283"/>
+        <w:rPr>
+          <w:sz w:val="20"/>
+          <w:szCs w:val="20"/>
+        </w:rPr>
+      </w:pPr>
+      <w:r>
+        <w:rPr>
+          <w:sz w:val="20"/>
+          <w:szCs w:val="20"/>
+        </w:rPr>
         <w:t xml:space="preserve">Trener </w:t>
       </w:r>
     </w:p>
-    <w:p>
+    <w:p xmlns:wp14="http://schemas.microsoft.com/office/word/2010/wordml" wp14:textId="77777777">
       <w:pPr>
         <w:pStyle w:val="BodyText"/>
-        <w:spacing w:lineRule="auto" w:line="278" w:before="0" w:after="160"/>
-        <w:rPr/>
-      </w:pPr>
-      <w:r>
+        <w:spacing w:before="0" w:after="160" w:line="278" w:lineRule="auto"/>
         <w:rPr>
           <w:rStyle w:val="Strong"/>
+          <w:sz w:val="20"/>
+          <w:szCs w:val="20"/>
+        </w:rPr>
+      </w:pPr>
+      <w:r>
+        <w:rPr>
+          <w:rStyle w:val="Strong"/>
+          <w:sz w:val="20"/>
+          <w:szCs w:val="20"/>
         </w:rPr>
         <w:t>2. Główny przebieg zdarzeń</w:t>
       </w:r>
     </w:p>
-    <w:p>
+    <w:p xmlns:wp14="http://schemas.microsoft.com/office/word/2010/wordml" wp14:textId="77777777">
       <w:pPr>
         <w:pStyle w:val="BodyText"/>
         <w:numPr>
@@ -629,18 +659,24 @@
         </w:numPr>
         <w:tabs>
           <w:tab w:val="clear" w:pos="708"/>
-          <w:tab w:val="left" w:pos="0" w:leader="none"/>
-        </w:tabs>
-        <w:spacing w:lineRule="auto" w:line="278" w:before="0" w:after="0"/>
-        <w:ind w:hanging="283" w:start="709"/>
-        <w:rPr/>
-      </w:pPr>
-      <w:r>
-        <w:rPr/>
+          <w:tab w:val="left" w:leader="none" w:pos="0"/>
+        </w:tabs>
+        <w:spacing w:before="0" w:after="0" w:line="278" w:lineRule="auto"/>
+        <w:ind w:start="709" w:hanging="283"/>
+        <w:rPr>
+          <w:sz w:val="20"/>
+          <w:szCs w:val="20"/>
+        </w:rPr>
+      </w:pPr>
+      <w:r>
+        <w:rPr>
+          <w:sz w:val="20"/>
+          <w:szCs w:val="20"/>
+        </w:rPr>
         <w:t xml:space="preserve">Trener loguje się do systemu (przypadek użycia: Logowanie), a następnie wybiera z kalendarza konkretny mecz. </w:t>
       </w:r>
     </w:p>
-    <w:p>
+    <w:p xmlns:wp14="http://schemas.microsoft.com/office/word/2010/wordml" wp14:textId="77777777">
       <w:pPr>
         <w:pStyle w:val="BodyText"/>
         <w:numPr>
@@ -649,18 +685,24 @@
         </w:numPr>
         <w:tabs>
           <w:tab w:val="clear" w:pos="708"/>
-          <w:tab w:val="left" w:pos="0" w:leader="none"/>
-        </w:tabs>
-        <w:spacing w:lineRule="auto" w:line="278" w:before="0" w:after="0"/>
-        <w:ind w:hanging="283" w:start="709"/>
-        <w:rPr/>
-      </w:pPr>
-      <w:r>
-        <w:rPr/>
+          <w:tab w:val="left" w:leader="none" w:pos="0"/>
+        </w:tabs>
+        <w:spacing w:before="0" w:after="0" w:line="278" w:lineRule="auto"/>
+        <w:ind w:start="709" w:hanging="283"/>
+        <w:rPr>
+          <w:sz w:val="20"/>
+          <w:szCs w:val="20"/>
+        </w:rPr>
+      </w:pPr>
+      <w:r>
+        <w:rPr>
+          <w:sz w:val="20"/>
+          <w:szCs w:val="20"/>
+        </w:rPr>
         <w:t xml:space="preserve">System wyświetla listę zawodników przypisanych do jego drużyny. </w:t>
       </w:r>
     </w:p>
-    <w:p>
+    <w:p xmlns:wp14="http://schemas.microsoft.com/office/word/2010/wordml" wp14:textId="77777777">
       <w:pPr>
         <w:pStyle w:val="BodyText"/>
         <w:numPr>
@@ -669,18 +711,24 @@
         </w:numPr>
         <w:tabs>
           <w:tab w:val="clear" w:pos="708"/>
-          <w:tab w:val="left" w:pos="0" w:leader="none"/>
-        </w:tabs>
-        <w:spacing w:lineRule="auto" w:line="278" w:before="0" w:after="0"/>
-        <w:ind w:hanging="283" w:start="709"/>
-        <w:rPr/>
-      </w:pPr>
-      <w:r>
-        <w:rPr/>
+          <w:tab w:val="left" w:leader="none" w:pos="0"/>
+        </w:tabs>
+        <w:spacing w:before="0" w:after="0" w:line="278" w:lineRule="auto"/>
+        <w:ind w:start="709" w:hanging="283"/>
+        <w:rPr>
+          <w:sz w:val="20"/>
+          <w:szCs w:val="20"/>
+        </w:rPr>
+      </w:pPr>
+      <w:r>
+        <w:rPr>
+          <w:sz w:val="20"/>
+          <w:szCs w:val="20"/>
+        </w:rPr>
         <w:t xml:space="preserve">Trener zaznacza zawodników, których chce powołać na mecz. </w:t>
       </w:r>
     </w:p>
-    <w:p>
+    <w:p xmlns:wp14="http://schemas.microsoft.com/office/word/2010/wordml" wp14:textId="77777777">
       <w:pPr>
         <w:pStyle w:val="BodyText"/>
         <w:numPr>
@@ -689,18 +737,24 @@
         </w:numPr>
         <w:tabs>
           <w:tab w:val="clear" w:pos="708"/>
-          <w:tab w:val="left" w:pos="0" w:leader="none"/>
-        </w:tabs>
-        <w:spacing w:lineRule="auto" w:line="278" w:before="0" w:after="0"/>
-        <w:ind w:hanging="283" w:start="709"/>
-        <w:rPr/>
-      </w:pPr>
-      <w:r>
-        <w:rPr/>
+          <w:tab w:val="left" w:leader="none" w:pos="0"/>
+        </w:tabs>
+        <w:spacing w:before="0" w:after="0" w:line="278" w:lineRule="auto"/>
+        <w:ind w:start="709" w:hanging="283"/>
+        <w:rPr>
+          <w:sz w:val="20"/>
+          <w:szCs w:val="20"/>
+        </w:rPr>
+      </w:pPr>
+      <w:r>
+        <w:rPr>
+          <w:sz w:val="20"/>
+          <w:szCs w:val="20"/>
+        </w:rPr>
         <w:t xml:space="preserve">Po pozytywnej walidacji system zapisuje skład w bazie danych. </w:t>
       </w:r>
     </w:p>
-    <w:p>
+    <w:p xmlns:wp14="http://schemas.microsoft.com/office/word/2010/wordml" wp14:textId="77777777">
       <w:pPr>
         <w:pStyle w:val="BodyText"/>
         <w:numPr>
@@ -709,18 +763,24 @@
         </w:numPr>
         <w:tabs>
           <w:tab w:val="clear" w:pos="708"/>
-          <w:tab w:val="left" w:pos="0" w:leader="none"/>
-        </w:tabs>
-        <w:spacing w:lineRule="auto" w:line="278"/>
-        <w:ind w:hanging="283" w:start="709"/>
-        <w:rPr/>
-      </w:pPr>
-      <w:r>
-        <w:rPr/>
+          <w:tab w:val="left" w:leader="none" w:pos="0"/>
+        </w:tabs>
+        <w:spacing w:line="278" w:lineRule="auto"/>
+        <w:ind w:start="709" w:hanging="283"/>
+        <w:rPr>
+          <w:sz w:val="20"/>
+          <w:szCs w:val="20"/>
+        </w:rPr>
+      </w:pPr>
+      <w:r>
+        <w:rPr>
+          <w:sz w:val="20"/>
+          <w:szCs w:val="20"/>
+        </w:rPr>
         <w:t>System wyświetla komunikat potwierdzający poprawne zapisanie powołań.</w:t>
       </w:r>
     </w:p>
-    <w:p>
+    <w:p xmlns:wp14="http://schemas.microsoft.com/office/word/2010/wordml" wp14:textId="77777777">
       <w:pPr>
         <w:pStyle w:val="BodyText"/>
         <w:numPr>
@@ -729,36 +789,52 @@
         </w:numPr>
         <w:tabs>
           <w:tab w:val="clear" w:pos="708"/>
-          <w:tab w:val="left" w:pos="0" w:leader="none"/>
-        </w:tabs>
-        <w:spacing w:lineRule="auto" w:line="278"/>
-        <w:ind w:hanging="283" w:start="709"/>
-        <w:rPr/>
-      </w:pPr>
-      <w:r>
-        <w:rPr/>
+          <w:tab w:val="left" w:leader="none" w:pos="0"/>
+        </w:tabs>
+        <w:spacing w:line="278" w:lineRule="auto"/>
+        <w:ind w:start="709" w:hanging="283"/>
+        <w:rPr>
+          <w:sz w:val="20"/>
+          <w:szCs w:val="20"/>
+        </w:rPr>
+      </w:pPr>
+      <w:r>
+        <w:rPr>
+          <w:sz w:val="20"/>
+          <w:szCs w:val="20"/>
+        </w:rPr>
         <w:t>System wysyła informację o powołaniu na mecz do rodziców</w:t>
       </w:r>
     </w:p>
-    <w:p>
+    <w:p xmlns:wp14="http://schemas.microsoft.com/office/word/2010/wordml" wp14:textId="77777777">
       <w:pPr>
         <w:pStyle w:val="BodyText"/>
-        <w:spacing w:lineRule="auto" w:line="278" w:before="0" w:after="160"/>
-        <w:rPr/>
+        <w:spacing w:before="0" w:after="160" w:line="278" w:lineRule="auto"/>
+        <w:rPr>
+          <w:sz w:val="20"/>
+          <w:szCs w:val="20"/>
+        </w:rPr>
       </w:pPr>
       <w:r>
         <w:rPr>
           <w:rStyle w:val="Strong"/>
+          <w:sz w:val="20"/>
+          <w:szCs w:val="20"/>
         </w:rPr>
         <w:t>3. Alternatywne przebiegi zdarzeń</w:t>
       </w:r>
       <w:r>
-        <w:rPr/>
         <w:br/>
+      </w:r>
+      <w:r>
+        <w:rPr>
+          <w:sz w:val="20"/>
+          <w:szCs w:val="20"/>
+        </w:rPr>
         <w:t>a) Zawodnik nie posiada aktualnych badań lekarskich</w:t>
       </w:r>
     </w:p>
-    <w:p>
+    <w:p xmlns:wp14="http://schemas.microsoft.com/office/word/2010/wordml" wp14:textId="77777777">
       <w:pPr>
         <w:pStyle w:val="BodyText"/>
         <w:numPr>
@@ -767,29 +843,41 @@
         </w:numPr>
         <w:tabs>
           <w:tab w:val="clear" w:pos="708"/>
-          <w:tab w:val="left" w:pos="0" w:leader="none"/>
-        </w:tabs>
-        <w:spacing w:lineRule="auto" w:line="278"/>
-        <w:ind w:hanging="283" w:start="709"/>
-        <w:rPr/>
-      </w:pPr>
-      <w:r>
-        <w:rPr/>
+          <w:tab w:val="left" w:leader="none" w:pos="0"/>
+        </w:tabs>
+        <w:spacing w:line="278" w:lineRule="auto"/>
+        <w:ind w:start="709" w:hanging="283"/>
+        <w:rPr>
+          <w:sz w:val="20"/>
+          <w:szCs w:val="20"/>
+        </w:rPr>
+      </w:pPr>
+      <w:r>
+        <w:rPr>
+          <w:sz w:val="20"/>
+          <w:szCs w:val="20"/>
+        </w:rPr>
         <w:t xml:space="preserve">System uniemożliwia jego wybór (pole jest nieaktywne) oraz wyświetla informację o braku ważnych badań. </w:t>
       </w:r>
     </w:p>
-    <w:p>
+    <w:p xmlns:wp14="http://schemas.microsoft.com/office/word/2010/wordml" wp14:textId="77777777">
       <w:pPr>
         <w:pStyle w:val="BodyText"/>
-        <w:spacing w:lineRule="auto" w:line="278" w:before="0" w:after="160"/>
-        <w:rPr/>
-      </w:pPr>
-      <w:r>
-        <w:rPr/>
+        <w:spacing w:before="0" w:after="160" w:line="278" w:lineRule="auto"/>
+        <w:rPr>
+          <w:sz w:val="20"/>
+          <w:szCs w:val="20"/>
+        </w:rPr>
+      </w:pPr>
+      <w:r>
+        <w:rPr>
+          <w:sz w:val="20"/>
+          <w:szCs w:val="20"/>
+        </w:rPr>
         <w:t>b) Rezygnacja trenera</w:t>
       </w:r>
     </w:p>
-    <w:p>
+    <w:p xmlns:wp14="http://schemas.microsoft.com/office/word/2010/wordml" wp14:textId="77777777">
       <w:pPr>
         <w:pStyle w:val="BodyText"/>
         <w:numPr>
@@ -798,18 +886,24 @@
         </w:numPr>
         <w:tabs>
           <w:tab w:val="clear" w:pos="708"/>
-          <w:tab w:val="left" w:pos="0" w:leader="none"/>
-        </w:tabs>
-        <w:spacing w:lineRule="auto" w:line="278" w:before="0" w:after="0"/>
-        <w:ind w:hanging="283" w:start="709"/>
-        <w:rPr/>
-      </w:pPr>
-      <w:r>
-        <w:rPr/>
+          <w:tab w:val="left" w:leader="none" w:pos="0"/>
+        </w:tabs>
+        <w:spacing w:before="0" w:after="0" w:line="278" w:lineRule="auto"/>
+        <w:ind w:start="709" w:hanging="283"/>
+        <w:rPr>
+          <w:sz w:val="20"/>
+          <w:szCs w:val="20"/>
+        </w:rPr>
+      </w:pPr>
+      <w:r>
+        <w:rPr>
+          <w:sz w:val="20"/>
+          <w:szCs w:val="20"/>
+        </w:rPr>
         <w:t xml:space="preserve">Trener wybiera opcję „Anuluj”. </w:t>
       </w:r>
     </w:p>
-    <w:p>
+    <w:p xmlns:wp14="http://schemas.microsoft.com/office/word/2010/wordml" wp14:textId="77777777">
       <w:pPr>
         <w:pStyle w:val="BodyText"/>
         <w:numPr>
@@ -818,31 +912,43 @@
         </w:numPr>
         <w:tabs>
           <w:tab w:val="clear" w:pos="708"/>
-          <w:tab w:val="left" w:pos="0" w:leader="none"/>
-        </w:tabs>
-        <w:spacing w:lineRule="auto" w:line="278"/>
-        <w:ind w:hanging="283" w:start="709"/>
-        <w:rPr/>
-      </w:pPr>
-      <w:r>
-        <w:rPr/>
+          <w:tab w:val="left" w:leader="none" w:pos="0"/>
+        </w:tabs>
+        <w:spacing w:line="278" w:lineRule="auto"/>
+        <w:ind w:start="709" w:hanging="283"/>
+        <w:rPr>
+          <w:sz w:val="20"/>
+          <w:szCs w:val="20"/>
+        </w:rPr>
+      </w:pPr>
+      <w:r>
+        <w:rPr>
+          <w:sz w:val="20"/>
+          <w:szCs w:val="20"/>
+        </w:rPr>
         <w:t xml:space="preserve">System zamyka okno bez zapisywania zmian. </w:t>
       </w:r>
     </w:p>
-    <w:p>
+    <w:p xmlns:wp14="http://schemas.microsoft.com/office/word/2010/wordml" wp14:textId="77777777">
       <w:pPr>
         <w:pStyle w:val="BodyText"/>
-        <w:spacing w:lineRule="auto" w:line="278" w:before="0" w:after="160"/>
-        <w:rPr/>
-      </w:pPr>
-      <w:r>
+        <w:spacing w:before="0" w:after="160" w:line="278" w:lineRule="auto"/>
         <w:rPr>
           <w:rStyle w:val="Strong"/>
+          <w:sz w:val="20"/>
+          <w:szCs w:val="20"/>
+        </w:rPr>
+      </w:pPr>
+      <w:r>
+        <w:rPr>
+          <w:rStyle w:val="Strong"/>
+          <w:sz w:val="20"/>
+          <w:szCs w:val="20"/>
         </w:rPr>
         <w:t>4. Ograniczenia czasowe i wydajnościowe</w:t>
       </w:r>
     </w:p>
-    <w:p>
+    <w:p xmlns:wp14="http://schemas.microsoft.com/office/word/2010/wordml" wp14:textId="77777777">
       <w:pPr>
         <w:pStyle w:val="BodyText"/>
         <w:numPr>
@@ -851,18 +957,24 @@
         </w:numPr>
         <w:tabs>
           <w:tab w:val="clear" w:pos="708"/>
-          <w:tab w:val="left" w:pos="0" w:leader="none"/>
-        </w:tabs>
-        <w:spacing w:lineRule="auto" w:line="278" w:before="0" w:after="0"/>
-        <w:ind w:hanging="283" w:start="709"/>
-        <w:rPr/>
-      </w:pPr>
-      <w:r>
-        <w:rPr/>
+          <w:tab w:val="left" w:leader="none" w:pos="0"/>
+        </w:tabs>
+        <w:spacing w:before="0" w:after="0" w:line="278" w:lineRule="auto"/>
+        <w:ind w:start="709" w:hanging="283"/>
+        <w:rPr>
+          <w:sz w:val="20"/>
+          <w:szCs w:val="20"/>
+        </w:rPr>
+      </w:pPr>
+      <w:r>
+        <w:rPr>
+          <w:sz w:val="20"/>
+          <w:szCs w:val="20"/>
+        </w:rPr>
         <w:t xml:space="preserve">Częstotliwość: średnio 1–2 razy w tygodniu dla każdej drużyny. </w:t>
       </w:r>
     </w:p>
-    <w:p>
+    <w:p xmlns:wp14="http://schemas.microsoft.com/office/word/2010/wordml" wp14:textId="77777777">
       <w:pPr>
         <w:pStyle w:val="BodyText"/>
         <w:numPr>
@@ -871,18 +983,24 @@
         </w:numPr>
         <w:tabs>
           <w:tab w:val="clear" w:pos="708"/>
-          <w:tab w:val="left" w:pos="0" w:leader="none"/>
-        </w:tabs>
-        <w:spacing w:lineRule="auto" w:line="278" w:before="0" w:after="0"/>
-        <w:ind w:hanging="283" w:start="709"/>
-        <w:rPr/>
-      </w:pPr>
-      <w:r>
-        <w:rPr/>
+          <w:tab w:val="left" w:leader="none" w:pos="0"/>
+        </w:tabs>
+        <w:spacing w:before="0" w:after="0" w:line="278" w:lineRule="auto"/>
+        <w:ind w:start="709" w:hanging="283"/>
+        <w:rPr>
+          <w:sz w:val="20"/>
+          <w:szCs w:val="20"/>
+        </w:rPr>
+      </w:pPr>
+      <w:r>
+        <w:rPr>
+          <w:sz w:val="20"/>
+          <w:szCs w:val="20"/>
+        </w:rPr>
         <w:t xml:space="preserve">Okresy zwiększonego obciążenia: czwartki i piątki (przed meczami weekendowymi). </w:t>
       </w:r>
     </w:p>
-    <w:p>
+    <w:p xmlns:wp14="http://schemas.microsoft.com/office/word/2010/wordml" wp14:textId="77777777">
       <w:pPr>
         <w:pStyle w:val="BodyText"/>
         <w:numPr>
@@ -891,18 +1009,24 @@
         </w:numPr>
         <w:tabs>
           <w:tab w:val="clear" w:pos="708"/>
-          <w:tab w:val="left" w:pos="0" w:leader="none"/>
-        </w:tabs>
-        <w:spacing w:lineRule="auto" w:line="278" w:before="0" w:after="0"/>
-        <w:ind w:hanging="283" w:start="709"/>
-        <w:rPr/>
-      </w:pPr>
-      <w:r>
-        <w:rPr/>
+          <w:tab w:val="left" w:leader="none" w:pos="0"/>
+        </w:tabs>
+        <w:spacing w:before="0" w:after="0" w:line="278" w:lineRule="auto"/>
+        <w:ind w:start="709" w:hanging="283"/>
+        <w:rPr>
+          <w:sz w:val="20"/>
+          <w:szCs w:val="20"/>
+        </w:rPr>
+      </w:pPr>
+      <w:r>
+        <w:rPr>
+          <w:sz w:val="20"/>
+          <w:szCs w:val="20"/>
+        </w:rPr>
         <w:t xml:space="preserve">Typowy czas realizacji: około 3 minuty. </w:t>
       </w:r>
     </w:p>
-    <w:p>
+    <w:p xmlns:wp14="http://schemas.microsoft.com/office/word/2010/wordml" wp14:textId="77777777">
       <w:pPr>
         <w:pStyle w:val="BodyText"/>
         <w:numPr>
@@ -911,31 +1035,43 @@
         </w:numPr>
         <w:tabs>
           <w:tab w:val="clear" w:pos="708"/>
-          <w:tab w:val="left" w:pos="0" w:leader="none"/>
-        </w:tabs>
-        <w:spacing w:lineRule="auto" w:line="278"/>
-        <w:ind w:hanging="283" w:start="709"/>
-        <w:rPr/>
-      </w:pPr>
-      <w:r>
-        <w:rPr/>
+          <w:tab w:val="left" w:leader="none" w:pos="0"/>
+        </w:tabs>
+        <w:spacing w:line="278" w:lineRule="auto"/>
+        <w:ind w:start="709" w:hanging="283"/>
+        <w:rPr>
+          <w:sz w:val="20"/>
+          <w:szCs w:val="20"/>
+        </w:rPr>
+      </w:pPr>
+      <w:r>
+        <w:rPr>
+          <w:sz w:val="20"/>
+          <w:szCs w:val="20"/>
+        </w:rPr>
         <w:t xml:space="preserve">Maksymalny czas realizacji: nieokreślony. </w:t>
       </w:r>
     </w:p>
-    <w:p>
+    <w:p xmlns:wp14="http://schemas.microsoft.com/office/word/2010/wordml" wp14:textId="77777777">
       <w:pPr>
         <w:pStyle w:val="BodyText"/>
-        <w:spacing w:lineRule="auto" w:line="278" w:before="0" w:after="160"/>
-        <w:rPr/>
-      </w:pPr>
-      <w:r>
+        <w:spacing w:before="0" w:after="160" w:line="278" w:lineRule="auto"/>
         <w:rPr>
           <w:rStyle w:val="Strong"/>
+          <w:sz w:val="20"/>
+          <w:szCs w:val="20"/>
+        </w:rPr>
+      </w:pPr>
+      <w:r>
+        <w:rPr>
+          <w:rStyle w:val="Strong"/>
+          <w:sz w:val="20"/>
+          <w:szCs w:val="20"/>
         </w:rPr>
         <w:t>5. Rezultaty dla aktora</w:t>
       </w:r>
     </w:p>
-    <w:p>
+    <w:p xmlns:wp14="http://schemas.microsoft.com/office/word/2010/wordml" wp14:textId="77777777">
       <w:pPr>
         <w:pStyle w:val="BodyText"/>
         <w:numPr>
@@ -944,18 +1080,24 @@
         </w:numPr>
         <w:tabs>
           <w:tab w:val="clear" w:pos="708"/>
-          <w:tab w:val="left" w:pos="0" w:leader="none"/>
-        </w:tabs>
-        <w:spacing w:lineRule="auto" w:line="278" w:before="0" w:after="0"/>
-        <w:ind w:hanging="283" w:start="709"/>
-        <w:rPr/>
-      </w:pPr>
-      <w:r>
-        <w:rPr/>
+          <w:tab w:val="left" w:leader="none" w:pos="0"/>
+        </w:tabs>
+        <w:spacing w:before="0" w:after="0" w:line="278" w:lineRule="auto"/>
+        <w:ind w:start="709" w:hanging="283"/>
+        <w:rPr>
+          <w:sz w:val="20"/>
+          <w:szCs w:val="20"/>
+        </w:rPr>
+      </w:pPr>
+      <w:r>
+        <w:rPr>
+          <w:sz w:val="20"/>
+          <w:szCs w:val="20"/>
+        </w:rPr>
         <w:t xml:space="preserve">Wyświetlenie komunikatu o pomyślnym zapisaniu składu. </w:t>
       </w:r>
     </w:p>
-    <w:p>
+    <w:p xmlns:wp14="http://schemas.microsoft.com/office/word/2010/wordml" wp14:textId="77777777">
       <w:pPr>
         <w:pStyle w:val="BodyText"/>
         <w:numPr>
@@ -964,18 +1106,24 @@
         </w:numPr>
         <w:tabs>
           <w:tab w:val="clear" w:pos="708"/>
-          <w:tab w:val="left" w:pos="0" w:leader="none"/>
-        </w:tabs>
-        <w:spacing w:lineRule="auto" w:line="278" w:before="0" w:after="0"/>
-        <w:ind w:hanging="283" w:start="709"/>
-        <w:rPr/>
-      </w:pPr>
-      <w:r>
-        <w:rPr/>
+          <w:tab w:val="left" w:leader="none" w:pos="0"/>
+        </w:tabs>
+        <w:spacing w:before="0" w:after="0" w:line="278" w:lineRule="auto"/>
+        <w:ind w:start="709" w:hanging="283"/>
+        <w:rPr>
+          <w:sz w:val="20"/>
+          <w:szCs w:val="20"/>
+        </w:rPr>
+      </w:pPr>
+      <w:r>
+        <w:rPr>
+          <w:sz w:val="20"/>
+          <w:szCs w:val="20"/>
+        </w:rPr>
         <w:t xml:space="preserve">Zapisanie kadry na wybrany mecz w systemie. </w:t>
       </w:r>
     </w:p>
-    <w:p>
+    <w:p xmlns:wp14="http://schemas.microsoft.com/office/word/2010/wordml" wp14:textId="77777777">
       <w:pPr>
         <w:pStyle w:val="BodyText"/>
         <w:numPr>
@@ -984,65 +1132,828 @@
         </w:numPr>
         <w:tabs>
           <w:tab w:val="clear" w:pos="708"/>
-          <w:tab w:val="left" w:pos="0" w:leader="none"/>
-        </w:tabs>
-        <w:spacing w:lineRule="auto" w:line="278"/>
-        <w:ind w:hanging="283" w:start="709"/>
-        <w:rPr/>
-      </w:pPr>
-      <w:r>
-        <w:rPr/>
+          <w:tab w:val="left" w:leader="none" w:pos="0"/>
+        </w:tabs>
+        <w:spacing w:line="278" w:lineRule="auto"/>
+        <w:ind w:start="709" w:hanging="283"/>
+        <w:rPr>
+          <w:sz w:val="20"/>
+          <w:szCs w:val="20"/>
+        </w:rPr>
+      </w:pPr>
+      <w:r>
+        <w:rPr>
+          <w:sz w:val="20"/>
+          <w:szCs w:val="20"/>
+        </w:rPr>
         <w:t>Automatyczne wysłanie powiadomień do rodziców powołanych zawodników.</w:t>
       </w:r>
     </w:p>
-    <w:p>
+    <w:p xmlns:wp14="http://schemas.microsoft.com/office/word/2010/wordml" wp14:textId="77777777">
       <w:pPr>
         <w:pStyle w:val="Normal"/>
-        <w:rPr/>
-      </w:pPr>
-      <w:r>
-        <w:rPr/>
-      </w:r>
-    </w:p>
-    <w:p>
-      <w:pPr>
-        <w:pStyle w:val="Normal"/>
-        <w:rPr/>
-      </w:pPr>
-      <w:r>
-        <w:rPr/>
-      </w:r>
-    </w:p>
-    <w:p>
-      <w:pPr>
-        <w:pStyle w:val="Normal"/>
-        <w:rPr/>
-      </w:pPr>
-      <w:r>
-        <w:rPr/>
-      </w:r>
-    </w:p>
-    <w:p>
+        <w:rPr>
+          <w:sz w:val="20"/>
+          <w:szCs w:val="20"/>
+        </w:rPr>
+      </w:pPr>
+    </w:p>
+    <w:p xmlns:wp14="http://schemas.microsoft.com/office/word/2010/wordml" wp14:textId="0D6EB7ED">
       <w:pPr>
         <w:pStyle w:val="Normal"/>
         <w:widowControl/>
-        <w:bidi w:val="0"/>
-        <w:spacing w:lineRule="auto" w:line="278" w:before="0" w:after="160"/>
-        <w:jc w:val="start"/>
-        <w:rPr/>
-      </w:pPr>
-      <w:r>
-        <w:rPr/>
-      </w:r>
+        <w:spacing w:before="0" w:after="160" w:line="278" w:lineRule="auto"/>
+        <w:rPr>
+          <w:sz w:val="20"/>
+          <w:szCs w:val="20"/>
+        </w:rPr>
+      </w:pPr>
+    </w:p>
+    <w:p xmlns:wp14="http://schemas.microsoft.com/office/word/2010/wordml" wp14:textId="2DBE4F13">
+      <w:pPr>
+        <w:widowControl/>
+        <w:spacing w:before="240" w:beforeAutospacing="off" w:after="240" w:afterAutospacing="off" w:line="278" w:lineRule="auto"/>
+        <w:rPr>
+          <w:rFonts w:ascii="Aptos" w:hAnsi="Aptos" w:eastAsia="Aptos" w:cs="Aptos"/>
+          <w:b w:val="1"/>
+          <w:bCs w:val="1"/>
+          <w:noProof w:val="0"/>
+          <w:sz w:val="20"/>
+          <w:szCs w:val="20"/>
+          <w:lang w:val="pl-PL"/>
+        </w:rPr>
+      </w:pPr>
+      <w:r>
+        <w:rPr>
+          <w:rFonts w:ascii="Aptos" w:hAnsi="Aptos" w:eastAsia="Aptos" w:cs="Aptos"/>
+          <w:b w:val="1"/>
+          <w:bCs w:val="1"/>
+          <w:noProof w:val="0"/>
+          <w:sz w:val="20"/>
+          <w:szCs w:val="20"/>
+          <w:lang w:val="pl-PL"/>
+        </w:rPr>
+        <w:t>Opis przypadku użycia: „Edycja danych użytkownika"</w:t>
+      </w:r>
+    </w:p>
+    <w:p xmlns:wp14="http://schemas.microsoft.com/office/word/2010/wordml" wp14:textId="69DC0E13">
+      <w:pPr>
+        <w:widowControl/>
+        <w:spacing w:before="240" w:beforeAutospacing="off" w:after="240" w:afterAutospacing="off" w:line="278" w:lineRule="auto"/>
+        <w:rPr>
+          <w:rFonts w:ascii="Aptos" w:hAnsi="Aptos" w:eastAsia="Aptos" w:cs="Aptos"/>
+          <w:b w:val="1"/>
+          <w:bCs w:val="1"/>
+          <w:noProof w:val="0"/>
+          <w:sz w:val="20"/>
+          <w:szCs w:val="20"/>
+          <w:lang w:val="pl-PL"/>
+        </w:rPr>
+      </w:pPr>
+      <w:r>
+        <w:rPr>
+          <w:rFonts w:ascii="Aptos" w:hAnsi="Aptos" w:eastAsia="Aptos" w:cs="Aptos"/>
+          <w:b w:val="1"/>
+          <w:bCs w:val="1"/>
+          <w:noProof w:val="0"/>
+          <w:sz w:val="20"/>
+          <w:szCs w:val="20"/>
+          <w:lang w:val="pl-PL"/>
+        </w:rPr>
+        <w:t>1. Uczestniczący aktorzy</w:t>
+      </w:r>
+    </w:p>
+    <w:p xmlns:wp14="http://schemas.microsoft.com/office/word/2010/wordml" wp14:textId="6DE50094">
+      <w:pPr>
+        <w:pStyle w:val="ListParagraph"/>
+        <w:widowControl/>
+        <w:numPr>
+          <w:ilvl w:val="0"/>
+          <w:numId w:val="14"/>
+        </w:numPr>
+        <w:spacing w:before="0" w:beforeAutospacing="off" w:after="0" w:afterAutospacing="off" w:line="278" w:lineRule="auto"/>
+        <w:rPr>
+          <w:rFonts w:ascii="Aptos" w:hAnsi="Aptos" w:eastAsia="Aptos" w:cs="Aptos"/>
+          <w:noProof w:val="0"/>
+          <w:sz w:val="20"/>
+          <w:szCs w:val="20"/>
+          <w:lang w:val="pl-PL"/>
+        </w:rPr>
+      </w:pPr>
+      <w:r>
+        <w:rPr>
+          <w:rFonts w:ascii="Aptos" w:hAnsi="Aptos" w:eastAsia="Aptos" w:cs="Aptos"/>
+          <w:noProof w:val="0"/>
+          <w:sz w:val="20"/>
+          <w:szCs w:val="20"/>
+          <w:lang w:val="pl-PL"/>
+        </w:rPr>
+        <w:t>Zarząd</w:t>
+      </w:r>
+    </w:p>
+    <w:p xmlns:wp14="http://schemas.microsoft.com/office/word/2010/wordml" wp14:textId="7FD8203C">
+      <w:pPr>
+        <w:widowControl/>
+        <w:spacing w:before="240" w:beforeAutospacing="off" w:after="240" w:afterAutospacing="off" w:line="278" w:lineRule="auto"/>
+        <w:rPr>
+          <w:rFonts w:ascii="Aptos" w:hAnsi="Aptos" w:eastAsia="Aptos" w:cs="Aptos"/>
+          <w:b w:val="1"/>
+          <w:bCs w:val="1"/>
+          <w:noProof w:val="0"/>
+          <w:sz w:val="20"/>
+          <w:szCs w:val="20"/>
+          <w:lang w:val="pl-PL"/>
+        </w:rPr>
+      </w:pPr>
+      <w:r>
+        <w:rPr>
+          <w:rFonts w:ascii="Aptos" w:hAnsi="Aptos" w:eastAsia="Aptos" w:cs="Aptos"/>
+          <w:b w:val="1"/>
+          <w:bCs w:val="1"/>
+          <w:noProof w:val="0"/>
+          <w:sz w:val="20"/>
+          <w:szCs w:val="20"/>
+          <w:lang w:val="pl-PL"/>
+        </w:rPr>
+        <w:t>2. Podstawowy ciąg zdarzeń</w:t>
+      </w:r>
+    </w:p>
+    <w:p xmlns:wp14="http://schemas.microsoft.com/office/word/2010/wordml" wp14:textId="3D42C71C">
+      <w:pPr>
+        <w:pStyle w:val="ListParagraph"/>
+        <w:widowControl/>
+        <w:numPr>
+          <w:ilvl w:val="0"/>
+          <w:numId w:val="15"/>
+        </w:numPr>
+        <w:spacing w:before="0" w:beforeAutospacing="off" w:after="0" w:afterAutospacing="off" w:line="278" w:lineRule="auto"/>
+        <w:rPr>
+          <w:rFonts w:ascii="Aptos" w:hAnsi="Aptos" w:eastAsia="Aptos" w:cs="Aptos"/>
+          <w:noProof w:val="0"/>
+          <w:sz w:val="20"/>
+          <w:szCs w:val="20"/>
+          <w:lang w:val="pl-PL"/>
+        </w:rPr>
+      </w:pPr>
+      <w:r>
+        <w:rPr>
+          <w:rFonts w:ascii="Aptos" w:hAnsi="Aptos" w:eastAsia="Aptos" w:cs="Aptos"/>
+          <w:noProof w:val="0"/>
+          <w:sz w:val="20"/>
+          <w:szCs w:val="20"/>
+          <w:lang w:val="pl-PL"/>
+        </w:rPr>
+        <w:t>Zarząd loguje się do systemu (przypadek użycia: Logowanie),</w:t>
+      </w:r>
+    </w:p>
+    <w:p xmlns:wp14="http://schemas.microsoft.com/office/word/2010/wordml" wp14:textId="50150FAB">
+      <w:pPr>
+        <w:pStyle w:val="ListParagraph"/>
+        <w:widowControl/>
+        <w:numPr>
+          <w:ilvl w:val="0"/>
+          <w:numId w:val="15"/>
+        </w:numPr>
+        <w:spacing w:before="0" w:beforeAutospacing="off" w:after="0" w:afterAutospacing="off" w:line="278" w:lineRule="auto"/>
+        <w:rPr>
+          <w:rFonts w:ascii="Aptos" w:hAnsi="Aptos" w:eastAsia="Aptos" w:cs="Aptos"/>
+          <w:noProof w:val="0"/>
+          <w:sz w:val="20"/>
+          <w:szCs w:val="20"/>
+          <w:lang w:val="pl-PL"/>
+        </w:rPr>
+      </w:pPr>
+      <w:r>
+        <w:rPr>
+          <w:rFonts w:ascii="Aptos" w:hAnsi="Aptos" w:eastAsia="Aptos" w:cs="Aptos"/>
+          <w:noProof w:val="0"/>
+          <w:sz w:val="20"/>
+          <w:szCs w:val="20"/>
+          <w:lang w:val="pl-PL"/>
+        </w:rPr>
+        <w:t>Zarząd wchodzi w zakładkę do zarządzania użytkownikami,</w:t>
+      </w:r>
+    </w:p>
+    <w:p xmlns:wp14="http://schemas.microsoft.com/office/word/2010/wordml" wp14:textId="18DF78D7">
+      <w:pPr>
+        <w:pStyle w:val="ListParagraph"/>
+        <w:widowControl/>
+        <w:numPr>
+          <w:ilvl w:val="0"/>
+          <w:numId w:val="15"/>
+        </w:numPr>
+        <w:spacing w:before="0" w:beforeAutospacing="off" w:after="0" w:afterAutospacing="off" w:line="278" w:lineRule="auto"/>
+        <w:rPr>
+          <w:rFonts w:ascii="Aptos" w:hAnsi="Aptos" w:eastAsia="Aptos" w:cs="Aptos"/>
+          <w:noProof w:val="0"/>
+          <w:sz w:val="20"/>
+          <w:szCs w:val="20"/>
+          <w:lang w:val="pl-PL"/>
+        </w:rPr>
+      </w:pPr>
+      <w:r>
+        <w:rPr>
+          <w:rFonts w:ascii="Aptos" w:hAnsi="Aptos" w:eastAsia="Aptos" w:cs="Aptos"/>
+          <w:noProof w:val="0"/>
+          <w:sz w:val="20"/>
+          <w:szCs w:val="20"/>
+          <w:lang w:val="pl-PL"/>
+        </w:rPr>
+        <w:t>System pokazuje listę wszystkich kont w aplikacji,</w:t>
+      </w:r>
+    </w:p>
+    <w:p xmlns:wp14="http://schemas.microsoft.com/office/word/2010/wordml" wp14:textId="3BA842F8">
+      <w:pPr>
+        <w:pStyle w:val="ListParagraph"/>
+        <w:widowControl/>
+        <w:numPr>
+          <w:ilvl w:val="0"/>
+          <w:numId w:val="15"/>
+        </w:numPr>
+        <w:spacing w:before="0" w:beforeAutospacing="off" w:after="0" w:afterAutospacing="off" w:line="278" w:lineRule="auto"/>
+        <w:rPr>
+          <w:rFonts w:ascii="Aptos" w:hAnsi="Aptos" w:eastAsia="Aptos" w:cs="Aptos"/>
+          <w:noProof w:val="0"/>
+          <w:sz w:val="20"/>
+          <w:szCs w:val="20"/>
+          <w:lang w:val="pl-PL"/>
+        </w:rPr>
+      </w:pPr>
+      <w:r>
+        <w:rPr>
+          <w:rFonts w:ascii="Aptos" w:hAnsi="Aptos" w:eastAsia="Aptos" w:cs="Aptos"/>
+          <w:noProof w:val="0"/>
+          <w:sz w:val="20"/>
+          <w:szCs w:val="20"/>
+          <w:lang w:val="pl-PL"/>
+        </w:rPr>
+        <w:t>Zarząd wybiera z listy konkretnego użytkownika, żeby edytować jego dane,</w:t>
+      </w:r>
+    </w:p>
+    <w:p xmlns:wp14="http://schemas.microsoft.com/office/word/2010/wordml" wp14:textId="30322455">
+      <w:pPr>
+        <w:pStyle w:val="ListParagraph"/>
+        <w:widowControl/>
+        <w:numPr>
+          <w:ilvl w:val="0"/>
+          <w:numId w:val="15"/>
+        </w:numPr>
+        <w:spacing w:before="0" w:beforeAutospacing="off" w:after="0" w:afterAutospacing="off" w:line="278" w:lineRule="auto"/>
+        <w:rPr>
+          <w:rFonts w:ascii="Aptos" w:hAnsi="Aptos" w:eastAsia="Aptos" w:cs="Aptos"/>
+          <w:noProof w:val="0"/>
+          <w:sz w:val="20"/>
+          <w:szCs w:val="20"/>
+          <w:lang w:val="pl-PL"/>
+        </w:rPr>
+      </w:pPr>
+      <w:r>
+        <w:rPr>
+          <w:rFonts w:ascii="Aptos" w:hAnsi="Aptos" w:eastAsia="Aptos" w:cs="Aptos"/>
+          <w:noProof w:val="0"/>
+          <w:sz w:val="20"/>
+          <w:szCs w:val="20"/>
+          <w:lang w:val="pl-PL"/>
+        </w:rPr>
+        <w:t>Jeśli edytowany jest trener, Zarząd może mu od razu przydzielić drużynę (przypadek użycia: Przypisywanie trenerów do grup),</w:t>
+      </w:r>
+    </w:p>
+    <w:p xmlns:wp14="http://schemas.microsoft.com/office/word/2010/wordml" wp14:textId="74A375BE">
+      <w:pPr>
+        <w:pStyle w:val="ListParagraph"/>
+        <w:widowControl/>
+        <w:numPr>
+          <w:ilvl w:val="0"/>
+          <w:numId w:val="15"/>
+        </w:numPr>
+        <w:spacing w:before="0" w:beforeAutospacing="off" w:after="0" w:afterAutospacing="off" w:line="278" w:lineRule="auto"/>
+        <w:rPr>
+          <w:rFonts w:ascii="Aptos" w:hAnsi="Aptos" w:eastAsia="Aptos" w:cs="Aptos"/>
+          <w:noProof w:val="0"/>
+          <w:sz w:val="20"/>
+          <w:szCs w:val="20"/>
+          <w:lang w:val="pl-PL"/>
+        </w:rPr>
+      </w:pPr>
+      <w:r>
+        <w:rPr>
+          <w:rFonts w:ascii="Aptos" w:hAnsi="Aptos" w:eastAsia="Aptos" w:cs="Aptos"/>
+          <w:noProof w:val="0"/>
+          <w:sz w:val="20"/>
+          <w:szCs w:val="20"/>
+          <w:lang w:val="pl-PL"/>
+        </w:rPr>
+        <w:t>Zarząd klika przycisk „Zapisz",</w:t>
+      </w:r>
+    </w:p>
+    <w:p xmlns:wp14="http://schemas.microsoft.com/office/word/2010/wordml" wp14:textId="54B571EE">
+      <w:pPr>
+        <w:pStyle w:val="ListParagraph"/>
+        <w:widowControl/>
+        <w:numPr>
+          <w:ilvl w:val="0"/>
+          <w:numId w:val="15"/>
+        </w:numPr>
+        <w:spacing w:before="0" w:beforeAutospacing="off" w:after="0" w:afterAutospacing="off" w:line="278" w:lineRule="auto"/>
+        <w:rPr>
+          <w:rFonts w:ascii="Aptos" w:hAnsi="Aptos" w:eastAsia="Aptos" w:cs="Aptos"/>
+          <w:noProof w:val="0"/>
+          <w:sz w:val="20"/>
+          <w:szCs w:val="20"/>
+          <w:lang w:val="pl-PL"/>
+        </w:rPr>
+      </w:pPr>
+      <w:r>
+        <w:rPr>
+          <w:rFonts w:ascii="Aptos" w:hAnsi="Aptos" w:eastAsia="Aptos" w:cs="Aptos"/>
+          <w:noProof w:val="0"/>
+          <w:sz w:val="20"/>
+          <w:szCs w:val="20"/>
+          <w:lang w:val="pl-PL"/>
+        </w:rPr>
+        <w:t>System sprawdza, czy wpisane dane są poprawne,</w:t>
+      </w:r>
+    </w:p>
+    <w:p xmlns:wp14="http://schemas.microsoft.com/office/word/2010/wordml" wp14:textId="08126217">
+      <w:pPr>
+        <w:pStyle w:val="ListParagraph"/>
+        <w:widowControl/>
+        <w:numPr>
+          <w:ilvl w:val="0"/>
+          <w:numId w:val="15"/>
+        </w:numPr>
+        <w:spacing w:before="0" w:beforeAutospacing="off" w:after="0" w:afterAutospacing="off" w:line="278" w:lineRule="auto"/>
+        <w:rPr>
+          <w:rFonts w:ascii="Aptos" w:hAnsi="Aptos" w:eastAsia="Aptos" w:cs="Aptos"/>
+          <w:noProof w:val="0"/>
+          <w:sz w:val="20"/>
+          <w:szCs w:val="20"/>
+          <w:lang w:val="pl-PL"/>
+        </w:rPr>
+      </w:pPr>
+      <w:r>
+        <w:rPr>
+          <w:rFonts w:ascii="Aptos" w:hAnsi="Aptos" w:eastAsia="Aptos" w:cs="Aptos"/>
+          <w:noProof w:val="0"/>
+          <w:sz w:val="20"/>
+          <w:szCs w:val="20"/>
+          <w:lang w:val="pl-PL"/>
+        </w:rPr>
+        <w:t>System aktualizuje informacje w bazie,</w:t>
+      </w:r>
+    </w:p>
+    <w:p xmlns:wp14="http://schemas.microsoft.com/office/word/2010/wordml" wp14:textId="44ECD68F">
+      <w:pPr>
+        <w:pStyle w:val="ListParagraph"/>
+        <w:widowControl/>
+        <w:numPr>
+          <w:ilvl w:val="0"/>
+          <w:numId w:val="15"/>
+        </w:numPr>
+        <w:spacing w:before="0" w:beforeAutospacing="off" w:after="0" w:afterAutospacing="off" w:line="278" w:lineRule="auto"/>
+        <w:rPr>
+          <w:rFonts w:ascii="Aptos" w:hAnsi="Aptos" w:eastAsia="Aptos" w:cs="Aptos"/>
+          <w:noProof w:val="0"/>
+          <w:sz w:val="20"/>
+          <w:szCs w:val="20"/>
+          <w:lang w:val="pl-PL"/>
+        </w:rPr>
+      </w:pPr>
+      <w:r>
+        <w:rPr>
+          <w:rFonts w:ascii="Aptos" w:hAnsi="Aptos" w:eastAsia="Aptos" w:cs="Aptos"/>
+          <w:noProof w:val="0"/>
+          <w:sz w:val="20"/>
+          <w:szCs w:val="20"/>
+          <w:lang w:val="pl-PL"/>
+        </w:rPr>
+        <w:t>Wyświetla się komunikat, że zmiany zostały zapisane.</w:t>
+      </w:r>
+    </w:p>
+    <w:p xmlns:wp14="http://schemas.microsoft.com/office/word/2010/wordml" wp14:textId="558514C5">
+      <w:pPr>
+        <w:widowControl/>
+        <w:spacing w:before="240" w:beforeAutospacing="off" w:after="240" w:afterAutospacing="off" w:line="278" w:lineRule="auto"/>
+        <w:rPr>
+          <w:rFonts w:ascii="Aptos" w:hAnsi="Aptos" w:eastAsia="Aptos" w:cs="Aptos"/>
+          <w:noProof w:val="0"/>
+          <w:sz w:val="20"/>
+          <w:szCs w:val="20"/>
+          <w:lang w:val="pl-PL"/>
+        </w:rPr>
+      </w:pPr>
+      <w:r>
+        <w:rPr>
+          <w:rFonts w:ascii="Aptos" w:hAnsi="Aptos" w:eastAsia="Aptos" w:cs="Aptos"/>
+          <w:b w:val="1"/>
+          <w:bCs w:val="1"/>
+          <w:noProof w:val="0"/>
+          <w:sz w:val="20"/>
+          <w:szCs w:val="20"/>
+          <w:lang w:val="pl-PL"/>
+        </w:rPr>
+        <w:t>3. Alternatywne ciągi zdarzeń</w:t>
+      </w:r>
+      <w:r>
+        <w:rPr>
+          <w:rFonts w:ascii="Aptos" w:hAnsi="Aptos" w:eastAsia="Aptos" w:cs="Aptos"/>
+          <w:noProof w:val="0"/>
+          <w:sz w:val="20"/>
+          <w:szCs w:val="20"/>
+          <w:lang w:val="pl-PL"/>
+        </w:rPr>
+        <w:t xml:space="preserve"> a) Wpisano błędne dane (np. zły format maila)</w:t>
+      </w:r>
+    </w:p>
+    <w:p xmlns:wp14="http://schemas.microsoft.com/office/word/2010/wordml" wp14:textId="21537D03">
+      <w:pPr>
+        <w:pStyle w:val="ListParagraph"/>
+        <w:widowControl/>
+        <w:numPr>
+          <w:ilvl w:val="0"/>
+          <w:numId w:val="16"/>
+        </w:numPr>
+        <w:spacing w:before="0" w:beforeAutospacing="off" w:after="0" w:afterAutospacing="off" w:line="278" w:lineRule="auto"/>
+        <w:rPr>
+          <w:rFonts w:ascii="Aptos" w:hAnsi="Aptos" w:eastAsia="Aptos" w:cs="Aptos"/>
+          <w:noProof w:val="0"/>
+          <w:sz w:val="20"/>
+          <w:szCs w:val="20"/>
+          <w:lang w:val="pl-PL"/>
+        </w:rPr>
+      </w:pPr>
+      <w:r>
+        <w:rPr>
+          <w:rFonts w:ascii="Aptos" w:hAnsi="Aptos" w:eastAsia="Aptos" w:cs="Aptos"/>
+          <w:noProof w:val="0"/>
+          <w:sz w:val="20"/>
+          <w:szCs w:val="20"/>
+          <w:lang w:val="pl-PL"/>
+        </w:rPr>
+        <w:t>System podświetla błędne pole na czerwono, pokazuje błąd i nie pozwala zapisać formularza.</w:t>
+      </w:r>
+    </w:p>
+    <w:p xmlns:wp14="http://schemas.microsoft.com/office/word/2010/wordml" wp14:textId="5DEA3390">
+      <w:pPr>
+        <w:widowControl/>
+        <w:spacing w:before="240" w:beforeAutospacing="off" w:after="240" w:afterAutospacing="off" w:line="278" w:lineRule="auto"/>
+        <w:rPr>
+          <w:rFonts w:ascii="Aptos" w:hAnsi="Aptos" w:eastAsia="Aptos" w:cs="Aptos"/>
+          <w:noProof w:val="0"/>
+          <w:sz w:val="20"/>
+          <w:szCs w:val="20"/>
+          <w:lang w:val="pl-PL"/>
+        </w:rPr>
+      </w:pPr>
+      <w:r>
+        <w:rPr>
+          <w:rFonts w:ascii="Aptos" w:hAnsi="Aptos" w:eastAsia="Aptos" w:cs="Aptos"/>
+          <w:noProof w:val="0"/>
+          <w:sz w:val="20"/>
+          <w:szCs w:val="20"/>
+          <w:lang w:val="pl-PL"/>
+        </w:rPr>
+        <w:t>b) Zarząd rezygnuje ze zmian i klika „Anuluj"</w:t>
+      </w:r>
+    </w:p>
+    <w:p xmlns:wp14="http://schemas.microsoft.com/office/word/2010/wordml" wp14:textId="1DBE9CF1">
+      <w:pPr>
+        <w:pStyle w:val="ListParagraph"/>
+        <w:widowControl/>
+        <w:numPr>
+          <w:ilvl w:val="0"/>
+          <w:numId w:val="17"/>
+        </w:numPr>
+        <w:spacing w:before="0" w:beforeAutospacing="off" w:after="0" w:afterAutospacing="off" w:line="278" w:lineRule="auto"/>
+        <w:rPr>
+          <w:rFonts w:ascii="Aptos" w:hAnsi="Aptos" w:eastAsia="Aptos" w:cs="Aptos"/>
+          <w:noProof w:val="0"/>
+          <w:sz w:val="20"/>
+          <w:szCs w:val="20"/>
+          <w:lang w:val="pl-PL"/>
+        </w:rPr>
+      </w:pPr>
+      <w:r>
+        <w:rPr>
+          <w:rFonts w:ascii="Aptos" w:hAnsi="Aptos" w:eastAsia="Aptos" w:cs="Aptos"/>
+          <w:noProof w:val="0"/>
+          <w:sz w:val="20"/>
+          <w:szCs w:val="20"/>
+          <w:lang w:val="pl-PL"/>
+        </w:rPr>
+        <w:t>System zamyka okno edycji i wraca do listy użytkowników, nic nie zmieniając.</w:t>
+      </w:r>
+    </w:p>
+    <w:p xmlns:wp14="http://schemas.microsoft.com/office/word/2010/wordml" wp14:textId="20E3E63E">
+      <w:pPr>
+        <w:widowControl/>
+        <w:spacing w:before="240" w:beforeAutospacing="off" w:after="240" w:afterAutospacing="off" w:line="278" w:lineRule="auto"/>
+        <w:rPr>
+          <w:rFonts w:ascii="Aptos" w:hAnsi="Aptos" w:eastAsia="Aptos" w:cs="Aptos"/>
+          <w:b w:val="1"/>
+          <w:bCs w:val="1"/>
+          <w:noProof w:val="0"/>
+          <w:sz w:val="20"/>
+          <w:szCs w:val="20"/>
+          <w:lang w:val="pl-PL"/>
+        </w:rPr>
+      </w:pPr>
+      <w:r>
+        <w:rPr>
+          <w:rFonts w:ascii="Aptos" w:hAnsi="Aptos" w:eastAsia="Aptos" w:cs="Aptos"/>
+          <w:b w:val="1"/>
+          <w:bCs w:val="1"/>
+          <w:noProof w:val="0"/>
+          <w:sz w:val="20"/>
+          <w:szCs w:val="20"/>
+          <w:lang w:val="pl-PL"/>
+        </w:rPr>
+        <w:t>4. Zależności czasowe</w:t>
+      </w:r>
+    </w:p>
+    <w:p xmlns:wp14="http://schemas.microsoft.com/office/word/2010/wordml" wp14:textId="1EFFD612">
+      <w:pPr>
+        <w:widowControl/>
+        <w:spacing w:before="240" w:beforeAutospacing="off" w:after="240" w:afterAutospacing="off" w:line="278" w:lineRule="auto"/>
+        <w:rPr>
+          <w:rFonts w:ascii="Aptos" w:hAnsi="Aptos" w:eastAsia="Aptos" w:cs="Aptos"/>
+          <w:noProof w:val="0"/>
+          <w:sz w:val="20"/>
+          <w:szCs w:val="20"/>
+          <w:lang w:val="pl-PL"/>
+        </w:rPr>
+      </w:pPr>
+      <w:r>
+        <w:rPr>
+          <w:rFonts w:ascii="Aptos" w:hAnsi="Aptos" w:eastAsia="Aptos" w:cs="Aptos"/>
+          <w:noProof w:val="0"/>
+          <w:sz w:val="20"/>
+          <w:szCs w:val="20"/>
+          <w:lang w:val="pl-PL"/>
+        </w:rPr>
+        <w:t xml:space="preserve">a) </w:t>
+      </w:r>
+      <w:r>
+        <w:rPr>
+          <w:rFonts w:ascii="Aptos" w:hAnsi="Aptos" w:eastAsia="Aptos" w:cs="Aptos"/>
+          <w:b w:val="1"/>
+          <w:bCs w:val="1"/>
+          <w:noProof w:val="0"/>
+          <w:sz w:val="20"/>
+          <w:szCs w:val="20"/>
+          <w:lang w:val="pl-PL"/>
+        </w:rPr>
+        <w:t>Częstotliwość wykonania:</w:t>
+      </w:r>
+      <w:r>
+        <w:rPr>
+          <w:rFonts w:ascii="Aptos" w:hAnsi="Aptos" w:eastAsia="Aptos" w:cs="Aptos"/>
+          <w:noProof w:val="0"/>
+          <w:sz w:val="20"/>
+          <w:szCs w:val="20"/>
+          <w:lang w:val="pl-PL"/>
+        </w:rPr>
+        <w:t xml:space="preserve"> kilka razy w tygodniu</w:t>
+      </w:r>
+    </w:p>
+    <w:p xmlns:wp14="http://schemas.microsoft.com/office/word/2010/wordml" wp14:textId="3AB8E2EA">
+      <w:pPr>
+        <w:widowControl/>
+        <w:spacing w:before="240" w:beforeAutospacing="off" w:after="240" w:afterAutospacing="off" w:line="278" w:lineRule="auto"/>
+        <w:rPr>
+          <w:rFonts w:ascii="Aptos" w:hAnsi="Aptos" w:eastAsia="Aptos" w:cs="Aptos"/>
+          <w:noProof w:val="0"/>
+          <w:sz w:val="20"/>
+          <w:szCs w:val="20"/>
+          <w:lang w:val="pl-PL"/>
+        </w:rPr>
+      </w:pPr>
+      <w:r>
+        <w:rPr>
+          <w:rFonts w:ascii="Aptos" w:hAnsi="Aptos" w:eastAsia="Aptos" w:cs="Aptos"/>
+          <w:noProof w:val="0"/>
+          <w:sz w:val="20"/>
+          <w:szCs w:val="20"/>
+          <w:lang w:val="pl-PL"/>
+        </w:rPr>
+        <w:t xml:space="preserve">b) </w:t>
+      </w:r>
+      <w:r>
+        <w:rPr>
+          <w:rFonts w:ascii="Aptos" w:hAnsi="Aptos" w:eastAsia="Aptos" w:cs="Aptos"/>
+          <w:b w:val="1"/>
+          <w:bCs w:val="1"/>
+          <w:noProof w:val="0"/>
+          <w:sz w:val="20"/>
+          <w:szCs w:val="20"/>
+          <w:lang w:val="pl-PL"/>
+        </w:rPr>
+        <w:t>Przewidywane spiętrzenia:</w:t>
+      </w:r>
+      <w:r>
+        <w:rPr>
+          <w:rFonts w:ascii="Aptos" w:hAnsi="Aptos" w:eastAsia="Aptos" w:cs="Aptos"/>
+          <w:noProof w:val="0"/>
+          <w:sz w:val="20"/>
+          <w:szCs w:val="20"/>
+          <w:lang w:val="pl-PL"/>
+        </w:rPr>
+        <w:t xml:space="preserve"> głównie przed startem nowego sezonu, gdy dochodzą nowi ludzie</w:t>
+      </w:r>
+    </w:p>
+    <w:p xmlns:wp14="http://schemas.microsoft.com/office/word/2010/wordml" wp14:textId="4182E809">
+      <w:pPr>
+        <w:widowControl/>
+        <w:spacing w:before="240" w:beforeAutospacing="off" w:after="240" w:afterAutospacing="off" w:line="278" w:lineRule="auto"/>
+        <w:rPr>
+          <w:rFonts w:ascii="Aptos" w:hAnsi="Aptos" w:eastAsia="Aptos" w:cs="Aptos"/>
+          <w:noProof w:val="0"/>
+          <w:sz w:val="20"/>
+          <w:szCs w:val="20"/>
+          <w:lang w:val="pl-PL"/>
+        </w:rPr>
+      </w:pPr>
+      <w:r>
+        <w:rPr>
+          <w:rFonts w:ascii="Aptos" w:hAnsi="Aptos" w:eastAsia="Aptos" w:cs="Aptos"/>
+          <w:noProof w:val="0"/>
+          <w:sz w:val="20"/>
+          <w:szCs w:val="20"/>
+          <w:lang w:val="pl-PL"/>
+        </w:rPr>
+        <w:t xml:space="preserve">c) </w:t>
+      </w:r>
+      <w:r>
+        <w:rPr>
+          <w:rFonts w:ascii="Aptos" w:hAnsi="Aptos" w:eastAsia="Aptos" w:cs="Aptos"/>
+          <w:b w:val="1"/>
+          <w:bCs w:val="1"/>
+          <w:noProof w:val="0"/>
+          <w:sz w:val="20"/>
+          <w:szCs w:val="20"/>
+          <w:lang w:val="pl-PL"/>
+        </w:rPr>
+        <w:t>Typowy czas realizacji:</w:t>
+      </w:r>
+      <w:r>
+        <w:rPr>
+          <w:rFonts w:ascii="Aptos" w:hAnsi="Aptos" w:eastAsia="Aptos" w:cs="Aptos"/>
+          <w:noProof w:val="0"/>
+          <w:sz w:val="20"/>
+          <w:szCs w:val="20"/>
+          <w:lang w:val="pl-PL"/>
+        </w:rPr>
+        <w:t xml:space="preserve"> ok. 2–3 minuty</w:t>
+      </w:r>
+    </w:p>
+    <w:p xmlns:wp14="http://schemas.microsoft.com/office/word/2010/wordml" wp14:textId="29605019">
+      <w:pPr>
+        <w:widowControl/>
+        <w:spacing w:before="240" w:beforeAutospacing="off" w:after="240" w:afterAutospacing="off" w:line="278" w:lineRule="auto"/>
+        <w:rPr>
+          <w:rFonts w:ascii="Aptos" w:hAnsi="Aptos" w:eastAsia="Aptos" w:cs="Aptos"/>
+          <w:noProof w:val="0"/>
+          <w:sz w:val="20"/>
+          <w:szCs w:val="20"/>
+          <w:lang w:val="pl-PL"/>
+        </w:rPr>
+      </w:pPr>
+      <w:r>
+        <w:rPr>
+          <w:rFonts w:ascii="Aptos" w:hAnsi="Aptos" w:eastAsia="Aptos" w:cs="Aptos"/>
+          <w:noProof w:val="0"/>
+          <w:sz w:val="20"/>
+          <w:szCs w:val="20"/>
+          <w:lang w:val="pl-PL"/>
+        </w:rPr>
+        <w:t xml:space="preserve">d) </w:t>
+      </w:r>
+      <w:r>
+        <w:rPr>
+          <w:rFonts w:ascii="Aptos" w:hAnsi="Aptos" w:eastAsia="Aptos" w:cs="Aptos"/>
+          <w:b w:val="1"/>
+          <w:bCs w:val="1"/>
+          <w:noProof w:val="0"/>
+          <w:sz w:val="20"/>
+          <w:szCs w:val="20"/>
+          <w:lang w:val="pl-PL"/>
+        </w:rPr>
+        <w:t>Maksymalny czas realizacji:</w:t>
+      </w:r>
+      <w:r>
+        <w:rPr>
+          <w:rFonts w:ascii="Aptos" w:hAnsi="Aptos" w:eastAsia="Aptos" w:cs="Aptos"/>
+          <w:noProof w:val="0"/>
+          <w:sz w:val="20"/>
+          <w:szCs w:val="20"/>
+          <w:lang w:val="pl-PL"/>
+        </w:rPr>
+        <w:t xml:space="preserve"> nieokreślony</w:t>
+      </w:r>
+    </w:p>
+    <w:p xmlns:wp14="http://schemas.microsoft.com/office/word/2010/wordml" wp14:textId="33EDCD0D">
+      <w:pPr>
+        <w:widowControl/>
+        <w:spacing w:before="240" w:beforeAutospacing="off" w:after="240" w:afterAutospacing="off" w:line="278" w:lineRule="auto"/>
+        <w:rPr>
+          <w:rFonts w:ascii="Aptos" w:hAnsi="Aptos" w:eastAsia="Aptos" w:cs="Aptos"/>
+          <w:b w:val="1"/>
+          <w:bCs w:val="1"/>
+          <w:noProof w:val="0"/>
+          <w:sz w:val="20"/>
+          <w:szCs w:val="20"/>
+          <w:lang w:val="pl-PL"/>
+        </w:rPr>
+      </w:pPr>
+      <w:r>
+        <w:rPr>
+          <w:rFonts w:ascii="Aptos" w:hAnsi="Aptos" w:eastAsia="Aptos" w:cs="Aptos"/>
+          <w:b w:val="1"/>
+          <w:bCs w:val="1"/>
+          <w:noProof w:val="0"/>
+          <w:sz w:val="20"/>
+          <w:szCs w:val="20"/>
+          <w:lang w:val="pl-PL"/>
+        </w:rPr>
+        <w:t>5. Wartości uzyskiwane przez aktorów po zakończeniu przypadku użycia</w:t>
+      </w:r>
+    </w:p>
+    <w:p xmlns:wp14="http://schemas.microsoft.com/office/word/2010/wordml" wp14:textId="18964B9A">
+      <w:pPr>
+        <w:pStyle w:val="ListParagraph"/>
+        <w:widowControl/>
+        <w:numPr>
+          <w:ilvl w:val="0"/>
+          <w:numId w:val="18"/>
+        </w:numPr>
+        <w:spacing w:before="0" w:beforeAutospacing="off" w:after="0" w:afterAutospacing="off" w:line="278" w:lineRule="auto"/>
+        <w:rPr>
+          <w:rFonts w:ascii="Aptos" w:hAnsi="Aptos" w:eastAsia="Aptos" w:cs="Aptos"/>
+          <w:noProof w:val="0"/>
+          <w:sz w:val="20"/>
+          <w:szCs w:val="20"/>
+          <w:lang w:val="pl-PL"/>
+        </w:rPr>
+      </w:pPr>
+      <w:r>
+        <w:rPr>
+          <w:rFonts w:ascii="Aptos" w:hAnsi="Aptos" w:eastAsia="Aptos" w:cs="Aptos"/>
+          <w:noProof w:val="0"/>
+          <w:sz w:val="20"/>
+          <w:szCs w:val="20"/>
+          <w:lang w:val="pl-PL"/>
+        </w:rPr>
+        <w:t>komunikat o udanej operacji na ekranie,</w:t>
+      </w:r>
+    </w:p>
+    <w:p xmlns:wp14="http://schemas.microsoft.com/office/word/2010/wordml" wp14:textId="1E99D8E7">
+      <w:pPr>
+        <w:pStyle w:val="ListParagraph"/>
+        <w:widowControl/>
+        <w:numPr>
+          <w:ilvl w:val="0"/>
+          <w:numId w:val="18"/>
+        </w:numPr>
+        <w:spacing w:before="0" w:beforeAutospacing="off" w:after="0" w:afterAutospacing="off" w:line="278" w:lineRule="auto"/>
+        <w:rPr>
+          <w:rFonts w:ascii="Aptos" w:hAnsi="Aptos" w:eastAsia="Aptos" w:cs="Aptos"/>
+          <w:noProof w:val="0"/>
+          <w:sz w:val="20"/>
+          <w:szCs w:val="20"/>
+          <w:lang w:val="pl-PL"/>
+        </w:rPr>
+      </w:pPr>
+      <w:r>
+        <w:rPr>
+          <w:rFonts w:ascii="Aptos" w:hAnsi="Aptos" w:eastAsia="Aptos" w:cs="Aptos"/>
+          <w:noProof w:val="0"/>
+          <w:sz w:val="20"/>
+          <w:szCs w:val="20"/>
+          <w:lang w:val="pl-PL"/>
+        </w:rPr>
+        <w:t>zmienione dane użytkownika w bazie klubu.</w:t>
+      </w:r>
+    </w:p>
+    <w:p xmlns:wp14="http://schemas.microsoft.com/office/word/2010/wordml" wp14:textId="45DA6AF2">
+      <w:pPr>
+        <w:pStyle w:val="Normal"/>
+        <w:widowControl/>
+        <w:spacing w:before="0" w:after="160" w:line="278" w:lineRule="auto"/>
+        <w:rPr>
+          <w:sz w:val="20"/>
+          <w:szCs w:val="20"/>
+        </w:rPr>
+      </w:pPr>
     </w:p>
     <w:sectPr>
       <w:type w:val="nextPage"/>
-      <w:pgSz w:w="11906" w:h="16838"/>
-      <w:pgMar w:left="1417" w:right="1417" w:gutter="0" w:header="0" w:top="1417" w:footer="0" w:bottom="1417"/>
+      <w:pgSz w:w="11906" w:h="16838" w:orient="portrait"/>
+      <w:pgMar w:top="1417" w:right="1417" w:bottom="1417" w:left="1417" w:header="0" w:footer="0" w:gutter="0"/>
       <w:pgNumType w:fmt="decimal"/>
       <w:formProt w:val="false"/>
       <w:textDirection w:val="lrTb"/>
       <w:docGrid w:type="default" w:linePitch="360" w:charSpace="0"/>
+      <w:cols w:num="1"/>
     </w:sectPr>
   </w:body>
 </w:document>
@@ -1050,6 +1961,566 @@
 
 <file path=word/numbering.xml><?xml version="1.0" encoding="utf-8"?>
 <w:numbering xmlns:w="http://schemas.openxmlformats.org/wordprocessingml/2006/main" xmlns:o="urn:schemas-microsoft-com:office:office" xmlns:r="http://schemas.openxmlformats.org/officeDocument/2006/relationships" xmlns:v="urn:schemas-microsoft-com:vml" xmlns:mc="http://schemas.openxmlformats.org/markup-compatibility/2006" xmlns:w14="http://schemas.microsoft.com/office/word/2010/wordml" mc:Ignorable="w14">
+  <w:abstractNum xmlns:w="http://schemas.openxmlformats.org/wordprocessingml/2006/main" w:abstractNumId="18">
+    <w:nsid w:val="1b07c11a"/>
+    <w:multiLevelType xmlns:w="http://schemas.openxmlformats.org/wordprocessingml/2006/main" w:val="hybridMultilevel"/>
+    <w:lvl xmlns:w="http://schemas.openxmlformats.org/wordprocessingml/2006/main" w:ilvl="0">
+      <w:start w:val="1"/>
+      <w:numFmt w:val="bullet"/>
+      <w:lvlText w:val=""/>
+      <w:lvlJc w:val="left"/>
+      <w:pPr>
+        <w:ind w:left="720" w:hanging="360"/>
+      </w:pPr>
+      <w:rPr>
+        <w:rFonts w:hint="default" w:ascii="Symbol" w:hAnsi="Symbol"/>
+      </w:rPr>
+    </w:lvl>
+    <w:lvl xmlns:w="http://schemas.openxmlformats.org/wordprocessingml/2006/main" w:ilvl="1">
+      <w:start w:val="1"/>
+      <w:numFmt w:val="bullet"/>
+      <w:lvlText w:val="o"/>
+      <w:lvlJc w:val="left"/>
+      <w:pPr>
+        <w:ind w:left="1440" w:hanging="360"/>
+      </w:pPr>
+      <w:rPr>
+        <w:rFonts w:hint="default" w:ascii="Courier New" w:hAnsi="Courier New"/>
+      </w:rPr>
+    </w:lvl>
+    <w:lvl xmlns:w="http://schemas.openxmlformats.org/wordprocessingml/2006/main" w:ilvl="2">
+      <w:start w:val="1"/>
+      <w:numFmt w:val="bullet"/>
+      <w:lvlText w:val=""/>
+      <w:lvlJc w:val="left"/>
+      <w:pPr>
+        <w:ind w:left="2160" w:hanging="360"/>
+      </w:pPr>
+      <w:rPr>
+        <w:rFonts w:hint="default" w:ascii="Wingdings" w:hAnsi="Wingdings"/>
+      </w:rPr>
+    </w:lvl>
+    <w:lvl xmlns:w="http://schemas.openxmlformats.org/wordprocessingml/2006/main" w:ilvl="3">
+      <w:start w:val="1"/>
+      <w:numFmt w:val="bullet"/>
+      <w:lvlText w:val=""/>
+      <w:lvlJc w:val="left"/>
+      <w:pPr>
+        <w:ind w:left="2880" w:hanging="360"/>
+      </w:pPr>
+      <w:rPr>
+        <w:rFonts w:hint="default" w:ascii="Symbol" w:hAnsi="Symbol"/>
+      </w:rPr>
+    </w:lvl>
+    <w:lvl xmlns:w="http://schemas.openxmlformats.org/wordprocessingml/2006/main" w:ilvl="4">
+      <w:start w:val="1"/>
+      <w:numFmt w:val="bullet"/>
+      <w:lvlText w:val="o"/>
+      <w:lvlJc w:val="left"/>
+      <w:pPr>
+        <w:ind w:left="3600" w:hanging="360"/>
+      </w:pPr>
+      <w:rPr>
+        <w:rFonts w:hint="default" w:ascii="Courier New" w:hAnsi="Courier New"/>
+      </w:rPr>
+    </w:lvl>
+    <w:lvl xmlns:w="http://schemas.openxmlformats.org/wordprocessingml/2006/main" w:ilvl="5">
+      <w:start w:val="1"/>
+      <w:numFmt w:val="bullet"/>
+      <w:lvlText w:val=""/>
+      <w:lvlJc w:val="left"/>
+      <w:pPr>
+        <w:ind w:left="4320" w:hanging="360"/>
+      </w:pPr>
+      <w:rPr>
+        <w:rFonts w:hint="default" w:ascii="Wingdings" w:hAnsi="Wingdings"/>
+      </w:rPr>
+    </w:lvl>
+    <w:lvl xmlns:w="http://schemas.openxmlformats.org/wordprocessingml/2006/main" w:ilvl="6">
+      <w:start w:val="1"/>
+      <w:numFmt w:val="bullet"/>
+      <w:lvlText w:val=""/>
+      <w:lvlJc w:val="left"/>
+      <w:pPr>
+        <w:ind w:left="5040" w:hanging="360"/>
+      </w:pPr>
+      <w:rPr>
+        <w:rFonts w:hint="default" w:ascii="Symbol" w:hAnsi="Symbol"/>
+      </w:rPr>
+    </w:lvl>
+    <w:lvl xmlns:w="http://schemas.openxmlformats.org/wordprocessingml/2006/main" w:ilvl="7">
+      <w:start w:val="1"/>
+      <w:numFmt w:val="bullet"/>
+      <w:lvlText w:val="o"/>
+      <w:lvlJc w:val="left"/>
+      <w:pPr>
+        <w:ind w:left="5760" w:hanging="360"/>
+      </w:pPr>
+      <w:rPr>
+        <w:rFonts w:hint="default" w:ascii="Courier New" w:hAnsi="Courier New"/>
+      </w:rPr>
+    </w:lvl>
+    <w:lvl xmlns:w="http://schemas.openxmlformats.org/wordprocessingml/2006/main" w:ilvl="8">
+      <w:start w:val="1"/>
+      <w:numFmt w:val="bullet"/>
+      <w:lvlText w:val=""/>
+      <w:lvlJc w:val="left"/>
+      <w:pPr>
+        <w:ind w:left="6480" w:hanging="360"/>
+      </w:pPr>
+      <w:rPr>
+        <w:rFonts w:hint="default" w:ascii="Wingdings" w:hAnsi="Wingdings"/>
+      </w:rPr>
+    </w:lvl>
+  </w:abstractNum>
+  <w:abstractNum xmlns:w="http://schemas.openxmlformats.org/wordprocessingml/2006/main" w:abstractNumId="17">
+    <w:nsid w:val="14ab832e"/>
+    <w:multiLevelType xmlns:w="http://schemas.openxmlformats.org/wordprocessingml/2006/main" w:val="hybridMultilevel"/>
+    <w:lvl xmlns:w="http://schemas.openxmlformats.org/wordprocessingml/2006/main" w:ilvl="0">
+      <w:start w:val="1"/>
+      <w:numFmt w:val="bullet"/>
+      <w:lvlText w:val=""/>
+      <w:lvlJc w:val="left"/>
+      <w:pPr>
+        <w:ind w:left="720" w:hanging="360"/>
+      </w:pPr>
+      <w:rPr>
+        <w:rFonts w:hint="default" w:ascii="Symbol" w:hAnsi="Symbol"/>
+      </w:rPr>
+    </w:lvl>
+    <w:lvl xmlns:w="http://schemas.openxmlformats.org/wordprocessingml/2006/main" w:ilvl="1">
+      <w:start w:val="1"/>
+      <w:numFmt w:val="bullet"/>
+      <w:lvlText w:val="o"/>
+      <w:lvlJc w:val="left"/>
+      <w:pPr>
+        <w:ind w:left="1440" w:hanging="360"/>
+      </w:pPr>
+      <w:rPr>
+        <w:rFonts w:hint="default" w:ascii="Courier New" w:hAnsi="Courier New"/>
+      </w:rPr>
+    </w:lvl>
+    <w:lvl xmlns:w="http://schemas.openxmlformats.org/wordprocessingml/2006/main" w:ilvl="2">
+      <w:start w:val="1"/>
+      <w:numFmt w:val="bullet"/>
+      <w:lvlText w:val=""/>
+      <w:lvlJc w:val="left"/>
+      <w:pPr>
+        <w:ind w:left="2160" w:hanging="360"/>
+      </w:pPr>
+      <w:rPr>
+        <w:rFonts w:hint="default" w:ascii="Wingdings" w:hAnsi="Wingdings"/>
+      </w:rPr>
+    </w:lvl>
+    <w:lvl xmlns:w="http://schemas.openxmlformats.org/wordprocessingml/2006/main" w:ilvl="3">
+      <w:start w:val="1"/>
+      <w:numFmt w:val="bullet"/>
+      <w:lvlText w:val=""/>
+      <w:lvlJc w:val="left"/>
+      <w:pPr>
+        <w:ind w:left="2880" w:hanging="360"/>
+      </w:pPr>
+      <w:rPr>
+        <w:rFonts w:hint="default" w:ascii="Symbol" w:hAnsi="Symbol"/>
+      </w:rPr>
+    </w:lvl>
+    <w:lvl xmlns:w="http://schemas.openxmlformats.org/wordprocessingml/2006/main" w:ilvl="4">
+      <w:start w:val="1"/>
+      <w:numFmt w:val="bullet"/>
+      <w:lvlText w:val="o"/>
+      <w:lvlJc w:val="left"/>
+      <w:pPr>
+        <w:ind w:left="3600" w:hanging="360"/>
+      </w:pPr>
+      <w:rPr>
+        <w:rFonts w:hint="default" w:ascii="Courier New" w:hAnsi="Courier New"/>
+      </w:rPr>
+    </w:lvl>
+    <w:lvl xmlns:w="http://schemas.openxmlformats.org/wordprocessingml/2006/main" w:ilvl="5">
+      <w:start w:val="1"/>
+      <w:numFmt w:val="bullet"/>
+      <w:lvlText w:val=""/>
+      <w:lvlJc w:val="left"/>
+      <w:pPr>
+        <w:ind w:left="4320" w:hanging="360"/>
+      </w:pPr>
+      <w:rPr>
+        <w:rFonts w:hint="default" w:ascii="Wingdings" w:hAnsi="Wingdings"/>
+      </w:rPr>
+    </w:lvl>
+    <w:lvl xmlns:w="http://schemas.openxmlformats.org/wordprocessingml/2006/main" w:ilvl="6">
+      <w:start w:val="1"/>
+      <w:numFmt w:val="bullet"/>
+      <w:lvlText w:val=""/>
+      <w:lvlJc w:val="left"/>
+      <w:pPr>
+        <w:ind w:left="5040" w:hanging="360"/>
+      </w:pPr>
+      <w:rPr>
+        <w:rFonts w:hint="default" w:ascii="Symbol" w:hAnsi="Symbol"/>
+      </w:rPr>
+    </w:lvl>
+    <w:lvl xmlns:w="http://schemas.openxmlformats.org/wordprocessingml/2006/main" w:ilvl="7">
+      <w:start w:val="1"/>
+      <w:numFmt w:val="bullet"/>
+      <w:lvlText w:val="o"/>
+      <w:lvlJc w:val="left"/>
+      <w:pPr>
+        <w:ind w:left="5760" w:hanging="360"/>
+      </w:pPr>
+      <w:rPr>
+        <w:rFonts w:hint="default" w:ascii="Courier New" w:hAnsi="Courier New"/>
+      </w:rPr>
+    </w:lvl>
+    <w:lvl xmlns:w="http://schemas.openxmlformats.org/wordprocessingml/2006/main" w:ilvl="8">
+      <w:start w:val="1"/>
+      <w:numFmt w:val="bullet"/>
+      <w:lvlText w:val=""/>
+      <w:lvlJc w:val="left"/>
+      <w:pPr>
+        <w:ind w:left="6480" w:hanging="360"/>
+      </w:pPr>
+      <w:rPr>
+        <w:rFonts w:hint="default" w:ascii="Wingdings" w:hAnsi="Wingdings"/>
+      </w:rPr>
+    </w:lvl>
+  </w:abstractNum>
+  <w:abstractNum xmlns:w="http://schemas.openxmlformats.org/wordprocessingml/2006/main" w:abstractNumId="16">
+    <w:nsid w:val="5a943aa5"/>
+    <w:multiLevelType xmlns:w="http://schemas.openxmlformats.org/wordprocessingml/2006/main" w:val="hybridMultilevel"/>
+    <w:lvl xmlns:w="http://schemas.openxmlformats.org/wordprocessingml/2006/main" w:ilvl="0">
+      <w:start w:val="1"/>
+      <w:numFmt w:val="bullet"/>
+      <w:lvlText w:val=""/>
+      <w:lvlJc w:val="left"/>
+      <w:pPr>
+        <w:ind w:left="720" w:hanging="360"/>
+      </w:pPr>
+      <w:rPr>
+        <w:rFonts w:hint="default" w:ascii="Symbol" w:hAnsi="Symbol"/>
+      </w:rPr>
+    </w:lvl>
+    <w:lvl xmlns:w="http://schemas.openxmlformats.org/wordprocessingml/2006/main" w:ilvl="1">
+      <w:start w:val="1"/>
+      <w:numFmt w:val="bullet"/>
+      <w:lvlText w:val="o"/>
+      <w:lvlJc w:val="left"/>
+      <w:pPr>
+        <w:ind w:left="1440" w:hanging="360"/>
+      </w:pPr>
+      <w:rPr>
+        <w:rFonts w:hint="default" w:ascii="Courier New" w:hAnsi="Courier New"/>
+      </w:rPr>
+    </w:lvl>
+    <w:lvl xmlns:w="http://schemas.openxmlformats.org/wordprocessingml/2006/main" w:ilvl="2">
+      <w:start w:val="1"/>
+      <w:numFmt w:val="bullet"/>
+      <w:lvlText w:val=""/>
+      <w:lvlJc w:val="left"/>
+      <w:pPr>
+        <w:ind w:left="2160" w:hanging="360"/>
+      </w:pPr>
+      <w:rPr>
+        <w:rFonts w:hint="default" w:ascii="Wingdings" w:hAnsi="Wingdings"/>
+      </w:rPr>
+    </w:lvl>
+    <w:lvl xmlns:w="http://schemas.openxmlformats.org/wordprocessingml/2006/main" w:ilvl="3">
+      <w:start w:val="1"/>
+      <w:numFmt w:val="bullet"/>
+      <w:lvlText w:val=""/>
+      <w:lvlJc w:val="left"/>
+      <w:pPr>
+        <w:ind w:left="2880" w:hanging="360"/>
+      </w:pPr>
+      <w:rPr>
+        <w:rFonts w:hint="default" w:ascii="Symbol" w:hAnsi="Symbol"/>
+      </w:rPr>
+    </w:lvl>
+    <w:lvl xmlns:w="http://schemas.openxmlformats.org/wordprocessingml/2006/main" w:ilvl="4">
+      <w:start w:val="1"/>
+      <w:numFmt w:val="bullet"/>
+      <w:lvlText w:val="o"/>
+      <w:lvlJc w:val="left"/>
+      <w:pPr>
+        <w:ind w:left="3600" w:hanging="360"/>
+      </w:pPr>
+      <w:rPr>
+        <w:rFonts w:hint="default" w:ascii="Courier New" w:hAnsi="Courier New"/>
+      </w:rPr>
+    </w:lvl>
+    <w:lvl xmlns:w="http://schemas.openxmlformats.org/wordprocessingml/2006/main" w:ilvl="5">
+      <w:start w:val="1"/>
+      <w:numFmt w:val="bullet"/>
+      <w:lvlText w:val=""/>
+      <w:lvlJc w:val="left"/>
+      <w:pPr>
+        <w:ind w:left="4320" w:hanging="360"/>
+      </w:pPr>
+      <w:rPr>
+        <w:rFonts w:hint="default" w:ascii="Wingdings" w:hAnsi="Wingdings"/>
+      </w:rPr>
+    </w:lvl>
+    <w:lvl xmlns:w="http://schemas.openxmlformats.org/wordprocessingml/2006/main" w:ilvl="6">
+      <w:start w:val="1"/>
+      <w:numFmt w:val="bullet"/>
+      <w:lvlText w:val=""/>
+      <w:lvlJc w:val="left"/>
+      <w:pPr>
+        <w:ind w:left="5040" w:hanging="360"/>
+      </w:pPr>
+      <w:rPr>
+        <w:rFonts w:hint="default" w:ascii="Symbol" w:hAnsi="Symbol"/>
+      </w:rPr>
+    </w:lvl>
+    <w:lvl xmlns:w="http://schemas.openxmlformats.org/wordprocessingml/2006/main" w:ilvl="7">
+      <w:start w:val="1"/>
+      <w:numFmt w:val="bullet"/>
+      <w:lvlText w:val="o"/>
+      <w:lvlJc w:val="left"/>
+      <w:pPr>
+        <w:ind w:left="5760" w:hanging="360"/>
+      </w:pPr>
+      <w:rPr>
+        <w:rFonts w:hint="default" w:ascii="Courier New" w:hAnsi="Courier New"/>
+      </w:rPr>
+    </w:lvl>
+    <w:lvl xmlns:w="http://schemas.openxmlformats.org/wordprocessingml/2006/main" w:ilvl="8">
+      <w:start w:val="1"/>
+      <w:numFmt w:val="bullet"/>
+      <w:lvlText w:val=""/>
+      <w:lvlJc w:val="left"/>
+      <w:pPr>
+        <w:ind w:left="6480" w:hanging="360"/>
+      </w:pPr>
+      <w:rPr>
+        <w:rFonts w:hint="default" w:ascii="Wingdings" w:hAnsi="Wingdings"/>
+      </w:rPr>
+    </w:lvl>
+  </w:abstractNum>
+  <w:abstractNum xmlns:w="http://schemas.openxmlformats.org/wordprocessingml/2006/main" w:abstractNumId="15">
+    <w:nsid w:val="12ab888a"/>
+    <w:multiLevelType xmlns:w="http://schemas.openxmlformats.org/wordprocessingml/2006/main" w:val="hybridMultilevel"/>
+    <w:lvl xmlns:w="http://schemas.openxmlformats.org/wordprocessingml/2006/main" w:ilvl="0">
+      <w:start w:val="1"/>
+      <w:numFmt w:val="bullet"/>
+      <w:lvlText w:val=""/>
+      <w:lvlJc w:val="left"/>
+      <w:pPr>
+        <w:ind w:left="720" w:hanging="360"/>
+      </w:pPr>
+      <w:rPr>
+        <w:rFonts w:hint="default" w:ascii="Symbol" w:hAnsi="Symbol"/>
+      </w:rPr>
+    </w:lvl>
+    <w:lvl xmlns:w="http://schemas.openxmlformats.org/wordprocessingml/2006/main" w:ilvl="1">
+      <w:start w:val="1"/>
+      <w:numFmt w:val="bullet"/>
+      <w:lvlText w:val="o"/>
+      <w:lvlJc w:val="left"/>
+      <w:pPr>
+        <w:ind w:left="1440" w:hanging="360"/>
+      </w:pPr>
+      <w:rPr>
+        <w:rFonts w:hint="default" w:ascii="Courier New" w:hAnsi="Courier New"/>
+      </w:rPr>
+    </w:lvl>
+    <w:lvl xmlns:w="http://schemas.openxmlformats.org/wordprocessingml/2006/main" w:ilvl="2">
+      <w:start w:val="1"/>
+      <w:numFmt w:val="bullet"/>
+      <w:lvlText w:val=""/>
+      <w:lvlJc w:val="left"/>
+      <w:pPr>
+        <w:ind w:left="2160" w:hanging="360"/>
+      </w:pPr>
+      <w:rPr>
+        <w:rFonts w:hint="default" w:ascii="Wingdings" w:hAnsi="Wingdings"/>
+      </w:rPr>
+    </w:lvl>
+    <w:lvl xmlns:w="http://schemas.openxmlformats.org/wordprocessingml/2006/main" w:ilvl="3">
+      <w:start w:val="1"/>
+      <w:numFmt w:val="bullet"/>
+      <w:lvlText w:val=""/>
+      <w:lvlJc w:val="left"/>
+      <w:pPr>
+        <w:ind w:left="2880" w:hanging="360"/>
+      </w:pPr>
+      <w:rPr>
+        <w:rFonts w:hint="default" w:ascii="Symbol" w:hAnsi="Symbol"/>
+      </w:rPr>
+    </w:lvl>
+    <w:lvl xmlns:w="http://schemas.openxmlformats.org/wordprocessingml/2006/main" w:ilvl="4">
+      <w:start w:val="1"/>
+      <w:numFmt w:val="bullet"/>
+      <w:lvlText w:val="o"/>
+      <w:lvlJc w:val="left"/>
+      <w:pPr>
+        <w:ind w:left="3600" w:hanging="360"/>
+      </w:pPr>
+      <w:rPr>
+        <w:rFonts w:hint="default" w:ascii="Courier New" w:hAnsi="Courier New"/>
+      </w:rPr>
+    </w:lvl>
+    <w:lvl xmlns:w="http://schemas.openxmlformats.org/wordprocessingml/2006/main" w:ilvl="5">
+      <w:start w:val="1"/>
+      <w:numFmt w:val="bullet"/>
+      <w:lvlText w:val=""/>
+      <w:lvlJc w:val="left"/>
+      <w:pPr>
+        <w:ind w:left="4320" w:hanging="360"/>
+      </w:pPr>
+      <w:rPr>
+        <w:rFonts w:hint="default" w:ascii="Wingdings" w:hAnsi="Wingdings"/>
+      </w:rPr>
+    </w:lvl>
+    <w:lvl xmlns:w="http://schemas.openxmlformats.org/wordprocessingml/2006/main" w:ilvl="6">
+      <w:start w:val="1"/>
+      <w:numFmt w:val="bullet"/>
+      <w:lvlText w:val=""/>
+      <w:lvlJc w:val="left"/>
+      <w:pPr>
+        <w:ind w:left="5040" w:hanging="360"/>
+      </w:pPr>
+      <w:rPr>
+        <w:rFonts w:hint="default" w:ascii="Symbol" w:hAnsi="Symbol"/>
+      </w:rPr>
+    </w:lvl>
+    <w:lvl xmlns:w="http://schemas.openxmlformats.org/wordprocessingml/2006/main" w:ilvl="7">
+      <w:start w:val="1"/>
+      <w:numFmt w:val="bullet"/>
+      <w:lvlText w:val="o"/>
+      <w:lvlJc w:val="left"/>
+      <w:pPr>
+        <w:ind w:left="5760" w:hanging="360"/>
+      </w:pPr>
+      <w:rPr>
+        <w:rFonts w:hint="default" w:ascii="Courier New" w:hAnsi="Courier New"/>
+      </w:rPr>
+    </w:lvl>
+    <w:lvl xmlns:w="http://schemas.openxmlformats.org/wordprocessingml/2006/main" w:ilvl="8">
+      <w:start w:val="1"/>
+      <w:numFmt w:val="bullet"/>
+      <w:lvlText w:val=""/>
+      <w:lvlJc w:val="left"/>
+      <w:pPr>
+        <w:ind w:left="6480" w:hanging="360"/>
+      </w:pPr>
+      <w:rPr>
+        <w:rFonts w:hint="default" w:ascii="Wingdings" w:hAnsi="Wingdings"/>
+      </w:rPr>
+    </w:lvl>
+  </w:abstractNum>
+  <w:abstractNum xmlns:w="http://schemas.openxmlformats.org/wordprocessingml/2006/main" w:abstractNumId="14">
+    <w:nsid w:val="7db5b151"/>
+    <w:multiLevelType xmlns:w="http://schemas.openxmlformats.org/wordprocessingml/2006/main" w:val="hybridMultilevel"/>
+    <w:lvl xmlns:w="http://schemas.openxmlformats.org/wordprocessingml/2006/main" w:ilvl="0">
+      <w:start w:val="1"/>
+      <w:numFmt w:val="bullet"/>
+      <w:lvlText w:val=""/>
+      <w:lvlJc w:val="left"/>
+      <w:pPr>
+        <w:ind w:left="720" w:hanging="360"/>
+      </w:pPr>
+      <w:rPr>
+        <w:rFonts w:hint="default" w:ascii="Symbol" w:hAnsi="Symbol"/>
+      </w:rPr>
+    </w:lvl>
+    <w:lvl xmlns:w="http://schemas.openxmlformats.org/wordprocessingml/2006/main" w:ilvl="1">
+      <w:start w:val="1"/>
+      <w:numFmt w:val="bullet"/>
+      <w:lvlText w:val="o"/>
+      <w:lvlJc w:val="left"/>
+      <w:pPr>
+        <w:ind w:left="1440" w:hanging="360"/>
+      </w:pPr>
+      <w:rPr>
+        <w:rFonts w:hint="default" w:ascii="Courier New" w:hAnsi="Courier New"/>
+      </w:rPr>
+    </w:lvl>
+    <w:lvl xmlns:w="http://schemas.openxmlformats.org/wordprocessingml/2006/main" w:ilvl="2">
+      <w:start w:val="1"/>
+      <w:numFmt w:val="bullet"/>
+      <w:lvlText w:val=""/>
+      <w:lvlJc w:val="left"/>
+      <w:pPr>
+        <w:ind w:left="2160" w:hanging="360"/>
+      </w:pPr>
+      <w:rPr>
+        <w:rFonts w:hint="default" w:ascii="Wingdings" w:hAnsi="Wingdings"/>
+      </w:rPr>
+    </w:lvl>
+    <w:lvl xmlns:w="http://schemas.openxmlformats.org/wordprocessingml/2006/main" w:ilvl="3">
+      <w:start w:val="1"/>
+      <w:numFmt w:val="bullet"/>
+      <w:lvlText w:val=""/>
+      <w:lvlJc w:val="left"/>
+      <w:pPr>
+        <w:ind w:left="2880" w:hanging="360"/>
+      </w:pPr>
+      <w:rPr>
+        <w:rFonts w:hint="default" w:ascii="Symbol" w:hAnsi="Symbol"/>
+      </w:rPr>
+    </w:lvl>
+    <w:lvl xmlns:w="http://schemas.openxmlformats.org/wordprocessingml/2006/main" w:ilvl="4">
+      <w:start w:val="1"/>
+      <w:numFmt w:val="bullet"/>
+      <w:lvlText w:val="o"/>
+      <w:lvlJc w:val="left"/>
+      <w:pPr>
+        <w:ind w:left="3600" w:hanging="360"/>
+      </w:pPr>
+      <w:rPr>
+        <w:rFonts w:hint="default" w:ascii="Courier New" w:hAnsi="Courier New"/>
+      </w:rPr>
+    </w:lvl>
+    <w:lvl xmlns:w="http://schemas.openxmlformats.org/wordprocessingml/2006/main" w:ilvl="5">
+      <w:start w:val="1"/>
+      <w:numFmt w:val="bullet"/>
+      <w:lvlText w:val=""/>
+      <w:lvlJc w:val="left"/>
+      <w:pPr>
+        <w:ind w:left="4320" w:hanging="360"/>
+      </w:pPr>
+      <w:rPr>
+        <w:rFonts w:hint="default" w:ascii="Wingdings" w:hAnsi="Wingdings"/>
+      </w:rPr>
+    </w:lvl>
+    <w:lvl xmlns:w="http://schemas.openxmlformats.org/wordprocessingml/2006/main" w:ilvl="6">
+      <w:start w:val="1"/>
+      <w:numFmt w:val="bullet"/>
+      <w:lvlText w:val=""/>
+      <w:lvlJc w:val="left"/>
+      <w:pPr>
+        <w:ind w:left="5040" w:hanging="360"/>
+      </w:pPr>
+      <w:rPr>
+        <w:rFonts w:hint="default" w:ascii="Symbol" w:hAnsi="Symbol"/>
+      </w:rPr>
+    </w:lvl>
+    <w:lvl xmlns:w="http://schemas.openxmlformats.org/wordprocessingml/2006/main" w:ilvl="7">
+      <w:start w:val="1"/>
+      <w:numFmt w:val="bullet"/>
+      <w:lvlText w:val="o"/>
+      <w:lvlJc w:val="left"/>
+      <w:pPr>
+        <w:ind w:left="5760" w:hanging="360"/>
+      </w:pPr>
+      <w:rPr>
+        <w:rFonts w:hint="default" w:ascii="Courier New" w:hAnsi="Courier New"/>
+      </w:rPr>
+    </w:lvl>
+    <w:lvl xmlns:w="http://schemas.openxmlformats.org/wordprocessingml/2006/main" w:ilvl="8">
+      <w:start w:val="1"/>
+      <w:numFmt w:val="bullet"/>
+      <w:lvlText w:val=""/>
+      <w:lvlJc w:val="left"/>
+      <w:pPr>
+        <w:ind w:left="6480" w:hanging="360"/>
+      </w:pPr>
+      <w:rPr>
+        <w:rFonts w:hint="default" w:ascii="Wingdings" w:hAnsi="Wingdings"/>
+      </w:rPr>
+    </w:lvl>
+  </w:abstractNum>
   <w:abstractNum w:abstractNumId="1">
     <w:lvl w:ilvl="0">
       <w:start w:val="1"/>
@@ -1063,7 +2534,7 @@
         <w:ind w:start="720" w:hanging="360"/>
       </w:pPr>
       <w:rPr>
-        <w:rFonts w:ascii="Symbol" w:hAnsi="Symbol" w:cs="Symbol" w:hint="default"/>
+        <w:rFonts w:hint="default" w:ascii="Symbol" w:hAnsi="Symbol" w:cs="Symbol"/>
         <w:sz w:val="20"/>
       </w:rPr>
     </w:lvl>
@@ -1079,7 +2550,7 @@
         <w:ind w:start="1440" w:hanging="360"/>
       </w:pPr>
       <w:rPr>
-        <w:rFonts w:ascii="Courier New" w:hAnsi="Courier New" w:cs="Courier New" w:hint="default"/>
+        <w:rFonts w:hint="default" w:ascii="Courier New" w:hAnsi="Courier New" w:cs="Courier New"/>
         <w:sz w:val="20"/>
       </w:rPr>
     </w:lvl>
@@ -1095,7 +2566,7 @@
         <w:ind w:start="2160" w:hanging="360"/>
       </w:pPr>
       <w:rPr>
-        <w:rFonts w:ascii="Wingdings" w:hAnsi="Wingdings" w:cs="Wingdings" w:hint="default"/>
+        <w:rFonts w:hint="default" w:ascii="Wingdings" w:hAnsi="Wingdings" w:cs="Wingdings"/>
         <w:sz w:val="20"/>
       </w:rPr>
     </w:lvl>
@@ -1111,7 +2582,7 @@
         <w:ind w:start="2880" w:hanging="360"/>
       </w:pPr>
       <w:rPr>
-        <w:rFonts w:ascii="Wingdings" w:hAnsi="Wingdings" w:cs="Wingdings" w:hint="default"/>
+        <w:rFonts w:hint="default" w:ascii="Wingdings" w:hAnsi="Wingdings" w:cs="Wingdings"/>
         <w:sz w:val="20"/>
       </w:rPr>
     </w:lvl>
@@ -1127,7 +2598,7 @@
         <w:ind w:start="3600" w:hanging="360"/>
       </w:pPr>
       <w:rPr>
-        <w:rFonts w:ascii="Wingdings" w:hAnsi="Wingdings" w:cs="Wingdings" w:hint="default"/>
+        <w:rFonts w:hint="default" w:ascii="Wingdings" w:hAnsi="Wingdings" w:cs="Wingdings"/>
         <w:sz w:val="20"/>
       </w:rPr>
     </w:lvl>
@@ -1143,7 +2614,7 @@
         <w:ind w:start="4320" w:hanging="360"/>
       </w:pPr>
       <w:rPr>
-        <w:rFonts w:ascii="Wingdings" w:hAnsi="Wingdings" w:cs="Wingdings" w:hint="default"/>
+        <w:rFonts w:hint="default" w:ascii="Wingdings" w:hAnsi="Wingdings" w:cs="Wingdings"/>
         <w:sz w:val="20"/>
       </w:rPr>
     </w:lvl>
@@ -1159,7 +2630,7 @@
         <w:ind w:start="5040" w:hanging="360"/>
       </w:pPr>
       <w:rPr>
-        <w:rFonts w:ascii="Wingdings" w:hAnsi="Wingdings" w:cs="Wingdings" w:hint="default"/>
+        <w:rFonts w:hint="default" w:ascii="Wingdings" w:hAnsi="Wingdings" w:cs="Wingdings"/>
         <w:sz w:val="20"/>
       </w:rPr>
     </w:lvl>
@@ -1175,7 +2646,7 @@
         <w:ind w:start="5760" w:hanging="360"/>
       </w:pPr>
       <w:rPr>
-        <w:rFonts w:ascii="Wingdings" w:hAnsi="Wingdings" w:cs="Wingdings" w:hint="default"/>
+        <w:rFonts w:hint="default" w:ascii="Wingdings" w:hAnsi="Wingdings" w:cs="Wingdings"/>
         <w:sz w:val="20"/>
       </w:rPr>
     </w:lvl>
@@ -1191,10 +2662,11 @@
         <w:ind w:start="6480" w:hanging="360"/>
       </w:pPr>
       <w:rPr>
-        <w:rFonts w:ascii="Wingdings" w:hAnsi="Wingdings" w:cs="Wingdings" w:hint="default"/>
+        <w:rFonts w:hint="default" w:ascii="Wingdings" w:hAnsi="Wingdings" w:cs="Wingdings"/>
         <w:sz w:val="20"/>
       </w:rPr>
     </w:lvl>
+    <w:nsid w:val="653eaa67"/>
   </w:abstractNum>
   <w:abstractNum w:abstractNumId="2">
     <w:lvl w:ilvl="0">
@@ -1209,7 +2681,7 @@
         <w:ind w:start="720" w:hanging="360"/>
       </w:pPr>
       <w:rPr>
-        <w:rFonts w:ascii="Symbol" w:hAnsi="Symbol" w:cs="Symbol" w:hint="default"/>
+        <w:rFonts w:hint="default" w:ascii="Symbol" w:hAnsi="Symbol" w:cs="Symbol"/>
         <w:sz w:val="20"/>
       </w:rPr>
     </w:lvl>
@@ -1225,7 +2697,7 @@
         <w:ind w:start="1440" w:hanging="360"/>
       </w:pPr>
       <w:rPr>
-        <w:rFonts w:ascii="Courier New" w:hAnsi="Courier New" w:cs="Courier New" w:hint="default"/>
+        <w:rFonts w:hint="default" w:ascii="Courier New" w:hAnsi="Courier New" w:cs="Courier New"/>
         <w:sz w:val="20"/>
       </w:rPr>
     </w:lvl>
@@ -1241,7 +2713,7 @@
         <w:ind w:start="2160" w:hanging="360"/>
       </w:pPr>
       <w:rPr>
-        <w:rFonts w:ascii="Wingdings" w:hAnsi="Wingdings" w:cs="Wingdings" w:hint="default"/>
+        <w:rFonts w:hint="default" w:ascii="Wingdings" w:hAnsi="Wingdings" w:cs="Wingdings"/>
         <w:sz w:val="20"/>
       </w:rPr>
     </w:lvl>
@@ -1257,7 +2729,7 @@
         <w:ind w:start="2880" w:hanging="360"/>
       </w:pPr>
       <w:rPr>
-        <w:rFonts w:ascii="Wingdings" w:hAnsi="Wingdings" w:cs="Wingdings" w:hint="default"/>
+        <w:rFonts w:hint="default" w:ascii="Wingdings" w:hAnsi="Wingdings" w:cs="Wingdings"/>
         <w:sz w:val="20"/>
       </w:rPr>
     </w:lvl>
@@ -1273,7 +2745,7 @@
         <w:ind w:start="3600" w:hanging="360"/>
       </w:pPr>
       <w:rPr>
-        <w:rFonts w:ascii="Wingdings" w:hAnsi="Wingdings" w:cs="Wingdings" w:hint="default"/>
+        <w:rFonts w:hint="default" w:ascii="Wingdings" w:hAnsi="Wingdings" w:cs="Wingdings"/>
         <w:sz w:val="20"/>
       </w:rPr>
     </w:lvl>
@@ -1289,7 +2761,7 @@
         <w:ind w:start="4320" w:hanging="360"/>
       </w:pPr>
       <w:rPr>
-        <w:rFonts w:ascii="Wingdings" w:hAnsi="Wingdings" w:cs="Wingdings" w:hint="default"/>
+        <w:rFonts w:hint="default" w:ascii="Wingdings" w:hAnsi="Wingdings" w:cs="Wingdings"/>
         <w:sz w:val="20"/>
       </w:rPr>
     </w:lvl>
@@ -1305,7 +2777,7 @@
         <w:ind w:start="5040" w:hanging="360"/>
       </w:pPr>
       <w:rPr>
-        <w:rFonts w:ascii="Wingdings" w:hAnsi="Wingdings" w:cs="Wingdings" w:hint="default"/>
+        <w:rFonts w:hint="default" w:ascii="Wingdings" w:hAnsi="Wingdings" w:cs="Wingdings"/>
         <w:sz w:val="20"/>
       </w:rPr>
     </w:lvl>
@@ -1321,7 +2793,7 @@
         <w:ind w:start="5760" w:hanging="360"/>
       </w:pPr>
       <w:rPr>
-        <w:rFonts w:ascii="Wingdings" w:hAnsi="Wingdings" w:cs="Wingdings" w:hint="default"/>
+        <w:rFonts w:hint="default" w:ascii="Wingdings" w:hAnsi="Wingdings" w:cs="Wingdings"/>
         <w:sz w:val="20"/>
       </w:rPr>
     </w:lvl>
@@ -1337,10 +2809,11 @@
         <w:ind w:start="6480" w:hanging="360"/>
       </w:pPr>
       <w:rPr>
-        <w:rFonts w:ascii="Wingdings" w:hAnsi="Wingdings" w:cs="Wingdings" w:hint="default"/>
+        <w:rFonts w:hint="default" w:ascii="Wingdings" w:hAnsi="Wingdings" w:cs="Wingdings"/>
         <w:sz w:val="20"/>
       </w:rPr>
     </w:lvl>
+    <w:nsid w:val="2b3f7b4"/>
   </w:abstractNum>
   <w:abstractNum w:abstractNumId="3">
     <w:lvl w:ilvl="0">
@@ -1355,7 +2828,7 @@
         <w:ind w:start="720" w:hanging="360"/>
       </w:pPr>
       <w:rPr>
-        <w:rFonts w:ascii="Symbol" w:hAnsi="Symbol" w:cs="Symbol" w:hint="default"/>
+        <w:rFonts w:hint="default" w:ascii="Symbol" w:hAnsi="Symbol" w:cs="Symbol"/>
         <w:sz w:val="20"/>
       </w:rPr>
     </w:lvl>
@@ -1371,7 +2844,7 @@
         <w:ind w:start="1440" w:hanging="360"/>
       </w:pPr>
       <w:rPr>
-        <w:rFonts w:ascii="Courier New" w:hAnsi="Courier New" w:cs="Courier New" w:hint="default"/>
+        <w:rFonts w:hint="default" w:ascii="Courier New" w:hAnsi="Courier New" w:cs="Courier New"/>
         <w:sz w:val="20"/>
       </w:rPr>
     </w:lvl>
@@ -1387,7 +2860,7 @@
         <w:ind w:start="2160" w:hanging="360"/>
       </w:pPr>
       <w:rPr>
-        <w:rFonts w:ascii="Wingdings" w:hAnsi="Wingdings" w:cs="Wingdings" w:hint="default"/>
+        <w:rFonts w:hint="default" w:ascii="Wingdings" w:hAnsi="Wingdings" w:cs="Wingdings"/>
         <w:sz w:val="20"/>
       </w:rPr>
     </w:lvl>
@@ -1403,7 +2876,7 @@
         <w:ind w:start="2880" w:hanging="360"/>
       </w:pPr>
       <w:rPr>
-        <w:rFonts w:ascii="Wingdings" w:hAnsi="Wingdings" w:cs="Wingdings" w:hint="default"/>
+        <w:rFonts w:hint="default" w:ascii="Wingdings" w:hAnsi="Wingdings" w:cs="Wingdings"/>
         <w:sz w:val="20"/>
       </w:rPr>
     </w:lvl>
@@ -1419,7 +2892,7 @@
         <w:ind w:start="3600" w:hanging="360"/>
       </w:pPr>
       <w:rPr>
-        <w:rFonts w:ascii="Wingdings" w:hAnsi="Wingdings" w:cs="Wingdings" w:hint="default"/>
+        <w:rFonts w:hint="default" w:ascii="Wingdings" w:hAnsi="Wingdings" w:cs="Wingdings"/>
         <w:sz w:val="20"/>
       </w:rPr>
     </w:lvl>
@@ -1435,7 +2908,7 @@
         <w:ind w:start="4320" w:hanging="360"/>
       </w:pPr>
       <w:rPr>
-        <w:rFonts w:ascii="Wingdings" w:hAnsi="Wingdings" w:cs="Wingdings" w:hint="default"/>
+        <w:rFonts w:hint="default" w:ascii="Wingdings" w:hAnsi="Wingdings" w:cs="Wingdings"/>
         <w:sz w:val="20"/>
       </w:rPr>
     </w:lvl>
@@ -1451,7 +2924,7 @@
         <w:ind w:start="5040" w:hanging="360"/>
       </w:pPr>
       <w:rPr>
-        <w:rFonts w:ascii="Wingdings" w:hAnsi="Wingdings" w:cs="Wingdings" w:hint="default"/>
+        <w:rFonts w:hint="default" w:ascii="Wingdings" w:hAnsi="Wingdings" w:cs="Wingdings"/>
         <w:sz w:val="20"/>
       </w:rPr>
     </w:lvl>
@@ -1467,7 +2940,7 @@
         <w:ind w:start="5760" w:hanging="360"/>
       </w:pPr>
       <w:rPr>
-        <w:rFonts w:ascii="Wingdings" w:hAnsi="Wingdings" w:cs="Wingdings" w:hint="default"/>
+        <w:rFonts w:hint="default" w:ascii="Wingdings" w:hAnsi="Wingdings" w:cs="Wingdings"/>
         <w:sz w:val="20"/>
       </w:rPr>
     </w:lvl>
@@ -1483,10 +2956,11 @@
         <w:ind w:start="6480" w:hanging="360"/>
       </w:pPr>
       <w:rPr>
-        <w:rFonts w:ascii="Wingdings" w:hAnsi="Wingdings" w:cs="Wingdings" w:hint="default"/>
+        <w:rFonts w:hint="default" w:ascii="Wingdings" w:hAnsi="Wingdings" w:cs="Wingdings"/>
         <w:sz w:val="20"/>
       </w:rPr>
     </w:lvl>
+    <w:nsid w:val="37b98785"/>
   </w:abstractNum>
   <w:abstractNum w:abstractNumId="4">
     <w:lvl w:ilvl="0">
@@ -1501,7 +2975,7 @@
         <w:ind w:start="720" w:hanging="360"/>
       </w:pPr>
       <w:rPr>
-        <w:rFonts w:ascii="Symbol" w:hAnsi="Symbol" w:cs="Symbol" w:hint="default"/>
+        <w:rFonts w:hint="default" w:ascii="Symbol" w:hAnsi="Symbol" w:cs="Symbol"/>
         <w:sz w:val="20"/>
       </w:rPr>
     </w:lvl>
@@ -1517,7 +2991,7 @@
         <w:ind w:start="1440" w:hanging="360"/>
       </w:pPr>
       <w:rPr>
-        <w:rFonts w:ascii="Courier New" w:hAnsi="Courier New" w:cs="Courier New" w:hint="default"/>
+        <w:rFonts w:hint="default" w:ascii="Courier New" w:hAnsi="Courier New" w:cs="Courier New"/>
         <w:sz w:val="20"/>
       </w:rPr>
     </w:lvl>
@@ -1533,7 +3007,7 @@
         <w:ind w:start="2160" w:hanging="360"/>
       </w:pPr>
       <w:rPr>
-        <w:rFonts w:ascii="Wingdings" w:hAnsi="Wingdings" w:cs="Wingdings" w:hint="default"/>
+        <w:rFonts w:hint="default" w:ascii="Wingdings" w:hAnsi="Wingdings" w:cs="Wingdings"/>
         <w:sz w:val="20"/>
       </w:rPr>
     </w:lvl>
@@ -1549,7 +3023,7 @@
         <w:ind w:start="2880" w:hanging="360"/>
       </w:pPr>
       <w:rPr>
-        <w:rFonts w:ascii="Wingdings" w:hAnsi="Wingdings" w:cs="Wingdings" w:hint="default"/>
+        <w:rFonts w:hint="default" w:ascii="Wingdings" w:hAnsi="Wingdings" w:cs="Wingdings"/>
         <w:sz w:val="20"/>
       </w:rPr>
     </w:lvl>
@@ -1565,7 +3039,7 @@
         <w:ind w:start="3600" w:hanging="360"/>
       </w:pPr>
       <w:rPr>
-        <w:rFonts w:ascii="Wingdings" w:hAnsi="Wingdings" w:cs="Wingdings" w:hint="default"/>
+        <w:rFonts w:hint="default" w:ascii="Wingdings" w:hAnsi="Wingdings" w:cs="Wingdings"/>
         <w:sz w:val="20"/>
       </w:rPr>
     </w:lvl>
@@ -1581,7 +3055,7 @@
         <w:ind w:start="4320" w:hanging="360"/>
       </w:pPr>
       <w:rPr>
-        <w:rFonts w:ascii="Wingdings" w:hAnsi="Wingdings" w:cs="Wingdings" w:hint="default"/>
+        <w:rFonts w:hint="default" w:ascii="Wingdings" w:hAnsi="Wingdings" w:cs="Wingdings"/>
         <w:sz w:val="20"/>
       </w:rPr>
     </w:lvl>
@@ -1597,7 +3071,7 @@
         <w:ind w:start="5040" w:hanging="360"/>
       </w:pPr>
       <w:rPr>
-        <w:rFonts w:ascii="Wingdings" w:hAnsi="Wingdings" w:cs="Wingdings" w:hint="default"/>
+        <w:rFonts w:hint="default" w:ascii="Wingdings" w:hAnsi="Wingdings" w:cs="Wingdings"/>
         <w:sz w:val="20"/>
       </w:rPr>
     </w:lvl>
@@ -1613,7 +3087,7 @@
         <w:ind w:start="5760" w:hanging="360"/>
       </w:pPr>
       <w:rPr>
-        <w:rFonts w:ascii="Wingdings" w:hAnsi="Wingdings" w:cs="Wingdings" w:hint="default"/>
+        <w:rFonts w:hint="default" w:ascii="Wingdings" w:hAnsi="Wingdings" w:cs="Wingdings"/>
         <w:sz w:val="20"/>
       </w:rPr>
     </w:lvl>
@@ -1629,10 +3103,11 @@
         <w:ind w:start="6480" w:hanging="360"/>
       </w:pPr>
       <w:rPr>
-        <w:rFonts w:ascii="Wingdings" w:hAnsi="Wingdings" w:cs="Wingdings" w:hint="default"/>
+        <w:rFonts w:hint="default" w:ascii="Wingdings" w:hAnsi="Wingdings" w:cs="Wingdings"/>
         <w:sz w:val="20"/>
       </w:rPr>
     </w:lvl>
+    <w:nsid w:val="12f77b10"/>
   </w:abstractNum>
   <w:abstractNum w:abstractNumId="5">
     <w:lvl w:ilvl="0">
@@ -1647,7 +3122,7 @@
         <w:ind w:start="720" w:hanging="360"/>
       </w:pPr>
       <w:rPr>
-        <w:rFonts w:ascii="Symbol" w:hAnsi="Symbol" w:cs="Symbol" w:hint="default"/>
+        <w:rFonts w:hint="default" w:ascii="Symbol" w:hAnsi="Symbol" w:cs="Symbol"/>
         <w:sz w:val="20"/>
       </w:rPr>
     </w:lvl>
@@ -1663,7 +3138,7 @@
         <w:ind w:start="1440" w:hanging="360"/>
       </w:pPr>
       <w:rPr>
-        <w:rFonts w:ascii="Courier New" w:hAnsi="Courier New" w:cs="Courier New" w:hint="default"/>
+        <w:rFonts w:hint="default" w:ascii="Courier New" w:hAnsi="Courier New" w:cs="Courier New"/>
         <w:sz w:val="20"/>
       </w:rPr>
     </w:lvl>
@@ -1679,7 +3154,7 @@
         <w:ind w:start="2160" w:hanging="360"/>
       </w:pPr>
       <w:rPr>
-        <w:rFonts w:ascii="Wingdings" w:hAnsi="Wingdings" w:cs="Wingdings" w:hint="default"/>
+        <w:rFonts w:hint="default" w:ascii="Wingdings" w:hAnsi="Wingdings" w:cs="Wingdings"/>
         <w:sz w:val="20"/>
       </w:rPr>
     </w:lvl>
@@ -1695,7 +3170,7 @@
         <w:ind w:start="2880" w:hanging="360"/>
       </w:pPr>
       <w:rPr>
-        <w:rFonts w:ascii="Wingdings" w:hAnsi="Wingdings" w:cs="Wingdings" w:hint="default"/>
+        <w:rFonts w:hint="default" w:ascii="Wingdings" w:hAnsi="Wingdings" w:cs="Wingdings"/>
         <w:sz w:val="20"/>
       </w:rPr>
     </w:lvl>
@@ -1711,7 +3186,7 @@
         <w:ind w:start="3600" w:hanging="360"/>
       </w:pPr>
       <w:rPr>
-        <w:rFonts w:ascii="Wingdings" w:hAnsi="Wingdings" w:cs="Wingdings" w:hint="default"/>
+        <w:rFonts w:hint="default" w:ascii="Wingdings" w:hAnsi="Wingdings" w:cs="Wingdings"/>
         <w:sz w:val="20"/>
       </w:rPr>
     </w:lvl>
@@ -1727,7 +3202,7 @@
         <w:ind w:start="4320" w:hanging="360"/>
       </w:pPr>
       <w:rPr>
-        <w:rFonts w:ascii="Wingdings" w:hAnsi="Wingdings" w:cs="Wingdings" w:hint="default"/>
+        <w:rFonts w:hint="default" w:ascii="Wingdings" w:hAnsi="Wingdings" w:cs="Wingdings"/>
         <w:sz w:val="20"/>
       </w:rPr>
     </w:lvl>
@@ -1743,7 +3218,7 @@
         <w:ind w:start="5040" w:hanging="360"/>
       </w:pPr>
       <w:rPr>
-        <w:rFonts w:ascii="Wingdings" w:hAnsi="Wingdings" w:cs="Wingdings" w:hint="default"/>
+        <w:rFonts w:hint="default" w:ascii="Wingdings" w:hAnsi="Wingdings" w:cs="Wingdings"/>
         <w:sz w:val="20"/>
       </w:rPr>
     </w:lvl>
@@ -1759,7 +3234,7 @@
         <w:ind w:start="5760" w:hanging="360"/>
       </w:pPr>
       <w:rPr>
-        <w:rFonts w:ascii="Wingdings" w:hAnsi="Wingdings" w:cs="Wingdings" w:hint="default"/>
+        <w:rFonts w:hint="default" w:ascii="Wingdings" w:hAnsi="Wingdings" w:cs="Wingdings"/>
         <w:sz w:val="20"/>
       </w:rPr>
     </w:lvl>
@@ -1775,10 +3250,11 @@
         <w:ind w:start="6480" w:hanging="360"/>
       </w:pPr>
       <w:rPr>
-        <w:rFonts w:ascii="Wingdings" w:hAnsi="Wingdings" w:cs="Wingdings" w:hint="default"/>
+        <w:rFonts w:hint="default" w:ascii="Wingdings" w:hAnsi="Wingdings" w:cs="Wingdings"/>
         <w:sz w:val="20"/>
       </w:rPr>
     </w:lvl>
+    <w:nsid w:val="74192ad0"/>
   </w:abstractNum>
   <w:abstractNum w:abstractNumId="6">
     <w:lvl w:ilvl="0">
@@ -1793,7 +3269,7 @@
         <w:ind w:start="720" w:hanging="360"/>
       </w:pPr>
       <w:rPr>
-        <w:rFonts w:ascii="Symbol" w:hAnsi="Symbol" w:cs="Symbol" w:hint="default"/>
+        <w:rFonts w:hint="default" w:ascii="Symbol" w:hAnsi="Symbol" w:cs="Symbol"/>
         <w:sz w:val="20"/>
       </w:rPr>
     </w:lvl>
@@ -1809,7 +3285,7 @@
         <w:ind w:start="1440" w:hanging="360"/>
       </w:pPr>
       <w:rPr>
-        <w:rFonts w:ascii="Courier New" w:hAnsi="Courier New" w:cs="Courier New" w:hint="default"/>
+        <w:rFonts w:hint="default" w:ascii="Courier New" w:hAnsi="Courier New" w:cs="Courier New"/>
         <w:sz w:val="20"/>
       </w:rPr>
     </w:lvl>
@@ -1825,7 +3301,7 @@
         <w:ind w:start="2160" w:hanging="360"/>
       </w:pPr>
       <w:rPr>
-        <w:rFonts w:ascii="Wingdings" w:hAnsi="Wingdings" w:cs="Wingdings" w:hint="default"/>
+        <w:rFonts w:hint="default" w:ascii="Wingdings" w:hAnsi="Wingdings" w:cs="Wingdings"/>
         <w:sz w:val="20"/>
       </w:rPr>
     </w:lvl>
@@ -1841,7 +3317,7 @@
         <w:ind w:start="2880" w:hanging="360"/>
       </w:pPr>
       <w:rPr>
-        <w:rFonts w:ascii="Wingdings" w:hAnsi="Wingdings" w:cs="Wingdings" w:hint="default"/>
+        <w:rFonts w:hint="default" w:ascii="Wingdings" w:hAnsi="Wingdings" w:cs="Wingdings"/>
         <w:sz w:val="20"/>
       </w:rPr>
     </w:lvl>
@@ -1857,7 +3333,7 @@
         <w:ind w:start="3600" w:hanging="360"/>
       </w:pPr>
       <w:rPr>
-        <w:rFonts w:ascii="Wingdings" w:hAnsi="Wingdings" w:cs="Wingdings" w:hint="default"/>
+        <w:rFonts w:hint="default" w:ascii="Wingdings" w:hAnsi="Wingdings" w:cs="Wingdings"/>
         <w:sz w:val="20"/>
       </w:rPr>
     </w:lvl>
@@ -1873,7 +3349,7 @@
         <w:ind w:start="4320" w:hanging="360"/>
       </w:pPr>
       <w:rPr>
-        <w:rFonts w:ascii="Wingdings" w:hAnsi="Wingdings" w:cs="Wingdings" w:hint="default"/>
+        <w:rFonts w:hint="default" w:ascii="Wingdings" w:hAnsi="Wingdings" w:cs="Wingdings"/>
         <w:sz w:val="20"/>
       </w:rPr>
     </w:lvl>
@@ -1889,7 +3365,7 @@
         <w:ind w:start="5040" w:hanging="360"/>
       </w:pPr>
       <w:rPr>
-        <w:rFonts w:ascii="Wingdings" w:hAnsi="Wingdings" w:cs="Wingdings" w:hint="default"/>
+        <w:rFonts w:hint="default" w:ascii="Wingdings" w:hAnsi="Wingdings" w:cs="Wingdings"/>
         <w:sz w:val="20"/>
       </w:rPr>
     </w:lvl>
@@ -1905,7 +3381,7 @@
         <w:ind w:start="5760" w:hanging="360"/>
       </w:pPr>
       <w:rPr>
-        <w:rFonts w:ascii="Wingdings" w:hAnsi="Wingdings" w:cs="Wingdings" w:hint="default"/>
+        <w:rFonts w:hint="default" w:ascii="Wingdings" w:hAnsi="Wingdings" w:cs="Wingdings"/>
         <w:sz w:val="20"/>
       </w:rPr>
     </w:lvl>
@@ -1921,10 +3397,11 @@
         <w:ind w:start="6480" w:hanging="360"/>
       </w:pPr>
       <w:rPr>
-        <w:rFonts w:ascii="Wingdings" w:hAnsi="Wingdings" w:cs="Wingdings" w:hint="default"/>
+        <w:rFonts w:hint="default" w:ascii="Wingdings" w:hAnsi="Wingdings" w:cs="Wingdings"/>
         <w:sz w:val="20"/>
       </w:rPr>
     </w:lvl>
+    <w:nsid w:val="57073963"/>
   </w:abstractNum>
   <w:abstractNum w:abstractNumId="7">
     <w:lvl w:ilvl="0">
@@ -1939,7 +3416,7 @@
         <w:ind w:start="709" w:hanging="283"/>
       </w:pPr>
       <w:rPr>
-        <w:rFonts w:ascii="Symbol" w:hAnsi="Symbol" w:cs="Symbol" w:hint="default"/>
+        <w:rFonts w:hint="default" w:ascii="Symbol" w:hAnsi="Symbol" w:cs="Symbol"/>
       </w:rPr>
     </w:lvl>
     <w:lvl w:ilvl="1">
@@ -1954,7 +3431,7 @@
         <w:ind w:start="1418" w:hanging="283"/>
       </w:pPr>
       <w:rPr>
-        <w:rFonts w:ascii="Symbol" w:hAnsi="Symbol" w:cs="Symbol" w:hint="default"/>
+        <w:rFonts w:hint="default" w:ascii="Symbol" w:hAnsi="Symbol" w:cs="Symbol"/>
       </w:rPr>
     </w:lvl>
     <w:lvl w:ilvl="2">
@@ -1969,7 +3446,7 @@
         <w:ind w:start="2127" w:hanging="283"/>
       </w:pPr>
       <w:rPr>
-        <w:rFonts w:ascii="Symbol" w:hAnsi="Symbol" w:cs="Symbol" w:hint="default"/>
+        <w:rFonts w:hint="default" w:ascii="Symbol" w:hAnsi="Symbol" w:cs="Symbol"/>
       </w:rPr>
     </w:lvl>
     <w:lvl w:ilvl="3">
@@ -1984,7 +3461,7 @@
         <w:ind w:start="2836" w:hanging="283"/>
       </w:pPr>
       <w:rPr>
-        <w:rFonts w:ascii="Symbol" w:hAnsi="Symbol" w:cs="Symbol" w:hint="default"/>
+        <w:rFonts w:hint="default" w:ascii="Symbol" w:hAnsi="Symbol" w:cs="Symbol"/>
       </w:rPr>
     </w:lvl>
     <w:lvl w:ilvl="4">
@@ -1999,7 +3476,7 @@
         <w:ind w:start="3545" w:hanging="283"/>
       </w:pPr>
       <w:rPr>
-        <w:rFonts w:ascii="Symbol" w:hAnsi="Symbol" w:cs="Symbol" w:hint="default"/>
+        <w:rFonts w:hint="default" w:ascii="Symbol" w:hAnsi="Symbol" w:cs="Symbol"/>
       </w:rPr>
     </w:lvl>
     <w:lvl w:ilvl="5">
@@ -2014,7 +3491,7 @@
         <w:ind w:start="4254" w:hanging="283"/>
       </w:pPr>
       <w:rPr>
-        <w:rFonts w:ascii="Symbol" w:hAnsi="Symbol" w:cs="Symbol" w:hint="default"/>
+        <w:rFonts w:hint="default" w:ascii="Symbol" w:hAnsi="Symbol" w:cs="Symbol"/>
       </w:rPr>
     </w:lvl>
     <w:lvl w:ilvl="6">
@@ -2029,7 +3506,7 @@
         <w:ind w:start="4963" w:hanging="283"/>
       </w:pPr>
       <w:rPr>
-        <w:rFonts w:ascii="Symbol" w:hAnsi="Symbol" w:cs="Symbol" w:hint="default"/>
+        <w:rFonts w:hint="default" w:ascii="Symbol" w:hAnsi="Symbol" w:cs="Symbol"/>
       </w:rPr>
     </w:lvl>
     <w:lvl w:ilvl="7">
@@ -2044,7 +3521,7 @@
         <w:ind w:start="5672" w:hanging="283"/>
       </w:pPr>
       <w:rPr>
-        <w:rFonts w:ascii="Symbol" w:hAnsi="Symbol" w:cs="Symbol" w:hint="default"/>
+        <w:rFonts w:hint="default" w:ascii="Symbol" w:hAnsi="Symbol" w:cs="Symbol"/>
       </w:rPr>
     </w:lvl>
     <w:lvl w:ilvl="8">
@@ -2059,9 +3536,10 @@
         <w:ind w:start="6381" w:hanging="283"/>
       </w:pPr>
       <w:rPr>
-        <w:rFonts w:ascii="Symbol" w:hAnsi="Symbol" w:cs="Symbol" w:hint="default"/>
-      </w:rPr>
-    </w:lvl>
+        <w:rFonts w:hint="default" w:ascii="Symbol" w:hAnsi="Symbol" w:cs="Symbol"/>
+      </w:rPr>
+    </w:lvl>
+    <w:nsid w:val="472369dd"/>
   </w:abstractNum>
   <w:abstractNum w:abstractNumId="8">
     <w:lvl w:ilvl="0">
@@ -2076,7 +3554,7 @@
         <w:ind w:start="709" w:hanging="283"/>
       </w:pPr>
       <w:rPr>
-        <w:rFonts w:ascii="Symbol" w:hAnsi="Symbol" w:cs="Symbol" w:hint="default"/>
+        <w:rFonts w:hint="default" w:ascii="Symbol" w:hAnsi="Symbol" w:cs="Symbol"/>
       </w:rPr>
     </w:lvl>
     <w:lvl w:ilvl="1">
@@ -2091,7 +3569,7 @@
         <w:ind w:start="1418" w:hanging="283"/>
       </w:pPr>
       <w:rPr>
-        <w:rFonts w:ascii="Symbol" w:hAnsi="Symbol" w:cs="Symbol" w:hint="default"/>
+        <w:rFonts w:hint="default" w:ascii="Symbol" w:hAnsi="Symbol" w:cs="Symbol"/>
       </w:rPr>
     </w:lvl>
     <w:lvl w:ilvl="2">
@@ -2106,7 +3584,7 @@
         <w:ind w:start="2127" w:hanging="283"/>
       </w:pPr>
       <w:rPr>
-        <w:rFonts w:ascii="Symbol" w:hAnsi="Symbol" w:cs="Symbol" w:hint="default"/>
+        <w:rFonts w:hint="default" w:ascii="Symbol" w:hAnsi="Symbol" w:cs="Symbol"/>
       </w:rPr>
     </w:lvl>
     <w:lvl w:ilvl="3">
@@ -2121,7 +3599,7 @@
         <w:ind w:start="2836" w:hanging="283"/>
       </w:pPr>
       <w:rPr>
-        <w:rFonts w:ascii="Symbol" w:hAnsi="Symbol" w:cs="Symbol" w:hint="default"/>
+        <w:rFonts w:hint="default" w:ascii="Symbol" w:hAnsi="Symbol" w:cs="Symbol"/>
       </w:rPr>
     </w:lvl>
     <w:lvl w:ilvl="4">
@@ -2136,7 +3614,7 @@
         <w:ind w:start="3545" w:hanging="283"/>
       </w:pPr>
       <w:rPr>
-        <w:rFonts w:ascii="Symbol" w:hAnsi="Symbol" w:cs="Symbol" w:hint="default"/>
+        <w:rFonts w:hint="default" w:ascii="Symbol" w:hAnsi="Symbol" w:cs="Symbol"/>
       </w:rPr>
     </w:lvl>
     <w:lvl w:ilvl="5">
@@ -2151,7 +3629,7 @@
         <w:ind w:start="4254" w:hanging="283"/>
       </w:pPr>
       <w:rPr>
-        <w:rFonts w:ascii="Symbol" w:hAnsi="Symbol" w:cs="Symbol" w:hint="default"/>
+        <w:rFonts w:hint="default" w:ascii="Symbol" w:hAnsi="Symbol" w:cs="Symbol"/>
       </w:rPr>
     </w:lvl>
     <w:lvl w:ilvl="6">
@@ -2166,7 +3644,7 @@
         <w:ind w:start="4963" w:hanging="283"/>
       </w:pPr>
       <w:rPr>
-        <w:rFonts w:ascii="Symbol" w:hAnsi="Symbol" w:cs="Symbol" w:hint="default"/>
+        <w:rFonts w:hint="default" w:ascii="Symbol" w:hAnsi="Symbol" w:cs="Symbol"/>
       </w:rPr>
     </w:lvl>
     <w:lvl w:ilvl="7">
@@ -2181,7 +3659,7 @@
         <w:ind w:start="5672" w:hanging="283"/>
       </w:pPr>
       <w:rPr>
-        <w:rFonts w:ascii="Symbol" w:hAnsi="Symbol" w:cs="Symbol" w:hint="default"/>
+        <w:rFonts w:hint="default" w:ascii="Symbol" w:hAnsi="Symbol" w:cs="Symbol"/>
       </w:rPr>
     </w:lvl>
     <w:lvl w:ilvl="8">
@@ -2196,9 +3674,10 @@
         <w:ind w:start="6381" w:hanging="283"/>
       </w:pPr>
       <w:rPr>
-        <w:rFonts w:ascii="Symbol" w:hAnsi="Symbol" w:cs="Symbol" w:hint="default"/>
-      </w:rPr>
-    </w:lvl>
+        <w:rFonts w:hint="default" w:ascii="Symbol" w:hAnsi="Symbol" w:cs="Symbol"/>
+      </w:rPr>
+    </w:lvl>
+    <w:nsid w:val="545e0b48"/>
   </w:abstractNum>
   <w:abstractNum w:abstractNumId="9">
     <w:lvl w:ilvl="0">
@@ -2213,7 +3692,7 @@
         <w:ind w:start="709" w:hanging="283"/>
       </w:pPr>
       <w:rPr>
-        <w:rFonts w:ascii="Symbol" w:hAnsi="Symbol" w:cs="Symbol" w:hint="default"/>
+        <w:rFonts w:hint="default" w:ascii="Symbol" w:hAnsi="Symbol" w:cs="Symbol"/>
       </w:rPr>
     </w:lvl>
     <w:lvl w:ilvl="1">
@@ -2228,7 +3707,7 @@
         <w:ind w:start="1418" w:hanging="283"/>
       </w:pPr>
       <w:rPr>
-        <w:rFonts w:ascii="Symbol" w:hAnsi="Symbol" w:cs="Symbol" w:hint="default"/>
+        <w:rFonts w:hint="default" w:ascii="Symbol" w:hAnsi="Symbol" w:cs="Symbol"/>
       </w:rPr>
     </w:lvl>
     <w:lvl w:ilvl="2">
@@ -2243,7 +3722,7 @@
         <w:ind w:start="2127" w:hanging="283"/>
       </w:pPr>
       <w:rPr>
-        <w:rFonts w:ascii="Symbol" w:hAnsi="Symbol" w:cs="Symbol" w:hint="default"/>
+        <w:rFonts w:hint="default" w:ascii="Symbol" w:hAnsi="Symbol" w:cs="Symbol"/>
       </w:rPr>
     </w:lvl>
     <w:lvl w:ilvl="3">
@@ -2258,7 +3737,7 @@
         <w:ind w:start="2836" w:hanging="283"/>
       </w:pPr>
       <w:rPr>
-        <w:rFonts w:ascii="Symbol" w:hAnsi="Symbol" w:cs="Symbol" w:hint="default"/>
+        <w:rFonts w:hint="default" w:ascii="Symbol" w:hAnsi="Symbol" w:cs="Symbol"/>
       </w:rPr>
     </w:lvl>
     <w:lvl w:ilvl="4">
@@ -2273,7 +3752,7 @@
         <w:ind w:start="3545" w:hanging="283"/>
       </w:pPr>
       <w:rPr>
-        <w:rFonts w:ascii="Symbol" w:hAnsi="Symbol" w:cs="Symbol" w:hint="default"/>
+        <w:rFonts w:hint="default" w:ascii="Symbol" w:hAnsi="Symbol" w:cs="Symbol"/>
       </w:rPr>
     </w:lvl>
     <w:lvl w:ilvl="5">
@@ -2288,7 +3767,7 @@
         <w:ind w:start="4254" w:hanging="283"/>
       </w:pPr>
       <w:rPr>
-        <w:rFonts w:ascii="Symbol" w:hAnsi="Symbol" w:cs="Symbol" w:hint="default"/>
+        <w:rFonts w:hint="default" w:ascii="Symbol" w:hAnsi="Symbol" w:cs="Symbol"/>
       </w:rPr>
     </w:lvl>
     <w:lvl w:ilvl="6">
@@ -2303,7 +3782,7 @@
         <w:ind w:start="4963" w:hanging="283"/>
       </w:pPr>
       <w:rPr>
-        <w:rFonts w:ascii="Symbol" w:hAnsi="Symbol" w:cs="Symbol" w:hint="default"/>
+        <w:rFonts w:hint="default" w:ascii="Symbol" w:hAnsi="Symbol" w:cs="Symbol"/>
       </w:rPr>
     </w:lvl>
     <w:lvl w:ilvl="7">
@@ -2318,7 +3797,7 @@
         <w:ind w:start="5672" w:hanging="283"/>
       </w:pPr>
       <w:rPr>
-        <w:rFonts w:ascii="Symbol" w:hAnsi="Symbol" w:cs="Symbol" w:hint="default"/>
+        <w:rFonts w:hint="default" w:ascii="Symbol" w:hAnsi="Symbol" w:cs="Symbol"/>
       </w:rPr>
     </w:lvl>
     <w:lvl w:ilvl="8">
@@ -2333,9 +3812,10 @@
         <w:ind w:start="6381" w:hanging="283"/>
       </w:pPr>
       <w:rPr>
-        <w:rFonts w:ascii="Symbol" w:hAnsi="Symbol" w:cs="Symbol" w:hint="default"/>
-      </w:rPr>
-    </w:lvl>
+        <w:rFonts w:hint="default" w:ascii="Symbol" w:hAnsi="Symbol" w:cs="Symbol"/>
+      </w:rPr>
+    </w:lvl>
+    <w:nsid w:val="5cad75cc"/>
   </w:abstractNum>
   <w:abstractNum w:abstractNumId="10">
     <w:lvl w:ilvl="0">
@@ -2350,7 +3830,7 @@
         <w:ind w:start="709" w:hanging="283"/>
       </w:pPr>
       <w:rPr>
-        <w:rFonts w:ascii="Symbol" w:hAnsi="Symbol" w:cs="Symbol" w:hint="default"/>
+        <w:rFonts w:hint="default" w:ascii="Symbol" w:hAnsi="Symbol" w:cs="Symbol"/>
       </w:rPr>
     </w:lvl>
     <w:lvl w:ilvl="1">
@@ -2365,7 +3845,7 @@
         <w:ind w:start="1418" w:hanging="283"/>
       </w:pPr>
       <w:rPr>
-        <w:rFonts w:ascii="Symbol" w:hAnsi="Symbol" w:cs="Symbol" w:hint="default"/>
+        <w:rFonts w:hint="default" w:ascii="Symbol" w:hAnsi="Symbol" w:cs="Symbol"/>
       </w:rPr>
     </w:lvl>
     <w:lvl w:ilvl="2">
@@ -2380,7 +3860,7 @@
         <w:ind w:start="2127" w:hanging="283"/>
       </w:pPr>
       <w:rPr>
-        <w:rFonts w:ascii="Symbol" w:hAnsi="Symbol" w:cs="Symbol" w:hint="default"/>
+        <w:rFonts w:hint="default" w:ascii="Symbol" w:hAnsi="Symbol" w:cs="Symbol"/>
       </w:rPr>
     </w:lvl>
     <w:lvl w:ilvl="3">
@@ -2395,7 +3875,7 @@
         <w:ind w:start="2836" w:hanging="283"/>
       </w:pPr>
       <w:rPr>
-        <w:rFonts w:ascii="Symbol" w:hAnsi="Symbol" w:cs="Symbol" w:hint="default"/>
+        <w:rFonts w:hint="default" w:ascii="Symbol" w:hAnsi="Symbol" w:cs="Symbol"/>
       </w:rPr>
     </w:lvl>
     <w:lvl w:ilvl="4">
@@ -2410,7 +3890,7 @@
         <w:ind w:start="3545" w:hanging="283"/>
       </w:pPr>
       <w:rPr>
-        <w:rFonts w:ascii="Symbol" w:hAnsi="Symbol" w:cs="Symbol" w:hint="default"/>
+        <w:rFonts w:hint="default" w:ascii="Symbol" w:hAnsi="Symbol" w:cs="Symbol"/>
       </w:rPr>
     </w:lvl>
     <w:lvl w:ilvl="5">
@@ -2425,7 +3905,7 @@
         <w:ind w:start="4254" w:hanging="283"/>
       </w:pPr>
       <w:rPr>
-        <w:rFonts w:ascii="Symbol" w:hAnsi="Symbol" w:cs="Symbol" w:hint="default"/>
+        <w:rFonts w:hint="default" w:ascii="Symbol" w:hAnsi="Symbol" w:cs="Symbol"/>
       </w:rPr>
     </w:lvl>
     <w:lvl w:ilvl="6">
@@ -2440,7 +3920,7 @@
         <w:ind w:start="4963" w:hanging="283"/>
       </w:pPr>
       <w:rPr>
-        <w:rFonts w:ascii="Symbol" w:hAnsi="Symbol" w:cs="Symbol" w:hint="default"/>
+        <w:rFonts w:hint="default" w:ascii="Symbol" w:hAnsi="Symbol" w:cs="Symbol"/>
       </w:rPr>
     </w:lvl>
     <w:lvl w:ilvl="7">
@@ -2455,7 +3935,7 @@
         <w:ind w:start="5672" w:hanging="283"/>
       </w:pPr>
       <w:rPr>
-        <w:rFonts w:ascii="Symbol" w:hAnsi="Symbol" w:cs="Symbol" w:hint="default"/>
+        <w:rFonts w:hint="default" w:ascii="Symbol" w:hAnsi="Symbol" w:cs="Symbol"/>
       </w:rPr>
     </w:lvl>
     <w:lvl w:ilvl="8">
@@ -2470,9 +3950,10 @@
         <w:ind w:start="6381" w:hanging="283"/>
       </w:pPr>
       <w:rPr>
-        <w:rFonts w:ascii="Symbol" w:hAnsi="Symbol" w:cs="Symbol" w:hint="default"/>
-      </w:rPr>
-    </w:lvl>
+        <w:rFonts w:hint="default" w:ascii="Symbol" w:hAnsi="Symbol" w:cs="Symbol"/>
+      </w:rPr>
+    </w:lvl>
+    <w:nsid w:val="1b86172c"/>
   </w:abstractNum>
   <w:abstractNum w:abstractNumId="11">
     <w:lvl w:ilvl="0">
@@ -2487,7 +3968,7 @@
         <w:ind w:start="709" w:hanging="283"/>
       </w:pPr>
       <w:rPr>
-        <w:rFonts w:ascii="Symbol" w:hAnsi="Symbol" w:cs="Symbol" w:hint="default"/>
+        <w:rFonts w:hint="default" w:ascii="Symbol" w:hAnsi="Symbol" w:cs="Symbol"/>
       </w:rPr>
     </w:lvl>
     <w:lvl w:ilvl="1">
@@ -2502,7 +3983,7 @@
         <w:ind w:start="1418" w:hanging="283"/>
       </w:pPr>
       <w:rPr>
-        <w:rFonts w:ascii="Symbol" w:hAnsi="Symbol" w:cs="Symbol" w:hint="default"/>
+        <w:rFonts w:hint="default" w:ascii="Symbol" w:hAnsi="Symbol" w:cs="Symbol"/>
       </w:rPr>
     </w:lvl>
     <w:lvl w:ilvl="2">
@@ -2517,7 +3998,7 @@
         <w:ind w:start="2127" w:hanging="283"/>
       </w:pPr>
       <w:rPr>
-        <w:rFonts w:ascii="Symbol" w:hAnsi="Symbol" w:cs="Symbol" w:hint="default"/>
+        <w:rFonts w:hint="default" w:ascii="Symbol" w:hAnsi="Symbol" w:cs="Symbol"/>
       </w:rPr>
     </w:lvl>
     <w:lvl w:ilvl="3">
@@ -2532,7 +4013,7 @@
         <w:ind w:start="2836" w:hanging="283"/>
       </w:pPr>
       <w:rPr>
-        <w:rFonts w:ascii="Symbol" w:hAnsi="Symbol" w:cs="Symbol" w:hint="default"/>
+        <w:rFonts w:hint="default" w:ascii="Symbol" w:hAnsi="Symbol" w:cs="Symbol"/>
       </w:rPr>
     </w:lvl>
     <w:lvl w:ilvl="4">
@@ -2547,7 +4028,7 @@
         <w:ind w:start="3545" w:hanging="283"/>
       </w:pPr>
       <w:rPr>
-        <w:rFonts w:ascii="Symbol" w:hAnsi="Symbol" w:cs="Symbol" w:hint="default"/>
+        <w:rFonts w:hint="default" w:ascii="Symbol" w:hAnsi="Symbol" w:cs="Symbol"/>
       </w:rPr>
     </w:lvl>
     <w:lvl w:ilvl="5">
@@ -2562,7 +4043,7 @@
         <w:ind w:start="4254" w:hanging="283"/>
       </w:pPr>
       <w:rPr>
-        <w:rFonts w:ascii="Symbol" w:hAnsi="Symbol" w:cs="Symbol" w:hint="default"/>
+        <w:rFonts w:hint="default" w:ascii="Symbol" w:hAnsi="Symbol" w:cs="Symbol"/>
       </w:rPr>
     </w:lvl>
     <w:lvl w:ilvl="6">
@@ -2577,7 +4058,7 @@
         <w:ind w:start="4963" w:hanging="283"/>
       </w:pPr>
       <w:rPr>
-        <w:rFonts w:ascii="Symbol" w:hAnsi="Symbol" w:cs="Symbol" w:hint="default"/>
+        <w:rFonts w:hint="default" w:ascii="Symbol" w:hAnsi="Symbol" w:cs="Symbol"/>
       </w:rPr>
     </w:lvl>
     <w:lvl w:ilvl="7">
@@ -2592,7 +4073,7 @@
         <w:ind w:start="5672" w:hanging="283"/>
       </w:pPr>
       <w:rPr>
-        <w:rFonts w:ascii="Symbol" w:hAnsi="Symbol" w:cs="Symbol" w:hint="default"/>
+        <w:rFonts w:hint="default" w:ascii="Symbol" w:hAnsi="Symbol" w:cs="Symbol"/>
       </w:rPr>
     </w:lvl>
     <w:lvl w:ilvl="8">
@@ -2607,9 +4088,10 @@
         <w:ind w:start="6381" w:hanging="283"/>
       </w:pPr>
       <w:rPr>
-        <w:rFonts w:ascii="Symbol" w:hAnsi="Symbol" w:cs="Symbol" w:hint="default"/>
-      </w:rPr>
-    </w:lvl>
+        <w:rFonts w:hint="default" w:ascii="Symbol" w:hAnsi="Symbol" w:cs="Symbol"/>
+      </w:rPr>
+    </w:lvl>
+    <w:nsid w:val="2f4ea6d1"/>
   </w:abstractNum>
   <w:abstractNum w:abstractNumId="12">
     <w:lvl w:ilvl="0">
@@ -2624,7 +4106,7 @@
         <w:ind w:start="709" w:hanging="283"/>
       </w:pPr>
       <w:rPr>
-        <w:rFonts w:ascii="Symbol" w:hAnsi="Symbol" w:cs="Symbol" w:hint="default"/>
+        <w:rFonts w:hint="default" w:ascii="Symbol" w:hAnsi="Symbol" w:cs="Symbol"/>
       </w:rPr>
     </w:lvl>
     <w:lvl w:ilvl="1">
@@ -2639,7 +4121,7 @@
         <w:ind w:start="1418" w:hanging="283"/>
       </w:pPr>
       <w:rPr>
-        <w:rFonts w:ascii="Symbol" w:hAnsi="Symbol" w:cs="Symbol" w:hint="default"/>
+        <w:rFonts w:hint="default" w:ascii="Symbol" w:hAnsi="Symbol" w:cs="Symbol"/>
       </w:rPr>
     </w:lvl>
     <w:lvl w:ilvl="2">
@@ -2654,7 +4136,7 @@
         <w:ind w:start="2127" w:hanging="283"/>
       </w:pPr>
       <w:rPr>
-        <w:rFonts w:ascii="Symbol" w:hAnsi="Symbol" w:cs="Symbol" w:hint="default"/>
+        <w:rFonts w:hint="default" w:ascii="Symbol" w:hAnsi="Symbol" w:cs="Symbol"/>
       </w:rPr>
     </w:lvl>
     <w:lvl w:ilvl="3">
@@ -2669,7 +4151,7 @@
         <w:ind w:start="2836" w:hanging="283"/>
       </w:pPr>
       <w:rPr>
-        <w:rFonts w:ascii="Symbol" w:hAnsi="Symbol" w:cs="Symbol" w:hint="default"/>
+        <w:rFonts w:hint="default" w:ascii="Symbol" w:hAnsi="Symbol" w:cs="Symbol"/>
       </w:rPr>
     </w:lvl>
     <w:lvl w:ilvl="4">
@@ -2684,7 +4166,7 @@
         <w:ind w:start="3545" w:hanging="283"/>
       </w:pPr>
       <w:rPr>
-        <w:rFonts w:ascii="Symbol" w:hAnsi="Symbol" w:cs="Symbol" w:hint="default"/>
+        <w:rFonts w:hint="default" w:ascii="Symbol" w:hAnsi="Symbol" w:cs="Symbol"/>
       </w:rPr>
     </w:lvl>
     <w:lvl w:ilvl="5">
@@ -2699,7 +4181,7 @@
         <w:ind w:start="4254" w:hanging="283"/>
       </w:pPr>
       <w:rPr>
-        <w:rFonts w:ascii="Symbol" w:hAnsi="Symbol" w:cs="Symbol" w:hint="default"/>
+        <w:rFonts w:hint="default" w:ascii="Symbol" w:hAnsi="Symbol" w:cs="Symbol"/>
       </w:rPr>
     </w:lvl>
     <w:lvl w:ilvl="6">
@@ -2714,7 +4196,7 @@
         <w:ind w:start="4963" w:hanging="283"/>
       </w:pPr>
       <w:rPr>
-        <w:rFonts w:ascii="Symbol" w:hAnsi="Symbol" w:cs="Symbol" w:hint="default"/>
+        <w:rFonts w:hint="default" w:ascii="Symbol" w:hAnsi="Symbol" w:cs="Symbol"/>
       </w:rPr>
     </w:lvl>
     <w:lvl w:ilvl="7">
@@ -2729,7 +4211,7 @@
         <w:ind w:start="5672" w:hanging="283"/>
       </w:pPr>
       <w:rPr>
-        <w:rFonts w:ascii="Symbol" w:hAnsi="Symbol" w:cs="Symbol" w:hint="default"/>
+        <w:rFonts w:hint="default" w:ascii="Symbol" w:hAnsi="Symbol" w:cs="Symbol"/>
       </w:rPr>
     </w:lvl>
     <w:lvl w:ilvl="8">
@@ -2744,9 +4226,10 @@
         <w:ind w:start="6381" w:hanging="283"/>
       </w:pPr>
       <w:rPr>
-        <w:rFonts w:ascii="Symbol" w:hAnsi="Symbol" w:cs="Symbol" w:hint="default"/>
-      </w:rPr>
-    </w:lvl>
+        <w:rFonts w:hint="default" w:ascii="Symbol" w:hAnsi="Symbol" w:cs="Symbol"/>
+      </w:rPr>
+    </w:lvl>
+    <w:nsid w:val="2c7ff4de"/>
   </w:abstractNum>
   <w:abstractNum w:abstractNumId="13">
     <w:lvl w:ilvl="0">
@@ -2866,7 +4349,23 @@
         <w:ind w:start="0" w:hanging="0"/>
       </w:pPr>
     </w:lvl>
+    <w:nsid w:val="4d767447"/>
   </w:abstractNum>
+  <w:num w:numId="18">
+    <w:abstractNumId w:val="18"/>
+  </w:num>
+  <w:num w:numId="17">
+    <w:abstractNumId w:val="17"/>
+  </w:num>
+  <w:num w:numId="16">
+    <w:abstractNumId w:val="16"/>
+  </w:num>
+  <w:num w:numId="15">
+    <w:abstractNumId w:val="15"/>
+  </w:num>
+  <w:num w:numId="14">
+    <w:abstractNumId w:val="14"/>
+  </w:num>
   <w:num w:numId="1">
     <w:abstractNumId w:val="1"/>
   </w:num>
@@ -2910,11 +4409,11 @@
 </file>
 
 <file path=word/styles.xml><?xml version="1.0" encoding="utf-8"?>
-<w:styles xmlns:w="http://schemas.openxmlformats.org/wordprocessingml/2006/main" xmlns:w14="http://schemas.microsoft.com/office/word/2010/wordml" xmlns:mc="http://schemas.openxmlformats.org/markup-compatibility/2006" mc:Ignorable="w14">
+<w:styles xmlns:wp14="http://schemas.microsoft.com/office/word/2010/wordprocessingDrawing" xmlns:w="http://schemas.openxmlformats.org/wordprocessingml/2006/main" xmlns:w14="http://schemas.microsoft.com/office/word/2010/wordml" xmlns:mc="http://schemas.openxmlformats.org/markup-compatibility/2006" mc:Ignorable="w14 wp14">
   <w:docDefaults>
     <w:rPrDefault>
       <w:rPr>
-        <w:rFonts w:ascii="Aptos" w:hAnsi="Aptos" w:eastAsia="Aptos" w:cs="" w:asciiTheme="minorHAnsi" w:cstheme="minorBidi" w:eastAsiaTheme="minorHAnsi" w:hAnsiTheme="minorHAnsi"/>
+        <w:rFonts w:ascii="Aptos" w:hAnsi="Aptos" w:eastAsia="Aptos" w:cs="" w:asciiTheme="minorHAnsi" w:hAnsiTheme="minorHAnsi" w:eastAsiaTheme="minorHAnsi" w:cstheme="minorBidi"/>
         <w:kern w:val="2"/>
         <w:sz w:val="24"/>
         <w:szCs w:val="24"/>
@@ -3312,11 +4811,11 @@
     <w:pPr>
       <w:widowControl/>
       <w:bidi w:val="0"/>
-      <w:spacing w:lineRule="auto" w:line="278" w:before="0" w:after="160"/>
+      <w:spacing w:before="0" w:after="160" w:line="278" w:lineRule="auto"/>
       <w:jc w:val="start"/>
     </w:pPr>
     <w:rPr>
-      <w:rFonts w:ascii="Aptos" w:hAnsi="Aptos" w:eastAsia="Aptos" w:cs="" w:asciiTheme="minorHAnsi" w:cstheme="minorBidi" w:eastAsiaTheme="minorHAnsi" w:hAnsiTheme="minorHAnsi"/>
+      <w:rFonts w:ascii="Aptos" w:hAnsi="Aptos" w:eastAsia="Aptos" w:cs="" w:asciiTheme="minorHAnsi" w:hAnsiTheme="minorHAnsi" w:eastAsiaTheme="minorHAnsi" w:cstheme="minorBidi"/>
       <w:color w:val="auto"/>
       <w:kern w:val="2"/>
       <w:sz w:val="24"/>
@@ -3340,8 +4839,8 @@
       <w:outlineLvl w:val="0"/>
     </w:pPr>
     <w:rPr>
-      <w:rFonts w:ascii="Aptos Display" w:hAnsi="Aptos Display" w:eastAsia="" w:cs="" w:asciiTheme="majorHAnsi" w:cstheme="majorBidi" w:eastAsiaTheme="majorEastAsia" w:hAnsiTheme="majorHAnsi"/>
-      <w:color w:themeColor="accent1" w:themeShade="bf" w:val="0F4761"/>
+      <w:rFonts w:ascii="Aptos Display" w:hAnsi="Aptos Display" w:eastAsia="" w:cs="" w:asciiTheme="majorHAnsi" w:hAnsiTheme="majorHAnsi" w:eastAsiaTheme="majorEastAsia" w:cstheme="majorBidi"/>
+      <w:color w:val="0F4761" w:themeColor="accent1" w:themeShade="bf"/>
       <w:sz w:val="40"/>
       <w:szCs w:val="40"/>
     </w:rPr>
@@ -3363,8 +4862,8 @@
       <w:outlineLvl w:val="1"/>
     </w:pPr>
     <w:rPr>
-      <w:rFonts w:ascii="Aptos Display" w:hAnsi="Aptos Display" w:eastAsia="" w:cs="" w:asciiTheme="majorHAnsi" w:cstheme="majorBidi" w:eastAsiaTheme="majorEastAsia" w:hAnsiTheme="majorHAnsi"/>
-      <w:color w:themeColor="accent1" w:themeShade="bf" w:val="0F4761"/>
+      <w:rFonts w:ascii="Aptos Display" w:hAnsi="Aptos Display" w:eastAsia="" w:cs="" w:asciiTheme="majorHAnsi" w:hAnsiTheme="majorHAnsi" w:eastAsiaTheme="majorEastAsia" w:cstheme="majorBidi"/>
+      <w:color w:val="0F4761" w:themeColor="accent1" w:themeShade="bf"/>
       <w:sz w:val="32"/>
       <w:szCs w:val="32"/>
     </w:rPr>
@@ -3386,8 +4885,8 @@
       <w:outlineLvl w:val="2"/>
     </w:pPr>
     <w:rPr>
-      <w:rFonts w:eastAsia="" w:cs="" w:cstheme="majorBidi" w:eastAsiaTheme="majorEastAsia"/>
-      <w:color w:themeColor="accent1" w:themeShade="bf" w:val="0F4761"/>
+      <w:rFonts w:eastAsia="" w:cs="" w:eastAsiaTheme="majorEastAsia" w:cstheme="majorBidi"/>
+      <w:color w:val="0F4761" w:themeColor="accent1" w:themeShade="bf"/>
       <w:sz w:val="28"/>
       <w:szCs w:val="28"/>
     </w:rPr>
@@ -3409,10 +4908,10 @@
       <w:outlineLvl w:val="3"/>
     </w:pPr>
     <w:rPr>
-      <w:rFonts w:eastAsia="" w:cs="" w:cstheme="majorBidi" w:eastAsiaTheme="majorEastAsia"/>
+      <w:rFonts w:eastAsia="" w:cs="" w:eastAsiaTheme="majorEastAsia" w:cstheme="majorBidi"/>
       <w:i/>
       <w:iCs/>
-      <w:color w:themeColor="accent1" w:themeShade="bf" w:val="0F4761"/>
+      <w:color w:val="0F4761" w:themeColor="accent1" w:themeShade="bf"/>
     </w:rPr>
   </w:style>
   <w:style w:type="paragraph" w:styleId="Heading5">
@@ -3432,8 +4931,8 @@
       <w:outlineLvl w:val="4"/>
     </w:pPr>
     <w:rPr>
-      <w:rFonts w:eastAsia="" w:cs="" w:cstheme="majorBidi" w:eastAsiaTheme="majorEastAsia"/>
-      <w:color w:themeColor="accent1" w:themeShade="bf" w:val="0F4761"/>
+      <w:rFonts w:eastAsia="" w:cs="" w:eastAsiaTheme="majorEastAsia" w:cstheme="majorBidi"/>
+      <w:color w:val="0F4761" w:themeColor="accent1" w:themeShade="bf"/>
     </w:rPr>
   </w:style>
   <w:style w:type="paragraph" w:styleId="Heading6">
@@ -3453,10 +4952,10 @@
       <w:outlineLvl w:val="5"/>
     </w:pPr>
     <w:rPr>
-      <w:rFonts w:eastAsia="" w:cs="" w:cstheme="majorBidi" w:eastAsiaTheme="majorEastAsia"/>
+      <w:rFonts w:eastAsia="" w:cs="" w:eastAsiaTheme="majorEastAsia" w:cstheme="majorBidi"/>
       <w:i/>
       <w:iCs/>
-      <w:color w:themeColor="text1" w:themeTint="a6" w:val="595959"/>
+      <w:color w:val="595959" w:themeColor="text1" w:themeTint="a6"/>
     </w:rPr>
   </w:style>
   <w:style w:type="paragraph" w:styleId="Heading7">
@@ -3476,8 +4975,8 @@
       <w:outlineLvl w:val="6"/>
     </w:pPr>
     <w:rPr>
-      <w:rFonts w:eastAsia="" w:cs="" w:cstheme="majorBidi" w:eastAsiaTheme="majorEastAsia"/>
-      <w:color w:themeColor="text1" w:themeTint="a6" w:val="595959"/>
+      <w:rFonts w:eastAsia="" w:cs="" w:eastAsiaTheme="majorEastAsia" w:cstheme="majorBidi"/>
+      <w:color w:val="595959" w:themeColor="text1" w:themeTint="a6"/>
     </w:rPr>
   </w:style>
   <w:style w:type="paragraph" w:styleId="Heading8">
@@ -3497,10 +4996,10 @@
       <w:outlineLvl w:val="7"/>
     </w:pPr>
     <w:rPr>
-      <w:rFonts w:eastAsia="" w:cs="" w:cstheme="majorBidi" w:eastAsiaTheme="majorEastAsia"/>
+      <w:rFonts w:eastAsia="" w:cs="" w:eastAsiaTheme="majorEastAsia" w:cstheme="majorBidi"/>
       <w:i/>
       <w:iCs/>
-      <w:color w:themeColor="text1" w:themeTint="d8" w:val="272727"/>
+      <w:color w:val="272727" w:themeColor="text1" w:themeTint="d8"/>
     </w:rPr>
   </w:style>
   <w:style w:type="paragraph" w:styleId="Heading9">
@@ -3520,8 +5019,8 @@
       <w:outlineLvl w:val="8"/>
     </w:pPr>
     <w:rPr>
-      <w:rFonts w:eastAsia="" w:cs="" w:cstheme="majorBidi" w:eastAsiaTheme="majorEastAsia"/>
-      <w:color w:themeColor="text1" w:themeTint="d8" w:val="272727"/>
+      <w:rFonts w:eastAsia="" w:cs="" w:eastAsiaTheme="majorEastAsia" w:cstheme="majorBidi"/>
+      <w:color w:val="272727" w:themeColor="text1" w:themeTint="d8"/>
     </w:rPr>
   </w:style>
   <w:style w:type="character" w:styleId="DefaultParagraphFont" w:default="1">
@@ -3538,8 +5037,8 @@
     <w:qFormat/>
     <w:rsid w:val="008062cc"/>
     <w:rPr>
-      <w:rFonts w:ascii="Aptos Display" w:hAnsi="Aptos Display" w:eastAsia="" w:cs="" w:asciiTheme="majorHAnsi" w:cstheme="majorBidi" w:eastAsiaTheme="majorEastAsia" w:hAnsiTheme="majorHAnsi"/>
-      <w:color w:themeColor="accent1" w:themeShade="bf" w:val="0F4761"/>
+      <w:rFonts w:ascii="Aptos Display" w:hAnsi="Aptos Display" w:eastAsia="" w:cs="" w:asciiTheme="majorHAnsi" w:hAnsiTheme="majorHAnsi" w:eastAsiaTheme="majorEastAsia" w:cstheme="majorBidi"/>
+      <w:color w:val="0F4761" w:themeColor="accent1" w:themeShade="bf"/>
       <w:sz w:val="40"/>
       <w:szCs w:val="40"/>
     </w:rPr>
@@ -3552,8 +5051,8 @@
     <w:qFormat/>
     <w:rsid w:val="008062cc"/>
     <w:rPr>
-      <w:rFonts w:ascii="Aptos Display" w:hAnsi="Aptos Display" w:eastAsia="" w:cs="" w:asciiTheme="majorHAnsi" w:cstheme="majorBidi" w:eastAsiaTheme="majorEastAsia" w:hAnsiTheme="majorHAnsi"/>
-      <w:color w:themeColor="accent1" w:themeShade="bf" w:val="0F4761"/>
+      <w:rFonts w:ascii="Aptos Display" w:hAnsi="Aptos Display" w:eastAsia="" w:cs="" w:asciiTheme="majorHAnsi" w:hAnsiTheme="majorHAnsi" w:eastAsiaTheme="majorEastAsia" w:cstheme="majorBidi"/>
+      <w:color w:val="0F4761" w:themeColor="accent1" w:themeShade="bf"/>
       <w:sz w:val="32"/>
       <w:szCs w:val="32"/>
     </w:rPr>
@@ -3566,8 +5065,8 @@
     <w:qFormat/>
     <w:rsid w:val="008062cc"/>
     <w:rPr>
-      <w:rFonts w:eastAsia="" w:cs="" w:cstheme="majorBidi" w:eastAsiaTheme="majorEastAsia"/>
-      <w:color w:themeColor="accent1" w:themeShade="bf" w:val="0F4761"/>
+      <w:rFonts w:eastAsia="" w:cs="" w:eastAsiaTheme="majorEastAsia" w:cstheme="majorBidi"/>
+      <w:color w:val="0F4761" w:themeColor="accent1" w:themeShade="bf"/>
       <w:sz w:val="28"/>
       <w:szCs w:val="28"/>
     </w:rPr>
@@ -3580,10 +5079,10 @@
     <w:qFormat/>
     <w:rsid w:val="008062cc"/>
     <w:rPr>
-      <w:rFonts w:eastAsia="" w:cs="" w:cstheme="majorBidi" w:eastAsiaTheme="majorEastAsia"/>
+      <w:rFonts w:eastAsia="" w:cs="" w:eastAsiaTheme="majorEastAsia" w:cstheme="majorBidi"/>
       <w:i/>
       <w:iCs/>
-      <w:color w:themeColor="accent1" w:themeShade="bf" w:val="0F4761"/>
+      <w:color w:val="0F4761" w:themeColor="accent1" w:themeShade="bf"/>
     </w:rPr>
   </w:style>
   <w:style w:type="character" w:styleId="Nagwek5Znak" w:customStyle="1">
@@ -3594,8 +5093,8 @@
     <w:qFormat/>
     <w:rsid w:val="008062cc"/>
     <w:rPr>
-      <w:rFonts w:eastAsia="" w:cs="" w:cstheme="majorBidi" w:eastAsiaTheme="majorEastAsia"/>
-      <w:color w:themeColor="accent1" w:themeShade="bf" w:val="0F4761"/>
+      <w:rFonts w:eastAsia="" w:cs="" w:eastAsiaTheme="majorEastAsia" w:cstheme="majorBidi"/>
+      <w:color w:val="0F4761" w:themeColor="accent1" w:themeShade="bf"/>
     </w:rPr>
   </w:style>
   <w:style w:type="character" w:styleId="Nagwek6Znak" w:customStyle="1">
@@ -3606,10 +5105,10 @@
     <w:qFormat/>
     <w:rsid w:val="008062cc"/>
     <w:rPr>
-      <w:rFonts w:eastAsia="" w:cs="" w:cstheme="majorBidi" w:eastAsiaTheme="majorEastAsia"/>
+      <w:rFonts w:eastAsia="" w:cs="" w:eastAsiaTheme="majorEastAsia" w:cstheme="majorBidi"/>
       <w:i/>
       <w:iCs/>
-      <w:color w:themeColor="text1" w:themeTint="a6" w:val="595959"/>
+      <w:color w:val="595959" w:themeColor="text1" w:themeTint="a6"/>
     </w:rPr>
   </w:style>
   <w:style w:type="character" w:styleId="Nagwek7Znak" w:customStyle="1">
@@ -3620,8 +5119,8 @@
     <w:qFormat/>
     <w:rsid w:val="008062cc"/>
     <w:rPr>
-      <w:rFonts w:eastAsia="" w:cs="" w:cstheme="majorBidi" w:eastAsiaTheme="majorEastAsia"/>
-      <w:color w:themeColor="text1" w:themeTint="a6" w:val="595959"/>
+      <w:rFonts w:eastAsia="" w:cs="" w:eastAsiaTheme="majorEastAsia" w:cstheme="majorBidi"/>
+      <w:color w:val="595959" w:themeColor="text1" w:themeTint="a6"/>
     </w:rPr>
   </w:style>
   <w:style w:type="character" w:styleId="Nagwek8Znak" w:customStyle="1">
@@ -3632,10 +5131,10 @@
     <w:qFormat/>
     <w:rsid w:val="008062cc"/>
     <w:rPr>
-      <w:rFonts w:eastAsia="" w:cs="" w:cstheme="majorBidi" w:eastAsiaTheme="majorEastAsia"/>
+      <w:rFonts w:eastAsia="" w:cs="" w:eastAsiaTheme="majorEastAsia" w:cstheme="majorBidi"/>
       <w:i/>
       <w:iCs/>
-      <w:color w:themeColor="text1" w:themeTint="d8" w:val="272727"/>
+      <w:color w:val="272727" w:themeColor="text1" w:themeTint="d8"/>
     </w:rPr>
   </w:style>
   <w:style w:type="character" w:styleId="Nagwek9Znak" w:customStyle="1">
@@ -3646,8 +5145,8 @@
     <w:qFormat/>
     <w:rsid w:val="008062cc"/>
     <w:rPr>
-      <w:rFonts w:eastAsia="" w:cs="" w:cstheme="majorBidi" w:eastAsiaTheme="majorEastAsia"/>
-      <w:color w:themeColor="text1" w:themeTint="d8" w:val="272727"/>
+      <w:rFonts w:eastAsia="" w:cs="" w:eastAsiaTheme="majorEastAsia" w:cstheme="majorBidi"/>
+      <w:color w:val="272727" w:themeColor="text1" w:themeTint="d8"/>
     </w:rPr>
   </w:style>
   <w:style w:type="character" w:styleId="TytuZnak" w:customStyle="1">
@@ -3657,7 +5156,7 @@
     <w:qFormat/>
     <w:rsid w:val="008062cc"/>
     <w:rPr>
-      <w:rFonts w:ascii="Aptos Display" w:hAnsi="Aptos Display" w:eastAsia="" w:cs="" w:asciiTheme="majorHAnsi" w:cstheme="majorBidi" w:eastAsiaTheme="majorEastAsia" w:hAnsiTheme="majorHAnsi"/>
+      <w:rFonts w:ascii="Aptos Display" w:hAnsi="Aptos Display" w:eastAsia="" w:cs="" w:asciiTheme="majorHAnsi" w:hAnsiTheme="majorHAnsi" w:eastAsiaTheme="majorEastAsia" w:cstheme="majorBidi"/>
       <w:spacing w:val="-10"/>
       <w:kern w:val="2"/>
       <w:sz w:val="56"/>
@@ -3671,8 +5170,8 @@
     <w:qFormat/>
     <w:rsid w:val="008062cc"/>
     <w:rPr>
-      <w:rFonts w:eastAsia="" w:cs="" w:cstheme="majorBidi" w:eastAsiaTheme="majorEastAsia"/>
-      <w:color w:themeColor="text1" w:themeTint="a6" w:val="595959"/>
+      <w:rFonts w:eastAsia="" w:cs="" w:eastAsiaTheme="majorEastAsia" w:cstheme="majorBidi"/>
+      <w:color w:val="595959" w:themeColor="text1" w:themeTint="a6"/>
       <w:spacing w:val="15"/>
       <w:sz w:val="28"/>
       <w:szCs w:val="28"/>
@@ -3688,7 +5187,7 @@
     <w:rPr>
       <w:i/>
       <w:iCs/>
-      <w:color w:themeColor="text1" w:themeTint="bf" w:val="404040"/>
+      <w:color w:val="404040" w:themeColor="text1" w:themeTint="bf"/>
     </w:rPr>
   </w:style>
   <w:style w:type="character" w:styleId="IntenseEmphasis">
@@ -3700,7 +5199,7 @@
     <w:rPr>
       <w:i/>
       <w:iCs/>
-      <w:color w:themeColor="accent1" w:themeShade="bf" w:val="0F4761"/>
+      <w:color w:val="0F4761" w:themeColor="accent1" w:themeShade="bf"/>
     </w:rPr>
   </w:style>
   <w:style w:type="character" w:styleId="CytatintensywnyZnak" w:customStyle="1">
@@ -3713,7 +5212,7 @@
     <w:rPr>
       <w:i/>
       <w:iCs/>
-      <w:color w:themeColor="accent1" w:themeShade="bf" w:val="0F4761"/>
+      <w:color w:val="0F4761" w:themeColor="accent1" w:themeShade="bf"/>
     </w:rPr>
   </w:style>
   <w:style w:type="character" w:styleId="IntenseReference">
@@ -3726,7 +5225,7 @@
       <w:b/>
       <w:bCs/>
       <w:smallCaps/>
-      <w:color w:themeColor="accent1" w:themeShade="bf" w:val="0F4761"/>
+      <w:color w:val="0F4761" w:themeColor="accent1" w:themeShade="bf"/>
       <w:spacing w:val="5"/>
     </w:rPr>
   </w:style>
@@ -3794,7 +5293,7 @@
     <w:name w:val="Body Text"/>
     <w:basedOn w:val="Normal"/>
     <w:pPr>
-      <w:spacing w:lineRule="auto" w:line="276" w:before="0" w:after="0"/>
+      <w:spacing w:before="0" w:after="0" w:line="276" w:lineRule="auto"/>
     </w:pPr>
     <w:rPr/>
   </w:style>
@@ -3842,11 +5341,11 @@
     <w:qFormat/>
     <w:rsid w:val="008062cc"/>
     <w:pPr>
-      <w:spacing w:lineRule="auto" w:line="240" w:before="0" w:after="80"/>
+      <w:spacing w:before="0" w:after="80" w:line="240" w:lineRule="auto"/>
       <w:contextualSpacing/>
     </w:pPr>
     <w:rPr>
-      <w:rFonts w:ascii="Aptos Display" w:hAnsi="Aptos Display" w:eastAsia="" w:cs="" w:asciiTheme="majorHAnsi" w:cstheme="majorBidi" w:eastAsiaTheme="majorEastAsia" w:hAnsiTheme="majorHAnsi"/>
+      <w:rFonts w:ascii="Aptos Display" w:hAnsi="Aptos Display" w:eastAsia="" w:cs="" w:asciiTheme="majorHAnsi" w:hAnsiTheme="majorHAnsi" w:eastAsiaTheme="majorEastAsia" w:cstheme="majorBidi"/>
       <w:spacing w:val="-10"/>
       <w:kern w:val="2"/>
       <w:sz w:val="56"/>
@@ -3863,8 +5362,8 @@
     <w:rsid w:val="008062cc"/>
     <w:pPr/>
     <w:rPr>
-      <w:rFonts w:eastAsia="" w:cs="" w:cstheme="majorBidi" w:eastAsiaTheme="majorEastAsia"/>
-      <w:color w:themeColor="text1" w:themeTint="a6" w:val="595959"/>
+      <w:rFonts w:eastAsia="" w:cs="" w:eastAsiaTheme="majorEastAsia" w:cstheme="majorBidi"/>
+      <w:color w:val="595959" w:themeColor="text1" w:themeTint="a6"/>
       <w:spacing w:val="15"/>
       <w:sz w:val="28"/>
       <w:szCs w:val="28"/>
@@ -3885,7 +5384,7 @@
     <w:rPr>
       <w:i/>
       <w:iCs/>
-      <w:color w:themeColor="text1" w:themeTint="bf" w:val="404040"/>
+      <w:color w:val="404040" w:themeColor="text1" w:themeTint="bf"/>
     </w:rPr>
   </w:style>
   <w:style w:type="paragraph" w:styleId="ListParagraph">
@@ -3911,8 +5410,8 @@
     <w:rsid w:val="008062cc"/>
     <w:pPr>
       <w:pBdr>
-        <w:top w:val="single" w:sz="4" w:space="10" w:color="0F4761" w:themeColor="accent1" w:themeShade="bf"/>
-        <w:bottom w:val="single" w:sz="4" w:space="10" w:color="0F4761" w:themeColor="accent1" w:themeShade="bf"/>
+        <w:top w:val="single" w:color="0F4761" w:themeColor="accent1" w:themeShade="bf" w:sz="4" w:space="10"/>
+        <w:bottom w:val="single" w:color="0F4761" w:themeColor="accent1" w:themeShade="bf" w:sz="4" w:space="10"/>
       </w:pBdr>
       <w:spacing w:before="360" w:after="360"/>
       <w:ind w:start="864" w:end="864"/>
@@ -3921,7 +5420,7 @@
     <w:rPr>
       <w:i/>
       <w:iCs/>
-      <w:color w:themeColor="accent1" w:themeShade="bf" w:val="0F4761"/>
+      <w:color w:val="0F4761" w:themeColor="accent1" w:themeShade="bf"/>
     </w:rPr>
   </w:style>
   <w:style w:type="paragraph" w:styleId="EndnoteText">
@@ -3933,7 +5432,7 @@
     <w:unhideWhenUsed/>
     <w:rsid w:val="008062cc"/>
     <w:pPr>
-      <w:spacing w:lineRule="auto" w:line="240" w:before="0" w:after="0"/>
+      <w:spacing w:before="0" w:after="0" w:line="240" w:lineRule="auto"/>
     </w:pPr>
     <w:rPr>
       <w:sz w:val="20"/>
@@ -3947,7 +5446,7 @@
     <w:unhideWhenUsed/>
     <w:qFormat/>
   </w:style>
-  <w:style w:type="table" w:default="1" w:styleId="Standardowy">
+  <w:style w:type="table" w:styleId="Standardowy" w:default="1">
     <w:name w:val="Normal Table"/>
     <w:uiPriority w:val="99"/>
     <w:semiHidden/>

</xml_diff>

<commit_message>
Poprawa nazwy przypadku użycia dla przykładu dla zarząd
</commit_message>
<xml_diff>
--- a/TC (p. 4.1)/Przypadek użycia1.docx
+++ b/TC (p. 4.1)/Przypadek użycia1.docx
@@ -2,7 +2,26 @@
 <file path=word/document.xml><?xml version="1.0" encoding="utf-8"?>
 <w:document xmlns:o="urn:schemas-microsoft-com:office:office" xmlns:r="http://schemas.openxmlformats.org/officeDocument/2006/relationships" xmlns:v="urn:schemas-microsoft-com:vml" xmlns:w="http://schemas.openxmlformats.org/wordprocessingml/2006/main" xmlns:w10="urn:schemas-microsoft-com:office:word" xmlns:wp="http://schemas.openxmlformats.org/drawingml/2006/wordprocessingDrawing" xmlns:pic="http://schemas.openxmlformats.org/drawingml/2006/picture" xmlns:wps="http://schemas.microsoft.com/office/word/2010/wordprocessingShape" xmlns:wpg="http://schemas.microsoft.com/office/word/2010/wordprocessingGroup" xmlns:mc="http://schemas.openxmlformats.org/markup-compatibility/2006" xmlns:wp14="http://schemas.microsoft.com/office/word/2010/wordprocessingDrawing" xmlns:w14="http://schemas.microsoft.com/office/word/2010/wordml" xmlns:w15="http://schemas.microsoft.com/office/word/2012/wordml" mc:Ignorable="w14 wp14 w15">
   <w:body>
-    <w:p>
+    <w:p xmlns:wp14="http://schemas.microsoft.com/office/word/2010/wordml" wp14:textId="7F3AEF41">
+      <w:pPr>
+        <w:pStyle w:val="Normal"/>
+        <w:spacing w:before="0" w:afterAutospacing="on"/>
+        <w:rPr>
+          <w:sz w:val="20"/>
+          <w:szCs w:val="20"/>
+        </w:rPr>
+      </w:pPr>
+      <w:r>
+        <w:rPr>
+          <w:b w:val="1"/>
+          <w:bCs w:val="1"/>
+          <w:sz w:val="20"/>
+          <w:szCs w:val="20"/>
+        </w:rPr>
+        <w:t>Przypadek użycia: “Opłacenie składki”</w:t>
+      </w:r>
+    </w:p>
+    <w:p xmlns:wp14="http://schemas.microsoft.com/office/word/2010/wordml" wp14:textId="77777777">
       <w:pPr>
         <w:pStyle w:val="Normal"/>
         <w:spacing w:before="0" w:afterAutospacing="1"/>
@@ -18,29 +37,10 @@
           <w:sz w:val="20"/>
           <w:szCs w:val="20"/>
         </w:rPr>
-        <w:t>Przypadek użycia: Opłacenie składki</w:t>
-      </w:r>
-    </w:p>
-    <w:p>
-      <w:pPr>
-        <w:pStyle w:val="Normal"/>
-        <w:spacing w:before="0" w:afterAutospacing="1"/>
-        <w:rPr>
-          <w:sz w:val="20"/>
-          <w:szCs w:val="20"/>
-        </w:rPr>
-      </w:pPr>
-      <w:r>
-        <w:rPr>
-          <w:b/>
-          <w:bCs/>
-          <w:sz w:val="20"/>
-          <w:szCs w:val="20"/>
-        </w:rPr>
         <w:t>1. Aktorzy:</w:t>
       </w:r>
     </w:p>
-    <w:p>
+    <w:p xmlns:wp14="http://schemas.microsoft.com/office/word/2010/wordml" wp14:textId="77777777">
       <w:pPr>
         <w:pStyle w:val="Normal"/>
         <w:numPr>
@@ -61,7 +61,7 @@
         <w:t xml:space="preserve">Rodzic/Opiekun </w:t>
       </w:r>
     </w:p>
-    <w:p>
+    <w:p xmlns:wp14="http://schemas.microsoft.com/office/word/2010/wordml" wp14:textId="77777777">
       <w:pPr>
         <w:pStyle w:val="Normal"/>
         <w:spacing w:before="0" w:afterAutospacing="1"/>
@@ -80,7 +80,7 @@
         <w:t>2. Scenariusz podstawowy:</w:t>
       </w:r>
     </w:p>
-    <w:p>
+    <w:p xmlns:wp14="http://schemas.microsoft.com/office/word/2010/wordml" wp14:textId="77777777">
       <w:pPr>
         <w:pStyle w:val="Normal"/>
         <w:numPr>
@@ -101,7 +101,7 @@
         <w:t xml:space="preserve">System wymaga uwierzytelnienia użytkownika (przypadek użycia: Logowanie). </w:t>
       </w:r>
     </w:p>
-    <w:p>
+    <w:p xmlns:wp14="http://schemas.microsoft.com/office/word/2010/wordml" wp14:textId="77777777">
       <w:pPr>
         <w:pStyle w:val="Normal"/>
         <w:numPr>
@@ -122,7 +122,7 @@
         <w:t xml:space="preserve">System prezentuje panel płatności zawierający informacje o zaległościach. </w:t>
       </w:r>
     </w:p>
-    <w:p>
+    <w:p xmlns:wp14="http://schemas.microsoft.com/office/word/2010/wordml" wp14:textId="77777777">
       <w:pPr>
         <w:pStyle w:val="Normal"/>
         <w:numPr>
@@ -143,7 +143,7 @@
         <w:t xml:space="preserve">Rodzic/Opiekun wybiera miesiąc, którego dotyczy płatność, oraz metodę jej realizacji. </w:t>
       </w:r>
     </w:p>
-    <w:p>
+    <w:p xmlns:wp14="http://schemas.microsoft.com/office/word/2010/wordml" wp14:textId="77777777">
       <w:pPr>
         <w:pStyle w:val="Normal"/>
         <w:numPr>
@@ -164,7 +164,7 @@
         <w:t xml:space="preserve">Rodzic/Opiekun dokonuje płatność. </w:t>
       </w:r>
     </w:p>
-    <w:p>
+    <w:p xmlns:wp14="http://schemas.microsoft.com/office/word/2010/wordml" wp14:textId="77777777">
       <w:pPr>
         <w:pStyle w:val="Normal"/>
         <w:numPr>
@@ -185,7 +185,7 @@
         <w:t xml:space="preserve">Po pozytywnej weryfikacji system rejestruje wpłatę w systemie finansowym. </w:t>
       </w:r>
     </w:p>
-    <w:p>
+    <w:p xmlns:wp14="http://schemas.microsoft.com/office/word/2010/wordml" wp14:textId="77777777">
       <w:pPr>
         <w:pStyle w:val="Normal"/>
         <w:numPr>
@@ -206,7 +206,7 @@
         <w:t xml:space="preserve">System informuje użytkownika o wyniku operacji. </w:t>
       </w:r>
     </w:p>
-    <w:p>
+    <w:p xmlns:wp14="http://schemas.microsoft.com/office/word/2010/wordml" wp14:textId="77777777">
       <w:pPr>
         <w:pStyle w:val="Normal"/>
         <w:spacing w:before="0" w:afterAutospacing="1"/>
@@ -230,10 +230,16 @@
           <w:szCs w:val="20"/>
         </w:rPr>
         <w:br/>
+      </w:r>
+      <w:r>
+        <w:rPr>
+          <w:sz w:val="20"/>
+          <w:szCs w:val="20"/>
+        </w:rPr>
         <w:t>a) Odrzucenie transakcji:</w:t>
       </w:r>
     </w:p>
-    <w:p>
+    <w:p xmlns:wp14="http://schemas.microsoft.com/office/word/2010/wordml" wp14:textId="77777777">
       <w:pPr>
         <w:pStyle w:val="Normal"/>
         <w:numPr>
@@ -254,7 +260,7 @@
         <w:t xml:space="preserve">System wyświetla komunikat o błędzie. </w:t>
       </w:r>
     </w:p>
-    <w:p>
+    <w:p xmlns:wp14="http://schemas.microsoft.com/office/word/2010/wordml" wp14:textId="77777777">
       <w:pPr>
         <w:pStyle w:val="Normal"/>
         <w:numPr>
@@ -275,7 +281,7 @@
         <w:t xml:space="preserve">Status składki pozostaje „nieopłacona”. </w:t>
       </w:r>
     </w:p>
-    <w:p>
+    <w:p xmlns:wp14="http://schemas.microsoft.com/office/word/2010/wordml" wp14:textId="77777777">
       <w:pPr>
         <w:pStyle w:val="Normal"/>
         <w:spacing w:before="0" w:afterAutospacing="1"/>
@@ -292,7 +298,7 @@
         <w:t>b) Rezygnacja użytkownika:</w:t>
       </w:r>
     </w:p>
-    <w:p>
+    <w:p xmlns:wp14="http://schemas.microsoft.com/office/word/2010/wordml" wp14:textId="77777777">
       <w:pPr>
         <w:pStyle w:val="Normal"/>
         <w:numPr>
@@ -313,7 +319,7 @@
         <w:t xml:space="preserve">Rodzic/Opiekun wybiera opcję „Anuluj”. </w:t>
       </w:r>
     </w:p>
-    <w:p>
+    <w:p xmlns:wp14="http://schemas.microsoft.com/office/word/2010/wordml" wp14:textId="77777777">
       <w:pPr>
         <w:pStyle w:val="Normal"/>
         <w:numPr>
@@ -334,7 +340,7 @@
         <w:t xml:space="preserve">System przerywa proces i przywraca stan sprzed rozpoczęcia operacji. </w:t>
       </w:r>
     </w:p>
-    <w:p>
+    <w:p xmlns:wp14="http://schemas.microsoft.com/office/word/2010/wordml" wp14:textId="77777777">
       <w:pPr>
         <w:pStyle w:val="Normal"/>
         <w:spacing w:before="0" w:afterAutospacing="1"/>
@@ -353,7 +359,7 @@
         <w:t>4. Uwarunkowania czasowe:</w:t>
       </w:r>
     </w:p>
-    <w:p>
+    <w:p xmlns:wp14="http://schemas.microsoft.com/office/word/2010/wordml" wp14:textId="77777777">
       <w:pPr>
         <w:pStyle w:val="Normal"/>
         <w:numPr>
@@ -374,7 +380,7 @@
         <w:t xml:space="preserve">Częstotliwość: średnio raz w miesiącu dla każdego dziecka. </w:t>
       </w:r>
     </w:p>
-    <w:p>
+    <w:p xmlns:wp14="http://schemas.microsoft.com/office/word/2010/wordml" wp14:textId="77777777">
       <w:pPr>
         <w:pStyle w:val="Normal"/>
         <w:numPr>
@@ -395,7 +401,7 @@
         <w:t xml:space="preserve">Okresy wzmożonego użycia: początek miesiąca (terminy płatności). </w:t>
       </w:r>
     </w:p>
-    <w:p>
+    <w:p xmlns:wp14="http://schemas.microsoft.com/office/word/2010/wordml" wp14:textId="77777777">
       <w:pPr>
         <w:pStyle w:val="Normal"/>
         <w:numPr>
@@ -416,7 +422,7 @@
         <w:t xml:space="preserve">Średni czas realizacji: ok. 2 minuty. </w:t>
       </w:r>
     </w:p>
-    <w:p>
+    <w:p xmlns:wp14="http://schemas.microsoft.com/office/word/2010/wordml" wp14:textId="77777777">
       <w:pPr>
         <w:pStyle w:val="Normal"/>
         <w:numPr>
@@ -437,7 +443,7 @@
         <w:t xml:space="preserve">Maksymalny czas realizacji: zależny od czasu autoryzacji w systemie bankowym. </w:t>
       </w:r>
     </w:p>
-    <w:p>
+    <w:p xmlns:wp14="http://schemas.microsoft.com/office/word/2010/wordml" wp14:textId="77777777">
       <w:pPr>
         <w:pStyle w:val="Normal"/>
         <w:spacing w:before="0" w:afterAutospacing="1"/>
@@ -456,7 +462,7 @@
         <w:t>5. Rezultaty dla aktora:</w:t>
       </w:r>
     </w:p>
-    <w:p>
+    <w:p xmlns:wp14="http://schemas.microsoft.com/office/word/2010/wordml" wp14:textId="77777777">
       <w:pPr>
         <w:pStyle w:val="Normal"/>
         <w:numPr>
@@ -477,7 +483,7 @@
         <w:t xml:space="preserve">Informacja o powodzeniu lub niepowodzeniu operacji. </w:t>
       </w:r>
     </w:p>
-    <w:p>
+    <w:p xmlns:wp14="http://schemas.microsoft.com/office/word/2010/wordml" wp14:textId="77777777">
       <w:pPr>
         <w:pStyle w:val="Normal"/>
         <w:numPr>
@@ -498,7 +504,7 @@
         <w:t>Zmiana statusu składek na opłacone.</w:t>
       </w:r>
     </w:p>
-    <w:p>
+    <w:p xmlns:wp14="http://schemas.microsoft.com/office/word/2010/wordml" wp14:textId="77777777">
       <w:pPr>
         <w:pStyle w:val="Normal"/>
         <w:rPr/>
@@ -507,7 +513,7 @@
         <w:rPr/>
       </w:r>
     </w:p>
-    <w:p>
+    <w:p xmlns:wp14="http://schemas.microsoft.com/office/word/2010/wordml" wp14:textId="77777777">
       <w:pPr>
         <w:pStyle w:val="Normal"/>
         <w:rPr/>
@@ -516,7 +522,7 @@
         <w:rPr/>
       </w:r>
     </w:p>
-    <w:p>
+    <w:p xmlns:wp14="http://schemas.microsoft.com/office/word/2010/wordml" wp14:textId="77777777">
       <w:pPr>
         <w:pStyle w:val="Normal"/>
         <w:rPr/>
@@ -525,7 +531,7 @@
         <w:rPr/>
       </w:r>
     </w:p>
-    <w:p>
+    <w:p xmlns:wp14="http://schemas.microsoft.com/office/word/2010/wordml" wp14:textId="77777777">
       <w:pPr>
         <w:pStyle w:val="Normal"/>
         <w:rPr/>
@@ -534,7 +540,7 @@
         <w:rPr/>
       </w:r>
     </w:p>
-    <w:p>
+    <w:p xmlns:wp14="http://schemas.microsoft.com/office/word/2010/wordml" wp14:textId="77777777">
       <w:pPr>
         <w:pStyle w:val="Normal"/>
         <w:rPr/>
@@ -543,7 +549,7 @@
         <w:rPr/>
       </w:r>
     </w:p>
-    <w:p>
+    <w:p xmlns:wp14="http://schemas.microsoft.com/office/word/2010/wordml" wp14:textId="77777777">
       <w:pPr>
         <w:pStyle w:val="Normal"/>
         <w:rPr/>
@@ -552,7 +558,7 @@
         <w:rPr/>
       </w:r>
     </w:p>
-    <w:p>
+    <w:p xmlns:wp14="http://schemas.microsoft.com/office/word/2010/wordml" wp14:textId="77777777">
       <w:pPr>
         <w:pStyle w:val="Normal"/>
         <w:rPr/>
@@ -561,10 +567,10 @@
         <w:rPr/>
       </w:r>
     </w:p>
-    <w:p>
+    <w:p xmlns:wp14="http://schemas.microsoft.com/office/word/2010/wordml" wp14:textId="03042AC1">
       <w:pPr>
         <w:pStyle w:val="BodyText"/>
-        <w:spacing w:lineRule="auto" w:line="278" w:before="0" w:after="160"/>
+        <w:spacing w:before="0" w:after="160" w:line="278" w:lineRule="auto"/>
         <w:rPr>
           <w:rStyle w:val="Strong"/>
           <w:sz w:val="20"/>
@@ -577,13 +583,13 @@
           <w:sz w:val="20"/>
           <w:szCs w:val="20"/>
         </w:rPr>
-        <w:t>Opis przypadku użycia: „Powołanie zawodnika”</w:t>
-      </w:r>
-    </w:p>
-    <w:p>
+        <w:t>Opis przypadku użycia: “Powołanie zawodnika”</w:t>
+      </w:r>
+    </w:p>
+    <w:p xmlns:wp14="http://schemas.microsoft.com/office/word/2010/wordml" wp14:textId="77777777">
       <w:pPr>
         <w:pStyle w:val="BodyText"/>
-        <w:spacing w:lineRule="auto" w:line="278" w:before="0" w:after="160"/>
+        <w:spacing w:before="0" w:after="160" w:line="278" w:lineRule="auto"/>
         <w:rPr>
           <w:rStyle w:val="Strong"/>
           <w:sz w:val="20"/>
@@ -599,7 +605,7 @@
         <w:t>1. Aktorzy</w:t>
       </w:r>
     </w:p>
-    <w:p>
+    <w:p xmlns:wp14="http://schemas.microsoft.com/office/word/2010/wordml" wp14:textId="77777777">
       <w:pPr>
         <w:pStyle w:val="BodyText"/>
         <w:numPr>
@@ -608,9 +614,9 @@
         </w:numPr>
         <w:tabs>
           <w:tab w:val="clear" w:pos="708"/>
-          <w:tab w:val="left" w:pos="0" w:leader="none"/>
-        </w:tabs>
-        <w:spacing w:lineRule="auto" w:line="278"/>
+          <w:tab w:val="left" w:leader="none" w:pos="0"/>
+        </w:tabs>
+        <w:spacing w:line="278" w:lineRule="auto"/>
         <w:rPr>
           <w:sz w:val="20"/>
           <w:szCs w:val="20"/>
@@ -624,10 +630,10 @@
         <w:t xml:space="preserve">Trener </w:t>
       </w:r>
     </w:p>
-    <w:p>
+    <w:p xmlns:wp14="http://schemas.microsoft.com/office/word/2010/wordml" wp14:textId="77777777">
       <w:pPr>
         <w:pStyle w:val="BodyText"/>
-        <w:spacing w:lineRule="auto" w:line="278" w:before="0" w:after="160"/>
+        <w:spacing w:before="0" w:after="160" w:line="278" w:lineRule="auto"/>
         <w:rPr>
           <w:rStyle w:val="Strong"/>
           <w:sz w:val="20"/>
@@ -643,7 +649,7 @@
         <w:t>2. Główny przebieg zdarzeń</w:t>
       </w:r>
     </w:p>
-    <w:p>
+    <w:p xmlns:wp14="http://schemas.microsoft.com/office/word/2010/wordml" wp14:textId="77777777">
       <w:pPr>
         <w:pStyle w:val="BodyText"/>
         <w:numPr>
@@ -652,9 +658,9 @@
         </w:numPr>
         <w:tabs>
           <w:tab w:val="clear" w:pos="708"/>
-          <w:tab w:val="left" w:pos="0" w:leader="none"/>
-        </w:tabs>
-        <w:spacing w:lineRule="auto" w:line="278"/>
+          <w:tab w:val="left" w:leader="none" w:pos="0"/>
+        </w:tabs>
+        <w:spacing w:line="278" w:lineRule="auto"/>
         <w:rPr>
           <w:sz w:val="20"/>
           <w:szCs w:val="20"/>
@@ -668,7 +674,7 @@
         <w:t xml:space="preserve">Trener loguje się do systemu (przypadek użycia: Logowanie), a następnie wybiera z kalendarza konkretny mecz. </w:t>
       </w:r>
     </w:p>
-    <w:p>
+    <w:p xmlns:wp14="http://schemas.microsoft.com/office/word/2010/wordml" wp14:textId="77777777">
       <w:pPr>
         <w:pStyle w:val="BodyText"/>
         <w:numPr>
@@ -677,9 +683,9 @@
         </w:numPr>
         <w:tabs>
           <w:tab w:val="clear" w:pos="708"/>
-          <w:tab w:val="left" w:pos="0" w:leader="none"/>
-        </w:tabs>
-        <w:spacing w:lineRule="auto" w:line="278"/>
+          <w:tab w:val="left" w:leader="none" w:pos="0"/>
+        </w:tabs>
+        <w:spacing w:line="278" w:lineRule="auto"/>
         <w:rPr>
           <w:sz w:val="20"/>
           <w:szCs w:val="20"/>
@@ -693,7 +699,7 @@
         <w:t xml:space="preserve">System wyświetla listę zawodników przypisanych do jego drużyny. </w:t>
       </w:r>
     </w:p>
-    <w:p>
+    <w:p xmlns:wp14="http://schemas.microsoft.com/office/word/2010/wordml" wp14:textId="77777777">
       <w:pPr>
         <w:pStyle w:val="BodyText"/>
         <w:numPr>
@@ -702,9 +708,9 @@
         </w:numPr>
         <w:tabs>
           <w:tab w:val="clear" w:pos="708"/>
-          <w:tab w:val="left" w:pos="0" w:leader="none"/>
-        </w:tabs>
-        <w:spacing w:lineRule="auto" w:line="278"/>
+          <w:tab w:val="left" w:leader="none" w:pos="0"/>
+        </w:tabs>
+        <w:spacing w:line="278" w:lineRule="auto"/>
         <w:rPr>
           <w:sz w:val="20"/>
           <w:szCs w:val="20"/>
@@ -718,7 +724,7 @@
         <w:t xml:space="preserve">Trener zaznacza zawodników, których chce powołać na mecz. </w:t>
       </w:r>
     </w:p>
-    <w:p>
+    <w:p xmlns:wp14="http://schemas.microsoft.com/office/word/2010/wordml" wp14:textId="77777777">
       <w:pPr>
         <w:pStyle w:val="BodyText"/>
         <w:numPr>
@@ -727,9 +733,9 @@
         </w:numPr>
         <w:tabs>
           <w:tab w:val="clear" w:pos="708"/>
-          <w:tab w:val="left" w:pos="0" w:leader="none"/>
-        </w:tabs>
-        <w:spacing w:lineRule="auto" w:line="278"/>
+          <w:tab w:val="left" w:leader="none" w:pos="0"/>
+        </w:tabs>
+        <w:spacing w:line="278" w:lineRule="auto"/>
         <w:rPr>
           <w:sz w:val="20"/>
           <w:szCs w:val="20"/>
@@ -743,7 +749,7 @@
         <w:t xml:space="preserve">Po pozytywnej walidacji system zapisuje skład w bazie danych. </w:t>
       </w:r>
     </w:p>
-    <w:p>
+    <w:p xmlns:wp14="http://schemas.microsoft.com/office/word/2010/wordml" wp14:textId="77777777">
       <w:pPr>
         <w:pStyle w:val="BodyText"/>
         <w:numPr>
@@ -752,9 +758,9 @@
         </w:numPr>
         <w:tabs>
           <w:tab w:val="clear" w:pos="708"/>
-          <w:tab w:val="left" w:pos="0" w:leader="none"/>
-        </w:tabs>
-        <w:spacing w:lineRule="auto" w:line="278"/>
+          <w:tab w:val="left" w:leader="none" w:pos="0"/>
+        </w:tabs>
+        <w:spacing w:line="278" w:lineRule="auto"/>
         <w:rPr>
           <w:sz w:val="20"/>
           <w:szCs w:val="20"/>
@@ -768,7 +774,7 @@
         <w:t>System wyświetla komunikat potwierdzający poprawne zapisanie powołań.</w:t>
       </w:r>
     </w:p>
-    <w:p>
+    <w:p xmlns:wp14="http://schemas.microsoft.com/office/word/2010/wordml" wp14:textId="77777777">
       <w:pPr>
         <w:pStyle w:val="BodyText"/>
         <w:numPr>
@@ -777,9 +783,9 @@
         </w:numPr>
         <w:tabs>
           <w:tab w:val="clear" w:pos="708"/>
-          <w:tab w:val="left" w:pos="0" w:leader="none"/>
-        </w:tabs>
-        <w:spacing w:lineRule="auto" w:line="278"/>
+          <w:tab w:val="left" w:leader="none" w:pos="0"/>
+        </w:tabs>
+        <w:spacing w:line="278" w:lineRule="auto"/>
         <w:rPr>
           <w:sz w:val="20"/>
           <w:szCs w:val="20"/>
@@ -793,10 +799,10 @@
         <w:t>System wysyła informację o powołaniu na mecz do rodziców</w:t>
       </w:r>
     </w:p>
-    <w:p>
+    <w:p xmlns:wp14="http://schemas.microsoft.com/office/word/2010/wordml" wp14:textId="77777777">
       <w:pPr>
         <w:pStyle w:val="BodyText"/>
-        <w:spacing w:lineRule="auto" w:line="278" w:before="0" w:after="160"/>
+        <w:spacing w:before="0" w:after="160" w:line="278" w:lineRule="auto"/>
         <w:rPr>
           <w:sz w:val="20"/>
           <w:szCs w:val="20"/>
@@ -822,7 +828,7 @@
         <w:t>a) Zawodnik nie posiada aktualnych badań lekarskich</w:t>
       </w:r>
     </w:p>
-    <w:p>
+    <w:p xmlns:wp14="http://schemas.microsoft.com/office/word/2010/wordml" wp14:textId="77777777">
       <w:pPr>
         <w:pStyle w:val="BodyText"/>
         <w:numPr>
@@ -831,9 +837,9 @@
         </w:numPr>
         <w:tabs>
           <w:tab w:val="clear" w:pos="708"/>
-          <w:tab w:val="left" w:pos="0" w:leader="none"/>
-        </w:tabs>
-        <w:spacing w:lineRule="auto" w:line="278"/>
+          <w:tab w:val="left" w:leader="none" w:pos="0"/>
+        </w:tabs>
+        <w:spacing w:line="278" w:lineRule="auto"/>
         <w:rPr>
           <w:sz w:val="20"/>
           <w:szCs w:val="20"/>
@@ -847,10 +853,10 @@
         <w:t xml:space="preserve">System uniemożliwia jego wybór (pole jest nieaktywne) oraz wyświetla informację o braku ważnych badań. </w:t>
       </w:r>
     </w:p>
-    <w:p>
+    <w:p xmlns:wp14="http://schemas.microsoft.com/office/word/2010/wordml" wp14:textId="77777777">
       <w:pPr>
         <w:pStyle w:val="BodyText"/>
-        <w:spacing w:lineRule="auto" w:line="278" w:before="0" w:after="160"/>
+        <w:spacing w:before="0" w:after="160" w:line="278" w:lineRule="auto"/>
         <w:rPr>
           <w:sz w:val="20"/>
           <w:szCs w:val="20"/>
@@ -864,7 +870,7 @@
         <w:t>b) Rezygnacja trenera</w:t>
       </w:r>
     </w:p>
-    <w:p>
+    <w:p xmlns:wp14="http://schemas.microsoft.com/office/word/2010/wordml" wp14:textId="77777777">
       <w:pPr>
         <w:pStyle w:val="BodyText"/>
         <w:numPr>
@@ -873,9 +879,9 @@
         </w:numPr>
         <w:tabs>
           <w:tab w:val="clear" w:pos="708"/>
-          <w:tab w:val="left" w:pos="0" w:leader="none"/>
-        </w:tabs>
-        <w:spacing w:lineRule="auto" w:line="278"/>
+          <w:tab w:val="left" w:leader="none" w:pos="0"/>
+        </w:tabs>
+        <w:spacing w:line="278" w:lineRule="auto"/>
         <w:rPr>
           <w:sz w:val="20"/>
           <w:szCs w:val="20"/>
@@ -889,7 +895,7 @@
         <w:t xml:space="preserve">Trener wybiera opcję „Anuluj”. </w:t>
       </w:r>
     </w:p>
-    <w:p>
+    <w:p xmlns:wp14="http://schemas.microsoft.com/office/word/2010/wordml" wp14:textId="77777777">
       <w:pPr>
         <w:pStyle w:val="BodyText"/>
         <w:numPr>
@@ -898,9 +904,9 @@
         </w:numPr>
         <w:tabs>
           <w:tab w:val="clear" w:pos="708"/>
-          <w:tab w:val="left" w:pos="0" w:leader="none"/>
-        </w:tabs>
-        <w:spacing w:lineRule="auto" w:line="278"/>
+          <w:tab w:val="left" w:leader="none" w:pos="0"/>
+        </w:tabs>
+        <w:spacing w:line="278" w:lineRule="auto"/>
         <w:rPr>
           <w:sz w:val="20"/>
           <w:szCs w:val="20"/>
@@ -914,10 +920,10 @@
         <w:t xml:space="preserve">System zamyka okno bez zapisywania zmian. </w:t>
       </w:r>
     </w:p>
-    <w:p>
+    <w:p xmlns:wp14="http://schemas.microsoft.com/office/word/2010/wordml" wp14:textId="77777777">
       <w:pPr>
         <w:pStyle w:val="BodyText"/>
-        <w:spacing w:lineRule="auto" w:line="278" w:before="0" w:after="160"/>
+        <w:spacing w:before="0" w:after="160" w:line="278" w:lineRule="auto"/>
         <w:rPr>
           <w:rStyle w:val="Strong"/>
           <w:sz w:val="20"/>
@@ -933,7 +939,7 @@
         <w:t>4. Ograniczenia czasowe i wydajnościowe</w:t>
       </w:r>
     </w:p>
-    <w:p>
+    <w:p xmlns:wp14="http://schemas.microsoft.com/office/word/2010/wordml" wp14:textId="77777777">
       <w:pPr>
         <w:pStyle w:val="BodyText"/>
         <w:numPr>
@@ -942,9 +948,9 @@
         </w:numPr>
         <w:tabs>
           <w:tab w:val="clear" w:pos="708"/>
-          <w:tab w:val="left" w:pos="0" w:leader="none"/>
-        </w:tabs>
-        <w:spacing w:lineRule="auto" w:line="278"/>
+          <w:tab w:val="left" w:leader="none" w:pos="0"/>
+        </w:tabs>
+        <w:spacing w:line="278" w:lineRule="auto"/>
         <w:rPr>
           <w:sz w:val="20"/>
           <w:szCs w:val="20"/>
@@ -958,7 +964,7 @@
         <w:t xml:space="preserve">Częstotliwość: średnio 1–2 razy w tygodniu dla każdej drużyny. </w:t>
       </w:r>
     </w:p>
-    <w:p>
+    <w:p xmlns:wp14="http://schemas.microsoft.com/office/word/2010/wordml" wp14:textId="77777777">
       <w:pPr>
         <w:pStyle w:val="BodyText"/>
         <w:numPr>
@@ -967,9 +973,9 @@
         </w:numPr>
         <w:tabs>
           <w:tab w:val="clear" w:pos="708"/>
-          <w:tab w:val="left" w:pos="0" w:leader="none"/>
-        </w:tabs>
-        <w:spacing w:lineRule="auto" w:line="278"/>
+          <w:tab w:val="left" w:leader="none" w:pos="0"/>
+        </w:tabs>
+        <w:spacing w:line="278" w:lineRule="auto"/>
         <w:rPr>
           <w:sz w:val="20"/>
           <w:szCs w:val="20"/>
@@ -983,7 +989,7 @@
         <w:t xml:space="preserve">Okresy zwiększonego obciążenia: czwartki i piątki (przed meczami weekendowymi). </w:t>
       </w:r>
     </w:p>
-    <w:p>
+    <w:p xmlns:wp14="http://schemas.microsoft.com/office/word/2010/wordml" wp14:textId="77777777">
       <w:pPr>
         <w:pStyle w:val="BodyText"/>
         <w:numPr>
@@ -992,9 +998,9 @@
         </w:numPr>
         <w:tabs>
           <w:tab w:val="clear" w:pos="708"/>
-          <w:tab w:val="left" w:pos="0" w:leader="none"/>
-        </w:tabs>
-        <w:spacing w:lineRule="auto" w:line="278"/>
+          <w:tab w:val="left" w:leader="none" w:pos="0"/>
+        </w:tabs>
+        <w:spacing w:line="278" w:lineRule="auto"/>
         <w:rPr>
           <w:sz w:val="20"/>
           <w:szCs w:val="20"/>
@@ -1008,7 +1014,7 @@
         <w:t xml:space="preserve">Typowy czas realizacji: około 3 minuty. </w:t>
       </w:r>
     </w:p>
-    <w:p>
+    <w:p xmlns:wp14="http://schemas.microsoft.com/office/word/2010/wordml" wp14:textId="77777777">
       <w:pPr>
         <w:pStyle w:val="BodyText"/>
         <w:numPr>
@@ -1017,9 +1023,9 @@
         </w:numPr>
         <w:tabs>
           <w:tab w:val="clear" w:pos="708"/>
-          <w:tab w:val="left" w:pos="0" w:leader="none"/>
-        </w:tabs>
-        <w:spacing w:lineRule="auto" w:line="278"/>
+          <w:tab w:val="left" w:leader="none" w:pos="0"/>
+        </w:tabs>
+        <w:spacing w:line="278" w:lineRule="auto"/>
         <w:rPr>
           <w:sz w:val="20"/>
           <w:szCs w:val="20"/>
@@ -1033,10 +1039,10 @@
         <w:t xml:space="preserve">Maksymalny czas realizacji: nieokreślony. </w:t>
       </w:r>
     </w:p>
-    <w:p>
+    <w:p xmlns:wp14="http://schemas.microsoft.com/office/word/2010/wordml" wp14:textId="77777777">
       <w:pPr>
         <w:pStyle w:val="BodyText"/>
-        <w:spacing w:lineRule="auto" w:line="278" w:before="0" w:after="160"/>
+        <w:spacing w:before="0" w:after="160" w:line="278" w:lineRule="auto"/>
         <w:rPr>
           <w:rStyle w:val="Strong"/>
           <w:sz w:val="20"/>
@@ -1052,7 +1058,7 @@
         <w:t>5. Rezultaty dla aktora</w:t>
       </w:r>
     </w:p>
-    <w:p>
+    <w:p xmlns:wp14="http://schemas.microsoft.com/office/word/2010/wordml" wp14:textId="77777777">
       <w:pPr>
         <w:pStyle w:val="BodyText"/>
         <w:numPr>
@@ -1061,9 +1067,9 @@
         </w:numPr>
         <w:tabs>
           <w:tab w:val="clear" w:pos="708"/>
-          <w:tab w:val="left" w:pos="0" w:leader="none"/>
-        </w:tabs>
-        <w:spacing w:lineRule="auto" w:line="278"/>
+          <w:tab w:val="left" w:leader="none" w:pos="0"/>
+        </w:tabs>
+        <w:spacing w:line="278" w:lineRule="auto"/>
         <w:rPr>
           <w:sz w:val="20"/>
           <w:szCs w:val="20"/>
@@ -1077,7 +1083,7 @@
         <w:t xml:space="preserve">Wyświetlenie komunikatu o pomyślnym zapisaniu składu. </w:t>
       </w:r>
     </w:p>
-    <w:p>
+    <w:p xmlns:wp14="http://schemas.microsoft.com/office/word/2010/wordml" wp14:textId="77777777">
       <w:pPr>
         <w:pStyle w:val="BodyText"/>
         <w:numPr>
@@ -1086,9 +1092,9 @@
         </w:numPr>
         <w:tabs>
           <w:tab w:val="clear" w:pos="708"/>
-          <w:tab w:val="left" w:pos="0" w:leader="none"/>
-        </w:tabs>
-        <w:spacing w:lineRule="auto" w:line="278"/>
+          <w:tab w:val="left" w:leader="none" w:pos="0"/>
+        </w:tabs>
+        <w:spacing w:line="278" w:lineRule="auto"/>
         <w:rPr>
           <w:sz w:val="20"/>
           <w:szCs w:val="20"/>
@@ -1102,7 +1108,7 @@
         <w:t xml:space="preserve">Zapisanie kadry na wybrany mecz w systemie. </w:t>
       </w:r>
     </w:p>
-    <w:p>
+    <w:p xmlns:wp14="http://schemas.microsoft.com/office/word/2010/wordml" wp14:textId="77777777">
       <w:pPr>
         <w:pStyle w:val="BodyText"/>
         <w:numPr>
@@ -1111,9 +1117,9 @@
         </w:numPr>
         <w:tabs>
           <w:tab w:val="clear" w:pos="708"/>
-          <w:tab w:val="left" w:pos="0" w:leader="none"/>
-        </w:tabs>
-        <w:spacing w:lineRule="auto" w:line="278"/>
+          <w:tab w:val="left" w:leader="none" w:pos="0"/>
+        </w:tabs>
+        <w:spacing w:line="278" w:lineRule="auto"/>
         <w:rPr>
           <w:sz w:val="20"/>
           <w:szCs w:val="20"/>
@@ -1127,7 +1133,7 @@
         <w:t>Automatyczne wysłanie powiadomień do rodziców powołanych zawodników.</w:t>
       </w:r>
     </w:p>
-    <w:p>
+    <w:p xmlns:wp14="http://schemas.microsoft.com/office/word/2010/wordml" wp14:textId="77777777">
       <w:pPr>
         <w:pStyle w:val="Normal"/>
         <w:rPr>
@@ -1142,7 +1148,7 @@
         </w:rPr>
       </w:r>
     </w:p>
-    <w:p>
+    <w:p xmlns:wp14="http://schemas.microsoft.com/office/word/2010/wordml" wp14:textId="77777777">
       <w:pPr>
         <w:pStyle w:val="Normal"/>
         <w:rPr>
@@ -1157,10 +1163,10 @@
         </w:rPr>
       </w:r>
     </w:p>
-    <w:p>
+    <w:p xmlns:wp14="http://schemas.microsoft.com/office/word/2010/wordml" wp14:textId="77777777">
       <w:pPr>
         <w:pStyle w:val="Normal"/>
-        <w:spacing w:lineRule="auto" w:line="240" w:before="0" w:after="0"/>
+        <w:spacing w:before="0" w:after="0" w:line="240" w:lineRule="auto"/>
         <w:rPr>
           <w:rFonts w:ascii="Aptos" w:hAnsi="Aptos" w:eastAsia="Aptos" w:cs="Aptos"/>
           <w:b/>
@@ -1171,7 +1177,7 @@
       </w:pPr>
       <w:r>
         <w:rPr>
-          <w:rFonts w:eastAsia="Aptos" w:cs="Aptos" w:ascii="Aptos" w:hAnsi="Aptos"/>
+          <w:rFonts w:ascii="Aptos" w:hAnsi="Aptos" w:eastAsia="Aptos" w:cs="Aptos"/>
           <w:b/>
           <w:bCs/>
           <w:sz w:val="20"/>
@@ -1182,12 +1188,35 @@
         <w:br w:type="page"/>
       </w:r>
     </w:p>
-    <w:p>
+    <w:p xmlns:wp14="http://schemas.microsoft.com/office/word/2010/wordml" wp14:textId="365620C1">
       <w:pPr>
         <w:pStyle w:val="Normal"/>
         <w:spacing w:before="0" w:after="240"/>
         <w:rPr>
           <w:rFonts w:ascii="Aptos" w:hAnsi="Aptos" w:eastAsia="Aptos" w:cs="Aptos"/>
+          <w:b w:val="1"/>
+          <w:bCs w:val="1"/>
+          <w:sz w:val="20"/>
+          <w:szCs w:val="20"/>
+        </w:rPr>
+      </w:pPr>
+      <w:r>
+        <w:rPr>
+          <w:rFonts w:ascii="Aptos" w:hAnsi="Aptos" w:eastAsia="Aptos" w:cs="Aptos"/>
+          <w:b w:val="1"/>
+          <w:bCs w:val="1"/>
+          <w:sz w:val="20"/>
+          <w:szCs w:val="20"/>
+        </w:rPr>
+        <w:t>Opis przypadku użycia: “Zarządzanie użytkownikami”</w:t>
+      </w:r>
+    </w:p>
+    <w:p xmlns:wp14="http://schemas.microsoft.com/office/word/2010/wordml" wp14:textId="77777777">
+      <w:pPr>
+        <w:pStyle w:val="Normal"/>
+        <w:spacing w:before="240" w:after="240"/>
+        <w:rPr>
+          <w:rFonts w:ascii="Aptos" w:hAnsi="Aptos" w:eastAsia="Aptos" w:cs="Aptos"/>
           <w:b/>
           <w:bCs/>
           <w:sz w:val="20"/>
@@ -1196,39 +1225,16 @@
       </w:pPr>
       <w:r>
         <w:rPr>
-          <w:rFonts w:eastAsia="Aptos" w:cs="Aptos" w:ascii="Aptos" w:hAnsi="Aptos"/>
+          <w:rFonts w:ascii="Aptos" w:hAnsi="Aptos" w:eastAsia="Aptos" w:cs="Aptos"/>
           <w:b/>
           <w:bCs/>
           <w:sz w:val="20"/>
           <w:szCs w:val="20"/>
         </w:rPr>
-        <w:t>Opis przypadku użycia: „Edycja danych użytkownika"</w:t>
-      </w:r>
-    </w:p>
-    <w:p>
-      <w:pPr>
-        <w:pStyle w:val="Normal"/>
-        <w:spacing w:before="240" w:after="240"/>
-        <w:rPr>
-          <w:rFonts w:ascii="Aptos" w:hAnsi="Aptos" w:eastAsia="Aptos" w:cs="Aptos"/>
-          <w:b/>
-          <w:bCs/>
-          <w:sz w:val="20"/>
-          <w:szCs w:val="20"/>
-        </w:rPr>
-      </w:pPr>
-      <w:r>
-        <w:rPr>
-          <w:rFonts w:eastAsia="Aptos" w:cs="Aptos" w:ascii="Aptos" w:hAnsi="Aptos"/>
-          <w:b/>
-          <w:bCs/>
-          <w:sz w:val="20"/>
-          <w:szCs w:val="20"/>
-        </w:rPr>
         <w:t>1. Uczestniczący aktorzy</w:t>
       </w:r>
     </w:p>
-    <w:p>
+    <w:p xmlns:wp14="http://schemas.microsoft.com/office/word/2010/wordml" wp14:textId="77777777">
       <w:pPr>
         <w:pStyle w:val="ListParagraph"/>
         <w:numPr>
@@ -1245,14 +1251,14 @@
       </w:pPr>
       <w:r>
         <w:rPr>
-          <w:rFonts w:eastAsia="Aptos" w:cs="Aptos" w:ascii="Aptos" w:hAnsi="Aptos"/>
+          <w:rFonts w:ascii="Aptos" w:hAnsi="Aptos" w:eastAsia="Aptos" w:cs="Aptos"/>
           <w:sz w:val="20"/>
           <w:szCs w:val="20"/>
         </w:rPr>
         <w:t>Zarząd</w:t>
       </w:r>
     </w:p>
-    <w:p>
+    <w:p xmlns:wp14="http://schemas.microsoft.com/office/word/2010/wordml" wp14:textId="77777777">
       <w:pPr>
         <w:pStyle w:val="Normal"/>
         <w:spacing w:before="240" w:after="240"/>
@@ -1266,7 +1272,7 @@
       </w:pPr>
       <w:r>
         <w:rPr>
-          <w:rFonts w:eastAsia="Aptos" w:cs="Aptos" w:ascii="Aptos" w:hAnsi="Aptos"/>
+          <w:rFonts w:ascii="Aptos" w:hAnsi="Aptos" w:eastAsia="Aptos" w:cs="Aptos"/>
           <w:b/>
           <w:bCs/>
           <w:sz w:val="20"/>
@@ -1275,7 +1281,7 @@
         <w:t>2. Podstawowy ciąg zdarzeń</w:t>
       </w:r>
     </w:p>
-    <w:p>
+    <w:p xmlns:wp14="http://schemas.microsoft.com/office/word/2010/wordml" wp14:textId="77777777">
       <w:pPr>
         <w:pStyle w:val="ListParagraph"/>
         <w:numPr>
@@ -1292,14 +1298,14 @@
       </w:pPr>
       <w:r>
         <w:rPr>
-          <w:rFonts w:eastAsia="Aptos" w:cs="Aptos" w:ascii="Aptos" w:hAnsi="Aptos"/>
+          <w:rFonts w:ascii="Aptos" w:hAnsi="Aptos" w:eastAsia="Aptos" w:cs="Aptos"/>
           <w:sz w:val="20"/>
           <w:szCs w:val="20"/>
         </w:rPr>
         <w:t>Zarząd loguje się do systemu (przypadek użycia: Logowanie),</w:t>
       </w:r>
     </w:p>
-    <w:p>
+    <w:p xmlns:wp14="http://schemas.microsoft.com/office/word/2010/wordml" wp14:textId="77777777">
       <w:pPr>
         <w:pStyle w:val="ListParagraph"/>
         <w:numPr>
@@ -1316,14 +1322,14 @@
       </w:pPr>
       <w:r>
         <w:rPr>
-          <w:rFonts w:eastAsia="Aptos" w:cs="Aptos" w:ascii="Aptos" w:hAnsi="Aptos"/>
+          <w:rFonts w:ascii="Aptos" w:hAnsi="Aptos" w:eastAsia="Aptos" w:cs="Aptos"/>
           <w:sz w:val="20"/>
           <w:szCs w:val="20"/>
         </w:rPr>
         <w:t>Zarząd wchodzi w zakładkę do zarządzania użytkownikami,</w:t>
       </w:r>
     </w:p>
-    <w:p>
+    <w:p xmlns:wp14="http://schemas.microsoft.com/office/word/2010/wordml" wp14:textId="77777777">
       <w:pPr>
         <w:pStyle w:val="ListParagraph"/>
         <w:numPr>
@@ -1340,14 +1346,14 @@
       </w:pPr>
       <w:r>
         <w:rPr>
-          <w:rFonts w:eastAsia="Aptos" w:cs="Aptos" w:ascii="Aptos" w:hAnsi="Aptos"/>
+          <w:rFonts w:ascii="Aptos" w:hAnsi="Aptos" w:eastAsia="Aptos" w:cs="Aptos"/>
           <w:sz w:val="20"/>
           <w:szCs w:val="20"/>
         </w:rPr>
         <w:t>System pokazuje listę wszystkich kont w aplikacji,</w:t>
       </w:r>
     </w:p>
-    <w:p>
+    <w:p xmlns:wp14="http://schemas.microsoft.com/office/word/2010/wordml" wp14:textId="77777777">
       <w:pPr>
         <w:pStyle w:val="ListParagraph"/>
         <w:numPr>
@@ -1364,14 +1370,14 @@
       </w:pPr>
       <w:r>
         <w:rPr>
-          <w:rFonts w:eastAsia="Aptos" w:cs="Aptos" w:ascii="Aptos" w:hAnsi="Aptos"/>
+          <w:rFonts w:ascii="Aptos" w:hAnsi="Aptos" w:eastAsia="Aptos" w:cs="Aptos"/>
           <w:sz w:val="20"/>
           <w:szCs w:val="20"/>
         </w:rPr>
         <w:t>Zarząd wybiera z listy konkretnego użytkownika, żeby edytować jego dane,</w:t>
       </w:r>
     </w:p>
-    <w:p>
+    <w:p xmlns:wp14="http://schemas.microsoft.com/office/word/2010/wordml" wp14:textId="77777777">
       <w:pPr>
         <w:pStyle w:val="ListParagraph"/>
         <w:numPr>
@@ -1388,14 +1394,14 @@
       </w:pPr>
       <w:r>
         <w:rPr>
-          <w:rFonts w:eastAsia="Aptos" w:cs="Aptos" w:ascii="Aptos" w:hAnsi="Aptos"/>
+          <w:rFonts w:ascii="Aptos" w:hAnsi="Aptos" w:eastAsia="Aptos" w:cs="Aptos"/>
           <w:sz w:val="20"/>
           <w:szCs w:val="20"/>
         </w:rPr>
         <w:t>Jeśli edytowany jest trener, Zarząd może mu od razu przydzielić drużynę (przypadek użycia: Przypisywanie trenerów do grup),</w:t>
       </w:r>
     </w:p>
-    <w:p>
+    <w:p xmlns:wp14="http://schemas.microsoft.com/office/word/2010/wordml" wp14:textId="77777777">
       <w:pPr>
         <w:pStyle w:val="ListParagraph"/>
         <w:numPr>
@@ -1412,14 +1418,14 @@
       </w:pPr>
       <w:r>
         <w:rPr>
-          <w:rFonts w:eastAsia="Aptos" w:cs="Aptos" w:ascii="Aptos" w:hAnsi="Aptos"/>
+          <w:rFonts w:ascii="Aptos" w:hAnsi="Aptos" w:eastAsia="Aptos" w:cs="Aptos"/>
           <w:sz w:val="20"/>
           <w:szCs w:val="20"/>
         </w:rPr>
         <w:t>Zarząd klika przycisk „Zapisz",</w:t>
       </w:r>
     </w:p>
-    <w:p>
+    <w:p xmlns:wp14="http://schemas.microsoft.com/office/word/2010/wordml" wp14:textId="77777777">
       <w:pPr>
         <w:pStyle w:val="ListParagraph"/>
         <w:numPr>
@@ -1436,14 +1442,14 @@
       </w:pPr>
       <w:r>
         <w:rPr>
-          <w:rFonts w:eastAsia="Aptos" w:cs="Aptos" w:ascii="Aptos" w:hAnsi="Aptos"/>
+          <w:rFonts w:ascii="Aptos" w:hAnsi="Aptos" w:eastAsia="Aptos" w:cs="Aptos"/>
           <w:sz w:val="20"/>
           <w:szCs w:val="20"/>
         </w:rPr>
         <w:t>System sprawdza, czy wpisane dane są poprawne,</w:t>
       </w:r>
     </w:p>
-    <w:p>
+    <w:p xmlns:wp14="http://schemas.microsoft.com/office/word/2010/wordml" wp14:textId="77777777">
       <w:pPr>
         <w:pStyle w:val="ListParagraph"/>
         <w:numPr>
@@ -1460,14 +1466,14 @@
       </w:pPr>
       <w:r>
         <w:rPr>
-          <w:rFonts w:eastAsia="Aptos" w:cs="Aptos" w:ascii="Aptos" w:hAnsi="Aptos"/>
+          <w:rFonts w:ascii="Aptos" w:hAnsi="Aptos" w:eastAsia="Aptos" w:cs="Aptos"/>
           <w:sz w:val="20"/>
           <w:szCs w:val="20"/>
         </w:rPr>
         <w:t>System aktualizuje informacje w bazie,</w:t>
       </w:r>
     </w:p>
-    <w:p>
+    <w:p xmlns:wp14="http://schemas.microsoft.com/office/word/2010/wordml" wp14:textId="77777777">
       <w:pPr>
         <w:pStyle w:val="ListParagraph"/>
         <w:numPr>
@@ -1484,14 +1490,14 @@
       </w:pPr>
       <w:r>
         <w:rPr>
-          <w:rFonts w:eastAsia="Aptos" w:cs="Aptos" w:ascii="Aptos" w:hAnsi="Aptos"/>
+          <w:rFonts w:ascii="Aptos" w:hAnsi="Aptos" w:eastAsia="Aptos" w:cs="Aptos"/>
           <w:sz w:val="20"/>
           <w:szCs w:val="20"/>
         </w:rPr>
         <w:t>Wyświetla się komunikat, że zmiany zostały zapisane.</w:t>
       </w:r>
     </w:p>
-    <w:p>
+    <w:p xmlns:wp14="http://schemas.microsoft.com/office/word/2010/wordml" wp14:textId="77777777">
       <w:pPr>
         <w:pStyle w:val="Normal"/>
         <w:spacing w:before="240" w:after="240"/>
@@ -1503,7 +1509,7 @@
       </w:pPr>
       <w:r>
         <w:rPr>
-          <w:rFonts w:eastAsia="Aptos" w:cs="Aptos" w:ascii="Aptos" w:hAnsi="Aptos"/>
+          <w:rFonts w:ascii="Aptos" w:hAnsi="Aptos" w:eastAsia="Aptos" w:cs="Aptos"/>
           <w:b/>
           <w:bCs/>
           <w:sz w:val="20"/>
@@ -1513,14 +1519,14 @@
       </w:r>
       <w:r>
         <w:rPr>
-          <w:rFonts w:eastAsia="Aptos" w:cs="Aptos" w:ascii="Aptos" w:hAnsi="Aptos"/>
+          <w:rFonts w:ascii="Aptos" w:hAnsi="Aptos" w:eastAsia="Aptos" w:cs="Aptos"/>
           <w:sz w:val="20"/>
           <w:szCs w:val="20"/>
         </w:rPr>
         <w:t xml:space="preserve"> </w:t>
       </w:r>
     </w:p>
-    <w:p>
+    <w:p xmlns:wp14="http://schemas.microsoft.com/office/word/2010/wordml" wp14:textId="77777777">
       <w:pPr>
         <w:pStyle w:val="Normal"/>
         <w:spacing w:before="240" w:after="240"/>
@@ -1532,14 +1538,14 @@
       </w:pPr>
       <w:r>
         <w:rPr>
-          <w:rFonts w:eastAsia="Aptos" w:cs="Aptos" w:ascii="Aptos" w:hAnsi="Aptos"/>
+          <w:rFonts w:ascii="Aptos" w:hAnsi="Aptos" w:eastAsia="Aptos" w:cs="Aptos"/>
           <w:sz w:val="20"/>
           <w:szCs w:val="20"/>
         </w:rPr>
         <w:t>a) Wpisano błędne dane</w:t>
       </w:r>
     </w:p>
-    <w:p>
+    <w:p xmlns:wp14="http://schemas.microsoft.com/office/word/2010/wordml" wp14:textId="77777777">
       <w:pPr>
         <w:pStyle w:val="ListParagraph"/>
         <w:numPr>
@@ -1556,14 +1562,14 @@
       </w:pPr>
       <w:r>
         <w:rPr>
-          <w:rFonts w:eastAsia="Aptos" w:cs="Aptos" w:ascii="Aptos" w:hAnsi="Aptos"/>
+          <w:rFonts w:ascii="Aptos" w:hAnsi="Aptos" w:eastAsia="Aptos" w:cs="Aptos"/>
           <w:sz w:val="20"/>
           <w:szCs w:val="20"/>
         </w:rPr>
         <w:t>System podświetla błędne pole na czerwono, pokazuje błąd i nie pozwala zapisać formularza.</w:t>
       </w:r>
     </w:p>
-    <w:p>
+    <w:p xmlns:wp14="http://schemas.microsoft.com/office/word/2010/wordml" wp14:textId="77777777">
       <w:pPr>
         <w:pStyle w:val="Normal"/>
         <w:spacing w:before="240" w:after="240"/>
@@ -1575,14 +1581,14 @@
       </w:pPr>
       <w:r>
         <w:rPr>
-          <w:rFonts w:eastAsia="Aptos" w:cs="Aptos" w:ascii="Aptos" w:hAnsi="Aptos"/>
+          <w:rFonts w:ascii="Aptos" w:hAnsi="Aptos" w:eastAsia="Aptos" w:cs="Aptos"/>
           <w:sz w:val="20"/>
           <w:szCs w:val="20"/>
         </w:rPr>
         <w:t>b) Zarząd rezygnuje ze zmian i klika „Anuluj"</w:t>
       </w:r>
     </w:p>
-    <w:p>
+    <w:p xmlns:wp14="http://schemas.microsoft.com/office/word/2010/wordml" wp14:textId="77777777">
       <w:pPr>
         <w:pStyle w:val="ListParagraph"/>
         <w:numPr>
@@ -1599,14 +1605,14 @@
       </w:pPr>
       <w:r>
         <w:rPr>
-          <w:rFonts w:eastAsia="Aptos" w:cs="Aptos" w:ascii="Aptos" w:hAnsi="Aptos"/>
+          <w:rFonts w:ascii="Aptos" w:hAnsi="Aptos" w:eastAsia="Aptos" w:cs="Aptos"/>
           <w:sz w:val="20"/>
           <w:szCs w:val="20"/>
         </w:rPr>
         <w:t>System zamyka okno edycji i wraca do listy użytkowników, nic nie zmieniając.</w:t>
       </w:r>
     </w:p>
-    <w:p>
+    <w:p xmlns:wp14="http://schemas.microsoft.com/office/word/2010/wordml" wp14:textId="77777777">
       <w:pPr>
         <w:pStyle w:val="Normal"/>
         <w:spacing w:before="0" w:after="0"/>
@@ -1618,14 +1624,14 @@
       </w:pPr>
       <w:r>
         <w:rPr>
-          <w:rFonts w:eastAsia="Aptos" w:cs="Aptos" w:ascii="Aptos" w:hAnsi="Aptos"/>
+          <w:rFonts w:ascii="Aptos" w:hAnsi="Aptos" w:eastAsia="Aptos" w:cs="Aptos"/>
           <w:sz w:val="20"/>
           <w:szCs w:val="20"/>
         </w:rPr>
         <w:t>c)Użytkownika nie ma w systemie</w:t>
       </w:r>
     </w:p>
-    <w:p>
+    <w:p xmlns:wp14="http://schemas.microsoft.com/office/word/2010/wordml" wp14:textId="77777777">
       <w:pPr>
         <w:pStyle w:val="Normal"/>
         <w:spacing w:before="0" w:after="0"/>
@@ -1637,13 +1643,13 @@
       </w:pPr>
       <w:r>
         <w:rPr>
-          <w:rFonts w:eastAsia="Aptos" w:cs="Aptos" w:ascii="Aptos" w:hAnsi="Aptos"/>
-          <w:sz w:val="20"/>
-          <w:szCs w:val="20"/>
-        </w:rPr>
-      </w:r>
-    </w:p>
-    <w:p>
+          <w:rFonts w:ascii="Aptos" w:hAnsi="Aptos" w:eastAsia="Aptos" w:cs="Aptos"/>
+          <w:sz w:val="20"/>
+          <w:szCs w:val="20"/>
+        </w:rPr>
+      </w:r>
+    </w:p>
+    <w:p xmlns:wp14="http://schemas.microsoft.com/office/word/2010/wordml" wp14:textId="77777777">
       <w:pPr>
         <w:pStyle w:val="ListParagraph"/>
         <w:numPr>
@@ -1660,14 +1666,14 @@
       </w:pPr>
       <w:r>
         <w:rPr>
-          <w:rFonts w:eastAsia="Aptos" w:cs="Aptos" w:ascii="Aptos" w:hAnsi="Aptos"/>
+          <w:rFonts w:ascii="Aptos" w:hAnsi="Aptos" w:eastAsia="Aptos" w:cs="Aptos"/>
           <w:sz w:val="20"/>
           <w:szCs w:val="20"/>
         </w:rPr>
         <w:t>System wyświetla okno z możliwością dodania użytkownika.</w:t>
       </w:r>
     </w:p>
-    <w:p>
+    <w:p xmlns:wp14="http://schemas.microsoft.com/office/word/2010/wordml" wp14:textId="77777777">
       <w:pPr>
         <w:pStyle w:val="Normal"/>
         <w:spacing w:before="240" w:after="240"/>
@@ -1681,7 +1687,7 @@
       </w:pPr>
       <w:r>
         <w:rPr>
-          <w:rFonts w:eastAsia="Aptos" w:cs="Aptos" w:ascii="Aptos" w:hAnsi="Aptos"/>
+          <w:rFonts w:ascii="Aptos" w:hAnsi="Aptos" w:eastAsia="Aptos" w:cs="Aptos"/>
           <w:b/>
           <w:bCs/>
           <w:sz w:val="20"/>
@@ -1690,7 +1696,7 @@
         <w:t>4. Zależności czasowe</w:t>
       </w:r>
     </w:p>
-    <w:p>
+    <w:p xmlns:wp14="http://schemas.microsoft.com/office/word/2010/wordml" wp14:textId="77777777">
       <w:pPr>
         <w:pStyle w:val="Normal"/>
         <w:spacing w:before="240" w:after="240"/>
@@ -1702,7 +1708,7 @@
       </w:pPr>
       <w:r>
         <w:rPr>
-          <w:rFonts w:eastAsia="Aptos" w:cs="Aptos" w:ascii="Aptos" w:hAnsi="Aptos"/>
+          <w:rFonts w:ascii="Aptos" w:hAnsi="Aptos" w:eastAsia="Aptos" w:cs="Aptos"/>
           <w:sz w:val="20"/>
           <w:szCs w:val="20"/>
         </w:rPr>
@@ -1710,7 +1716,7 @@
       </w:r>
       <w:r>
         <w:rPr>
-          <w:rFonts w:eastAsia="Aptos" w:cs="Aptos" w:ascii="Aptos" w:hAnsi="Aptos"/>
+          <w:rFonts w:ascii="Aptos" w:hAnsi="Aptos" w:eastAsia="Aptos" w:cs="Aptos"/>
           <w:b/>
           <w:bCs/>
           <w:sz w:val="20"/>
@@ -1720,14 +1726,14 @@
       </w:r>
       <w:r>
         <w:rPr>
-          <w:rFonts w:eastAsia="Aptos" w:cs="Aptos" w:ascii="Aptos" w:hAnsi="Aptos"/>
+          <w:rFonts w:ascii="Aptos" w:hAnsi="Aptos" w:eastAsia="Aptos" w:cs="Aptos"/>
           <w:sz w:val="20"/>
           <w:szCs w:val="20"/>
         </w:rPr>
         <w:t xml:space="preserve"> kilka razy w tygodniu</w:t>
       </w:r>
     </w:p>
-    <w:p>
+    <w:p xmlns:wp14="http://schemas.microsoft.com/office/word/2010/wordml" wp14:textId="77777777">
       <w:pPr>
         <w:pStyle w:val="Normal"/>
         <w:spacing w:before="240" w:after="240"/>
@@ -1739,7 +1745,7 @@
       </w:pPr>
       <w:r>
         <w:rPr>
-          <w:rFonts w:eastAsia="Aptos" w:cs="Aptos" w:ascii="Aptos" w:hAnsi="Aptos"/>
+          <w:rFonts w:ascii="Aptos" w:hAnsi="Aptos" w:eastAsia="Aptos" w:cs="Aptos"/>
           <w:sz w:val="20"/>
           <w:szCs w:val="20"/>
         </w:rPr>
@@ -1747,7 +1753,7 @@
       </w:r>
       <w:r>
         <w:rPr>
-          <w:rFonts w:eastAsia="Aptos" w:cs="Aptos" w:ascii="Aptos" w:hAnsi="Aptos"/>
+          <w:rFonts w:ascii="Aptos" w:hAnsi="Aptos" w:eastAsia="Aptos" w:cs="Aptos"/>
           <w:b/>
           <w:bCs/>
           <w:sz w:val="20"/>
@@ -1757,14 +1763,14 @@
       </w:r>
       <w:r>
         <w:rPr>
-          <w:rFonts w:eastAsia="Aptos" w:cs="Aptos" w:ascii="Aptos" w:hAnsi="Aptos"/>
+          <w:rFonts w:ascii="Aptos" w:hAnsi="Aptos" w:eastAsia="Aptos" w:cs="Aptos"/>
           <w:sz w:val="20"/>
           <w:szCs w:val="20"/>
         </w:rPr>
         <w:t xml:space="preserve"> głównie przed startem nowego sezonu, gdy dochodzą nowi ludzie</w:t>
       </w:r>
     </w:p>
-    <w:p>
+    <w:p xmlns:wp14="http://schemas.microsoft.com/office/word/2010/wordml" wp14:textId="77777777">
       <w:pPr>
         <w:pStyle w:val="Normal"/>
         <w:spacing w:before="240" w:after="240"/>
@@ -1776,7 +1782,7 @@
       </w:pPr>
       <w:r>
         <w:rPr>
-          <w:rFonts w:eastAsia="Aptos" w:cs="Aptos" w:ascii="Aptos" w:hAnsi="Aptos"/>
+          <w:rFonts w:ascii="Aptos" w:hAnsi="Aptos" w:eastAsia="Aptos" w:cs="Aptos"/>
           <w:sz w:val="20"/>
           <w:szCs w:val="20"/>
         </w:rPr>
@@ -1784,7 +1790,7 @@
       </w:r>
       <w:r>
         <w:rPr>
-          <w:rFonts w:eastAsia="Aptos" w:cs="Aptos" w:ascii="Aptos" w:hAnsi="Aptos"/>
+          <w:rFonts w:ascii="Aptos" w:hAnsi="Aptos" w:eastAsia="Aptos" w:cs="Aptos"/>
           <w:b/>
           <w:bCs/>
           <w:sz w:val="20"/>
@@ -1794,14 +1800,14 @@
       </w:r>
       <w:r>
         <w:rPr>
-          <w:rFonts w:eastAsia="Aptos" w:cs="Aptos" w:ascii="Aptos" w:hAnsi="Aptos"/>
+          <w:rFonts w:ascii="Aptos" w:hAnsi="Aptos" w:eastAsia="Aptos" w:cs="Aptos"/>
           <w:sz w:val="20"/>
           <w:szCs w:val="20"/>
         </w:rPr>
         <w:t xml:space="preserve"> ok. 2–3 minuty</w:t>
       </w:r>
     </w:p>
-    <w:p>
+    <w:p xmlns:wp14="http://schemas.microsoft.com/office/word/2010/wordml" wp14:textId="77777777">
       <w:pPr>
         <w:pStyle w:val="Normal"/>
         <w:spacing w:before="240" w:after="240"/>
@@ -1813,7 +1819,7 @@
       </w:pPr>
       <w:r>
         <w:rPr>
-          <w:rFonts w:eastAsia="Aptos" w:cs="Aptos" w:ascii="Aptos" w:hAnsi="Aptos"/>
+          <w:rFonts w:ascii="Aptos" w:hAnsi="Aptos" w:eastAsia="Aptos" w:cs="Aptos"/>
           <w:sz w:val="20"/>
           <w:szCs w:val="20"/>
         </w:rPr>
@@ -1821,7 +1827,7 @@
       </w:r>
       <w:r>
         <w:rPr>
-          <w:rFonts w:eastAsia="Aptos" w:cs="Aptos" w:ascii="Aptos" w:hAnsi="Aptos"/>
+          <w:rFonts w:ascii="Aptos" w:hAnsi="Aptos" w:eastAsia="Aptos" w:cs="Aptos"/>
           <w:b/>
           <w:bCs/>
           <w:sz w:val="20"/>
@@ -1831,14 +1837,14 @@
       </w:r>
       <w:r>
         <w:rPr>
-          <w:rFonts w:eastAsia="Aptos" w:cs="Aptos" w:ascii="Aptos" w:hAnsi="Aptos"/>
+          <w:rFonts w:ascii="Aptos" w:hAnsi="Aptos" w:eastAsia="Aptos" w:cs="Aptos"/>
           <w:sz w:val="20"/>
           <w:szCs w:val="20"/>
         </w:rPr>
         <w:t xml:space="preserve"> nieokreślony</w:t>
       </w:r>
     </w:p>
-    <w:p>
+    <w:p xmlns:wp14="http://schemas.microsoft.com/office/word/2010/wordml" wp14:textId="77777777">
       <w:pPr>
         <w:pStyle w:val="Normal"/>
         <w:spacing w:before="240" w:after="240"/>
@@ -1852,7 +1858,7 @@
       </w:pPr>
       <w:r>
         <w:rPr>
-          <w:rFonts w:eastAsia="Aptos" w:cs="Aptos" w:ascii="Aptos" w:hAnsi="Aptos"/>
+          <w:rFonts w:ascii="Aptos" w:hAnsi="Aptos" w:eastAsia="Aptos" w:cs="Aptos"/>
           <w:b/>
           <w:bCs/>
           <w:sz w:val="20"/>
@@ -1861,7 +1867,7 @@
         <w:t>5. Wartości uzyskiwane przez aktorów po zakończeniu przypadku użycia</w:t>
       </w:r>
     </w:p>
-    <w:p>
+    <w:p xmlns:wp14="http://schemas.microsoft.com/office/word/2010/wordml" wp14:textId="77777777">
       <w:pPr>
         <w:pStyle w:val="ListParagraph"/>
         <w:numPr>
@@ -1878,14 +1884,14 @@
       </w:pPr>
       <w:r>
         <w:rPr>
-          <w:rFonts w:eastAsia="Aptos" w:cs="Aptos" w:ascii="Aptos" w:hAnsi="Aptos"/>
+          <w:rFonts w:ascii="Aptos" w:hAnsi="Aptos" w:eastAsia="Aptos" w:cs="Aptos"/>
           <w:sz w:val="20"/>
           <w:szCs w:val="20"/>
         </w:rPr>
         <w:t>Komunikat o udanej operacji na ekranie,</w:t>
       </w:r>
     </w:p>
-    <w:p>
+    <w:p xmlns:wp14="http://schemas.microsoft.com/office/word/2010/wordml" wp14:textId="77777777">
       <w:pPr>
         <w:pStyle w:val="ListParagraph"/>
         <w:numPr>
@@ -1902,14 +1908,14 @@
       </w:pPr>
       <w:r>
         <w:rPr>
-          <w:rFonts w:eastAsia="Aptos" w:cs="Aptos" w:ascii="Aptos" w:hAnsi="Aptos"/>
+          <w:rFonts w:ascii="Aptos" w:hAnsi="Aptos" w:eastAsia="Aptos" w:cs="Aptos"/>
           <w:sz w:val="20"/>
           <w:szCs w:val="20"/>
         </w:rPr>
         <w:t>Zmienione dane użytkownika w bazie klubu.</w:t>
       </w:r>
     </w:p>
-    <w:p>
+    <w:p xmlns:wp14="http://schemas.microsoft.com/office/word/2010/wordml" wp14:textId="77777777">
       <w:pPr>
         <w:pStyle w:val="ListParagraph"/>
         <w:numPr>
@@ -1926,14 +1932,14 @@
       </w:pPr>
       <w:r>
         <w:rPr>
-          <w:rFonts w:eastAsia="Aptos" w:cs="Aptos" w:ascii="Aptos" w:hAnsi="Aptos"/>
+          <w:rFonts w:ascii="Aptos" w:hAnsi="Aptos" w:eastAsia="Aptos" w:cs="Aptos"/>
           <w:sz w:val="20"/>
           <w:szCs w:val="20"/>
         </w:rPr>
         <w:t>Dodanie nowego użytkownika</w:t>
       </w:r>
     </w:p>
-    <w:p>
+    <w:p xmlns:wp14="http://schemas.microsoft.com/office/word/2010/wordml" wp14:textId="77777777">
       <w:pPr>
         <w:pStyle w:val="ListParagraph"/>
         <w:spacing w:before="0" w:after="0"/>
@@ -1946,13 +1952,13 @@
       </w:pPr>
       <w:r>
         <w:rPr>
-          <w:rFonts w:eastAsia="Aptos" w:cs="Aptos" w:ascii="Aptos" w:hAnsi="Aptos"/>
-          <w:sz w:val="20"/>
-          <w:szCs w:val="20"/>
-        </w:rPr>
-      </w:r>
-    </w:p>
-    <w:p>
+          <w:rFonts w:ascii="Aptos" w:hAnsi="Aptos" w:eastAsia="Aptos" w:cs="Aptos"/>
+          <w:sz w:val="20"/>
+          <w:szCs w:val="20"/>
+        </w:rPr>
+      </w:r>
+    </w:p>
+    <w:p xmlns:wp14="http://schemas.microsoft.com/office/word/2010/wordml" wp14:textId="77777777">
       <w:pPr>
         <w:pStyle w:val="ListParagraph"/>
         <w:spacing w:before="0" w:after="0"/>
@@ -1965,13 +1971,13 @@
       </w:pPr>
       <w:r>
         <w:rPr>
-          <w:rFonts w:eastAsia="Aptos" w:cs="Aptos" w:ascii="Aptos" w:hAnsi="Aptos"/>
-          <w:sz w:val="20"/>
-          <w:szCs w:val="20"/>
-        </w:rPr>
-      </w:r>
-    </w:p>
-    <w:p>
+          <w:rFonts w:ascii="Aptos" w:hAnsi="Aptos" w:eastAsia="Aptos" w:cs="Aptos"/>
+          <w:sz w:val="20"/>
+          <w:szCs w:val="20"/>
+        </w:rPr>
+      </w:r>
+    </w:p>
+    <w:p xmlns:wp14="http://schemas.microsoft.com/office/word/2010/wordml" wp14:textId="77777777">
       <w:pPr>
         <w:pStyle w:val="ListParagraph"/>
         <w:spacing w:before="0" w:after="0"/>
@@ -1984,13 +1990,13 @@
       </w:pPr>
       <w:r>
         <w:rPr>
-          <w:rFonts w:eastAsia="Aptos" w:cs="Aptos" w:ascii="Aptos" w:hAnsi="Aptos"/>
-          <w:sz w:val="20"/>
-          <w:szCs w:val="20"/>
-        </w:rPr>
-      </w:r>
-    </w:p>
-    <w:p>
+          <w:rFonts w:ascii="Aptos" w:hAnsi="Aptos" w:eastAsia="Aptos" w:cs="Aptos"/>
+          <w:sz w:val="20"/>
+          <w:szCs w:val="20"/>
+        </w:rPr>
+      </w:r>
+    </w:p>
+    <w:p xmlns:wp14="http://schemas.microsoft.com/office/word/2010/wordml" wp14:textId="77777777">
       <w:pPr>
         <w:pStyle w:val="BodyText"/>
         <w:spacing w:before="0" w:after="0"/>
@@ -2003,7 +2009,7 @@
       </w:pPr>
       <w:r>
         <w:rPr>
-          <w:rFonts w:eastAsia="Aptos" w:cs="Aptos" w:ascii="Aptos" w:hAnsi="Aptos"/>
+          <w:rFonts w:ascii="Aptos" w:hAnsi="Aptos" w:eastAsia="Aptos" w:cs="Aptos"/>
           <w:b/>
           <w:sz w:val="20"/>
           <w:szCs w:val="20"/>
@@ -2011,7 +2017,7 @@
         <w:t>Opisy aktorów w systemie:</w:t>
       </w:r>
     </w:p>
-    <w:p>
+    <w:p xmlns:wp14="http://schemas.microsoft.com/office/word/2010/wordml" wp14:textId="77777777">
       <w:pPr>
         <w:pStyle w:val="BodyText"/>
         <w:numPr>
@@ -2020,10 +2026,10 @@
         </w:numPr>
         <w:tabs>
           <w:tab w:val="clear" w:pos="708"/>
-          <w:tab w:val="left" w:pos="0" w:leader="none"/>
-        </w:tabs>
-        <w:spacing w:lineRule="auto" w:line="278" w:before="0" w:after="283"/>
-        <w:ind w:hanging="283" w:start="709"/>
+          <w:tab w:val="left" w:leader="none" w:pos="0"/>
+        </w:tabs>
+        <w:spacing w:before="0" w:after="283" w:line="278" w:lineRule="auto"/>
+        <w:ind w:start="709" w:hanging="283"/>
         <w:rPr>
           <w:rFonts w:ascii="Aptos" w:hAnsi="Aptos" w:cs="Aptos"/>
           <w:sz w:val="20"/>
@@ -2032,7 +2038,7 @@
       </w:pPr>
       <w:r>
         <w:rPr>
-          <w:rFonts w:cs="Aptos" w:ascii="Aptos" w:hAnsi="Aptos"/>
+          <w:rFonts w:ascii="Aptos" w:hAnsi="Aptos" w:cs="Aptos"/>
           <w:b/>
           <w:sz w:val="20"/>
           <w:szCs w:val="20"/>
@@ -2041,7 +2047,7 @@
       </w:r>
       <w:r>
         <w:rPr>
-          <w:rFonts w:cs="Aptos" w:ascii="Aptos" w:hAnsi="Aptos"/>
+          <w:rFonts w:ascii="Aptos" w:hAnsi="Aptos" w:cs="Aptos"/>
           <w:sz w:val="20"/>
           <w:szCs w:val="20"/>
         </w:rPr>
@@ -2049,7 +2055,7 @@
       </w:r>
       <w:r>
         <w:rPr>
-          <w:rFonts w:cs="Aptos" w:ascii="Aptos" w:hAnsi="Aptos"/>
+          <w:rFonts w:ascii="Aptos" w:hAnsi="Aptos" w:cs="Aptos"/>
           <w:sz w:val="20"/>
           <w:szCs w:val="20"/>
         </w:rPr>
@@ -2057,14 +2063,14 @@
       </w:r>
       <w:r>
         <w:rPr>
-          <w:rFonts w:cs="Aptos" w:ascii="Aptos" w:hAnsi="Aptos"/>
+          <w:rFonts w:ascii="Aptos" w:hAnsi="Aptos" w:cs="Aptos"/>
           <w:sz w:val="20"/>
           <w:szCs w:val="20"/>
         </w:rPr>
         <w:t>odzic lub prawny opiekun dziecka, które uczęszcza na zajęcia. Wchodzi do aplikacji głównie po to, żeby sprawdzić grafik treningów, zobaczyć, czy dziecko dostało powołanie na mecz, oraz żeby opłacić miesięczną składkę. Przez system może też sprawdzić statystyki swojego podopiecznego i napisać wiadomość do trenera.</w:t>
       </w:r>
     </w:p>
-    <w:p>
+    <w:p xmlns:wp14="http://schemas.microsoft.com/office/word/2010/wordml" wp14:textId="77777777">
       <w:pPr>
         <w:pStyle w:val="BodyText"/>
         <w:numPr>
@@ -2073,10 +2079,10 @@
         </w:numPr>
         <w:tabs>
           <w:tab w:val="clear" w:pos="708"/>
-          <w:tab w:val="left" w:pos="0" w:leader="none"/>
-        </w:tabs>
-        <w:spacing w:lineRule="auto" w:line="278" w:before="0" w:after="283"/>
-        <w:ind w:hanging="283" w:start="709"/>
+          <w:tab w:val="left" w:leader="none" w:pos="0"/>
+        </w:tabs>
+        <w:spacing w:before="0" w:after="283" w:line="278" w:lineRule="auto"/>
+        <w:ind w:start="709" w:hanging="283"/>
         <w:rPr>
           <w:rFonts w:ascii="Aptos" w:hAnsi="Aptos" w:cs="Aptos"/>
           <w:sz w:val="20"/>
@@ -2085,7 +2091,7 @@
       </w:pPr>
       <w:r>
         <w:rPr>
-          <w:rFonts w:cs="Aptos" w:ascii="Aptos" w:hAnsi="Aptos"/>
+          <w:rFonts w:ascii="Aptos" w:hAnsi="Aptos" w:cs="Aptos"/>
           <w:b/>
           <w:sz w:val="20"/>
           <w:szCs w:val="20"/>
@@ -2094,14 +2100,14 @@
       </w:r>
       <w:r>
         <w:rPr>
-          <w:rFonts w:cs="Aptos" w:ascii="Aptos" w:hAnsi="Aptos"/>
+          <w:rFonts w:ascii="Aptos" w:hAnsi="Aptos" w:cs="Aptos"/>
           <w:sz w:val="20"/>
           <w:szCs w:val="20"/>
         </w:rPr>
         <w:t xml:space="preserve"> Pracownik klubu, który fizycznie prowadzi zajęcia z dziećmi. W systemie zajmuje się zarządzaniem swoimi konkretnymi grupami. Do jego głównych zadań w aplikacji należy sprawdzanie obecności na treningach, ustalanie składu na mecze (wysyłanie powołań) oraz ewentualne odwoływanie zajęć. Ma też wgląd w bardziej zaawansowane statystyki sportowe swoich graczy.</w:t>
       </w:r>
     </w:p>
-    <w:p>
+    <w:p xmlns:wp14="http://schemas.microsoft.com/office/word/2010/wordml" wp14:textId="77777777">
       <w:pPr>
         <w:pStyle w:val="BodyText"/>
         <w:numPr>
@@ -2110,10 +2116,10 @@
         </w:numPr>
         <w:tabs>
           <w:tab w:val="clear" w:pos="708"/>
-          <w:tab w:val="left" w:pos="0" w:leader="none"/>
-        </w:tabs>
-        <w:spacing w:lineRule="auto" w:line="278" w:before="0" w:after="283"/>
-        <w:ind w:hanging="283" w:start="709"/>
+          <w:tab w:val="left" w:leader="none" w:pos="0"/>
+        </w:tabs>
+        <w:spacing w:before="0" w:after="283" w:line="278" w:lineRule="auto"/>
+        <w:ind w:start="709" w:hanging="283"/>
         <w:rPr>
           <w:rFonts w:ascii="Aptos" w:hAnsi="Aptos" w:cs="Aptos"/>
           <w:sz w:val="20"/>
@@ -2122,7 +2128,7 @@
       </w:pPr>
       <w:r>
         <w:rPr>
-          <w:rFonts w:cs="Aptos" w:ascii="Aptos" w:hAnsi="Aptos"/>
+          <w:rFonts w:ascii="Aptos" w:hAnsi="Aptos" w:cs="Aptos"/>
           <w:b/>
           <w:sz w:val="20"/>
           <w:szCs w:val="20"/>
@@ -2131,14 +2137,14 @@
       </w:r>
       <w:r>
         <w:rPr>
-          <w:rFonts w:cs="Aptos" w:ascii="Aptos" w:hAnsi="Aptos"/>
+          <w:rFonts w:ascii="Aptos" w:hAnsi="Aptos" w:cs="Aptos"/>
           <w:sz w:val="20"/>
           <w:szCs w:val="20"/>
         </w:rPr>
         <w:t xml:space="preserve"> Szefostwo i administracja klubu. To oni mają w systemie najwyższe uprawnienia i widzą najwięcej. Zajmują się sprawami organizacyjnymi: zakładają konta nowym użytkownikom, przydzielają trenerów do konkretnych roczników, pilnują, czy wpłaty od rodziców się zgadzają, i sprawdzają, czy wszyscy zawodnicy mają ważne badania lekarskie. Dodatkowo ogarniają klubowy sprzęt w magazynie i mają podgląd w kalendarz wszystkich meczów.</w:t>
       </w:r>
     </w:p>
-    <w:p>
+    <w:p xmlns:wp14="http://schemas.microsoft.com/office/word/2010/wordml" wp14:textId="77777777">
       <w:pPr>
         <w:pStyle w:val="ListParagraph"/>
         <w:spacing w:before="0" w:after="0"/>
@@ -2151,13 +2157,13 @@
       </w:pPr>
       <w:r>
         <w:rPr>
-          <w:rFonts w:eastAsia="Aptos" w:cs="Aptos" w:ascii="Aptos" w:hAnsi="Aptos"/>
-          <w:sz w:val="20"/>
-          <w:szCs w:val="20"/>
-        </w:rPr>
-      </w:r>
-    </w:p>
-    <w:p>
+          <w:rFonts w:ascii="Aptos" w:hAnsi="Aptos" w:eastAsia="Aptos" w:cs="Aptos"/>
+          <w:sz w:val="20"/>
+          <w:szCs w:val="20"/>
+        </w:rPr>
+      </w:r>
+    </w:p>
+    <w:p xmlns:wp14="http://schemas.microsoft.com/office/word/2010/wordml" wp14:textId="77777777">
       <w:pPr>
         <w:pStyle w:val="Normal"/>
         <w:spacing w:before="0" w:after="160"/>
@@ -2175,12 +2181,13 @@
     </w:p>
     <w:sectPr>
       <w:type w:val="nextPage"/>
-      <w:pgSz w:w="11906" w:h="16838"/>
-      <w:pgMar w:left="1417" w:right="1417" w:gutter="0" w:header="0" w:top="1417" w:footer="0" w:bottom="1417"/>
+      <w:pgSz w:w="11906" w:h="16838" w:orient="portrait"/>
+      <w:pgMar w:top="1417" w:right="1417" w:bottom="1417" w:left="1417" w:header="0" w:footer="0" w:gutter="0"/>
       <w:pgNumType w:fmt="decimal"/>
       <w:formProt w:val="false"/>
       <w:textDirection w:val="lrTb"/>
       <w:docGrid w:type="default" w:linePitch="360" w:charSpace="0"/>
+      <w:cols w:num="1"/>
     </w:sectPr>
   </w:body>
 </w:document>
@@ -2201,7 +2208,7 @@
         <w:ind w:start="720" w:hanging="360"/>
       </w:pPr>
       <w:rPr>
-        <w:rFonts w:ascii="Symbol" w:hAnsi="Symbol" w:cs="Symbol" w:hint="default"/>
+        <w:rFonts w:hint="default" w:ascii="Symbol" w:hAnsi="Symbol" w:cs="Symbol"/>
       </w:rPr>
     </w:lvl>
     <w:lvl w:ilvl="1">
@@ -2216,7 +2223,7 @@
         <w:ind w:start="1440" w:hanging="360"/>
       </w:pPr>
       <w:rPr>
-        <w:rFonts w:ascii="Courier New" w:hAnsi="Courier New" w:cs="Courier New" w:hint="default"/>
+        <w:rFonts w:hint="default" w:ascii="Courier New" w:hAnsi="Courier New" w:cs="Courier New"/>
       </w:rPr>
     </w:lvl>
     <w:lvl w:ilvl="2">
@@ -2231,7 +2238,7 @@
         <w:ind w:start="2160" w:hanging="360"/>
       </w:pPr>
       <w:rPr>
-        <w:rFonts w:ascii="Wingdings" w:hAnsi="Wingdings" w:cs="Wingdings" w:hint="default"/>
+        <w:rFonts w:hint="default" w:ascii="Wingdings" w:hAnsi="Wingdings" w:cs="Wingdings"/>
       </w:rPr>
     </w:lvl>
     <w:lvl w:ilvl="3">
@@ -2246,7 +2253,7 @@
         <w:ind w:start="2880" w:hanging="360"/>
       </w:pPr>
       <w:rPr>
-        <w:rFonts w:ascii="Symbol" w:hAnsi="Symbol" w:cs="Symbol" w:hint="default"/>
+        <w:rFonts w:hint="default" w:ascii="Symbol" w:hAnsi="Symbol" w:cs="Symbol"/>
       </w:rPr>
     </w:lvl>
     <w:lvl w:ilvl="4">
@@ -2261,7 +2268,7 @@
         <w:ind w:start="3600" w:hanging="360"/>
       </w:pPr>
       <w:rPr>
-        <w:rFonts w:ascii="Courier New" w:hAnsi="Courier New" w:cs="Courier New" w:hint="default"/>
+        <w:rFonts w:hint="default" w:ascii="Courier New" w:hAnsi="Courier New" w:cs="Courier New"/>
       </w:rPr>
     </w:lvl>
     <w:lvl w:ilvl="5">
@@ -2276,7 +2283,7 @@
         <w:ind w:start="4320" w:hanging="360"/>
       </w:pPr>
       <w:rPr>
-        <w:rFonts w:ascii="Wingdings" w:hAnsi="Wingdings" w:cs="Wingdings" w:hint="default"/>
+        <w:rFonts w:hint="default" w:ascii="Wingdings" w:hAnsi="Wingdings" w:cs="Wingdings"/>
       </w:rPr>
     </w:lvl>
     <w:lvl w:ilvl="6">
@@ -2291,7 +2298,7 @@
         <w:ind w:start="5040" w:hanging="360"/>
       </w:pPr>
       <w:rPr>
-        <w:rFonts w:ascii="Symbol" w:hAnsi="Symbol" w:cs="Symbol" w:hint="default"/>
+        <w:rFonts w:hint="default" w:ascii="Symbol" w:hAnsi="Symbol" w:cs="Symbol"/>
       </w:rPr>
     </w:lvl>
     <w:lvl w:ilvl="7">
@@ -2306,7 +2313,7 @@
         <w:ind w:start="5760" w:hanging="360"/>
       </w:pPr>
       <w:rPr>
-        <w:rFonts w:ascii="Courier New" w:hAnsi="Courier New" w:cs="Courier New" w:hint="default"/>
+        <w:rFonts w:hint="default" w:ascii="Courier New" w:hAnsi="Courier New" w:cs="Courier New"/>
       </w:rPr>
     </w:lvl>
     <w:lvl w:ilvl="8">
@@ -2321,9 +2328,10 @@
         <w:ind w:start="6480" w:hanging="360"/>
       </w:pPr>
       <w:rPr>
-        <w:rFonts w:ascii="Wingdings" w:hAnsi="Wingdings" w:cs="Wingdings" w:hint="default"/>
-      </w:rPr>
-    </w:lvl>
+        <w:rFonts w:hint="default" w:ascii="Wingdings" w:hAnsi="Wingdings" w:cs="Wingdings"/>
+      </w:rPr>
+    </w:lvl>
+    <w:nsid w:val="1253eac0"/>
   </w:abstractNum>
   <w:abstractNum w:abstractNumId="2">
     <w:lvl w:ilvl="0">
@@ -2338,7 +2346,7 @@
         <w:ind w:start="720" w:hanging="360"/>
       </w:pPr>
       <w:rPr>
-        <w:rFonts w:ascii="Symbol" w:hAnsi="Symbol" w:cs="Symbol" w:hint="default"/>
+        <w:rFonts w:hint="default" w:ascii="Symbol" w:hAnsi="Symbol" w:cs="Symbol"/>
       </w:rPr>
     </w:lvl>
     <w:lvl w:ilvl="1">
@@ -2353,7 +2361,7 @@
         <w:ind w:start="1440" w:hanging="360"/>
       </w:pPr>
       <w:rPr>
-        <w:rFonts w:ascii="Courier New" w:hAnsi="Courier New" w:cs="Courier New" w:hint="default"/>
+        <w:rFonts w:hint="default" w:ascii="Courier New" w:hAnsi="Courier New" w:cs="Courier New"/>
       </w:rPr>
     </w:lvl>
     <w:lvl w:ilvl="2">
@@ -2368,7 +2376,7 @@
         <w:ind w:start="2160" w:hanging="360"/>
       </w:pPr>
       <w:rPr>
-        <w:rFonts w:ascii="Wingdings" w:hAnsi="Wingdings" w:cs="Wingdings" w:hint="default"/>
+        <w:rFonts w:hint="default" w:ascii="Wingdings" w:hAnsi="Wingdings" w:cs="Wingdings"/>
       </w:rPr>
     </w:lvl>
     <w:lvl w:ilvl="3">
@@ -2383,7 +2391,7 @@
         <w:ind w:start="2880" w:hanging="360"/>
       </w:pPr>
       <w:rPr>
-        <w:rFonts w:ascii="Symbol" w:hAnsi="Symbol" w:cs="Symbol" w:hint="default"/>
+        <w:rFonts w:hint="default" w:ascii="Symbol" w:hAnsi="Symbol" w:cs="Symbol"/>
       </w:rPr>
     </w:lvl>
     <w:lvl w:ilvl="4">
@@ -2398,7 +2406,7 @@
         <w:ind w:start="3600" w:hanging="360"/>
       </w:pPr>
       <w:rPr>
-        <w:rFonts w:ascii="Courier New" w:hAnsi="Courier New" w:cs="Courier New" w:hint="default"/>
+        <w:rFonts w:hint="default" w:ascii="Courier New" w:hAnsi="Courier New" w:cs="Courier New"/>
       </w:rPr>
     </w:lvl>
     <w:lvl w:ilvl="5">
@@ -2413,7 +2421,7 @@
         <w:ind w:start="4320" w:hanging="360"/>
       </w:pPr>
       <w:rPr>
-        <w:rFonts w:ascii="Wingdings" w:hAnsi="Wingdings" w:cs="Wingdings" w:hint="default"/>
+        <w:rFonts w:hint="default" w:ascii="Wingdings" w:hAnsi="Wingdings" w:cs="Wingdings"/>
       </w:rPr>
     </w:lvl>
     <w:lvl w:ilvl="6">
@@ -2428,7 +2436,7 @@
         <w:ind w:start="5040" w:hanging="360"/>
       </w:pPr>
       <w:rPr>
-        <w:rFonts w:ascii="Symbol" w:hAnsi="Symbol" w:cs="Symbol" w:hint="default"/>
+        <w:rFonts w:hint="default" w:ascii="Symbol" w:hAnsi="Symbol" w:cs="Symbol"/>
       </w:rPr>
     </w:lvl>
     <w:lvl w:ilvl="7">
@@ -2443,7 +2451,7 @@
         <w:ind w:start="5760" w:hanging="360"/>
       </w:pPr>
       <w:rPr>
-        <w:rFonts w:ascii="Courier New" w:hAnsi="Courier New" w:cs="Courier New" w:hint="default"/>
+        <w:rFonts w:hint="default" w:ascii="Courier New" w:hAnsi="Courier New" w:cs="Courier New"/>
       </w:rPr>
     </w:lvl>
     <w:lvl w:ilvl="8">
@@ -2458,9 +2466,10 @@
         <w:ind w:start="6480" w:hanging="360"/>
       </w:pPr>
       <w:rPr>
-        <w:rFonts w:ascii="Wingdings" w:hAnsi="Wingdings" w:cs="Wingdings" w:hint="default"/>
-      </w:rPr>
-    </w:lvl>
+        <w:rFonts w:hint="default" w:ascii="Wingdings" w:hAnsi="Wingdings" w:cs="Wingdings"/>
+      </w:rPr>
+    </w:lvl>
+    <w:nsid w:val="66564ab9"/>
   </w:abstractNum>
   <w:abstractNum w:abstractNumId="3">
     <w:lvl w:ilvl="0">
@@ -2475,7 +2484,7 @@
         <w:ind w:start="720" w:hanging="360"/>
       </w:pPr>
       <w:rPr>
-        <w:rFonts w:ascii="Symbol" w:hAnsi="Symbol" w:cs="Symbol" w:hint="default"/>
+        <w:rFonts w:hint="default" w:ascii="Symbol" w:hAnsi="Symbol" w:cs="Symbol"/>
       </w:rPr>
     </w:lvl>
     <w:lvl w:ilvl="1">
@@ -2490,7 +2499,7 @@
         <w:ind w:start="1440" w:hanging="360"/>
       </w:pPr>
       <w:rPr>
-        <w:rFonts w:ascii="Courier New" w:hAnsi="Courier New" w:cs="Courier New" w:hint="default"/>
+        <w:rFonts w:hint="default" w:ascii="Courier New" w:hAnsi="Courier New" w:cs="Courier New"/>
       </w:rPr>
     </w:lvl>
     <w:lvl w:ilvl="2">
@@ -2505,7 +2514,7 @@
         <w:ind w:start="2160" w:hanging="360"/>
       </w:pPr>
       <w:rPr>
-        <w:rFonts w:ascii="Wingdings" w:hAnsi="Wingdings" w:cs="Wingdings" w:hint="default"/>
+        <w:rFonts w:hint="default" w:ascii="Wingdings" w:hAnsi="Wingdings" w:cs="Wingdings"/>
       </w:rPr>
     </w:lvl>
     <w:lvl w:ilvl="3">
@@ -2520,7 +2529,7 @@
         <w:ind w:start="2880" w:hanging="360"/>
       </w:pPr>
       <w:rPr>
-        <w:rFonts w:ascii="Symbol" w:hAnsi="Symbol" w:cs="Symbol" w:hint="default"/>
+        <w:rFonts w:hint="default" w:ascii="Symbol" w:hAnsi="Symbol" w:cs="Symbol"/>
       </w:rPr>
     </w:lvl>
     <w:lvl w:ilvl="4">
@@ -2535,7 +2544,7 @@
         <w:ind w:start="3600" w:hanging="360"/>
       </w:pPr>
       <w:rPr>
-        <w:rFonts w:ascii="Courier New" w:hAnsi="Courier New" w:cs="Courier New" w:hint="default"/>
+        <w:rFonts w:hint="default" w:ascii="Courier New" w:hAnsi="Courier New" w:cs="Courier New"/>
       </w:rPr>
     </w:lvl>
     <w:lvl w:ilvl="5">
@@ -2550,7 +2559,7 @@
         <w:ind w:start="4320" w:hanging="360"/>
       </w:pPr>
       <w:rPr>
-        <w:rFonts w:ascii="Wingdings" w:hAnsi="Wingdings" w:cs="Wingdings" w:hint="default"/>
+        <w:rFonts w:hint="default" w:ascii="Wingdings" w:hAnsi="Wingdings" w:cs="Wingdings"/>
       </w:rPr>
     </w:lvl>
     <w:lvl w:ilvl="6">
@@ -2565,7 +2574,7 @@
         <w:ind w:start="5040" w:hanging="360"/>
       </w:pPr>
       <w:rPr>
-        <w:rFonts w:ascii="Symbol" w:hAnsi="Symbol" w:cs="Symbol" w:hint="default"/>
+        <w:rFonts w:hint="default" w:ascii="Symbol" w:hAnsi="Symbol" w:cs="Symbol"/>
       </w:rPr>
     </w:lvl>
     <w:lvl w:ilvl="7">
@@ -2580,7 +2589,7 @@
         <w:ind w:start="5760" w:hanging="360"/>
       </w:pPr>
       <w:rPr>
-        <w:rFonts w:ascii="Courier New" w:hAnsi="Courier New" w:cs="Courier New" w:hint="default"/>
+        <w:rFonts w:hint="default" w:ascii="Courier New" w:hAnsi="Courier New" w:cs="Courier New"/>
       </w:rPr>
     </w:lvl>
     <w:lvl w:ilvl="8">
@@ -2595,9 +2604,10 @@
         <w:ind w:start="6480" w:hanging="360"/>
       </w:pPr>
       <w:rPr>
-        <w:rFonts w:ascii="Wingdings" w:hAnsi="Wingdings" w:cs="Wingdings" w:hint="default"/>
-      </w:rPr>
-    </w:lvl>
+        <w:rFonts w:hint="default" w:ascii="Wingdings" w:hAnsi="Wingdings" w:cs="Wingdings"/>
+      </w:rPr>
+    </w:lvl>
+    <w:nsid w:val="33ca9bc5"/>
   </w:abstractNum>
   <w:abstractNum w:abstractNumId="4">
     <w:lvl w:ilvl="0">
@@ -2612,7 +2622,7 @@
         <w:ind w:start="720" w:hanging="360"/>
       </w:pPr>
       <w:rPr>
-        <w:rFonts w:ascii="Symbol" w:hAnsi="Symbol" w:cs="Symbol" w:hint="default"/>
+        <w:rFonts w:hint="default" w:ascii="Symbol" w:hAnsi="Symbol" w:cs="Symbol"/>
       </w:rPr>
     </w:lvl>
     <w:lvl w:ilvl="1">
@@ -2627,7 +2637,7 @@
         <w:ind w:start="1440" w:hanging="360"/>
       </w:pPr>
       <w:rPr>
-        <w:rFonts w:ascii="Courier New" w:hAnsi="Courier New" w:cs="Courier New" w:hint="default"/>
+        <w:rFonts w:hint="default" w:ascii="Courier New" w:hAnsi="Courier New" w:cs="Courier New"/>
       </w:rPr>
     </w:lvl>
     <w:lvl w:ilvl="2">
@@ -2642,7 +2652,7 @@
         <w:ind w:start="2160" w:hanging="360"/>
       </w:pPr>
       <w:rPr>
-        <w:rFonts w:ascii="Wingdings" w:hAnsi="Wingdings" w:cs="Wingdings" w:hint="default"/>
+        <w:rFonts w:hint="default" w:ascii="Wingdings" w:hAnsi="Wingdings" w:cs="Wingdings"/>
       </w:rPr>
     </w:lvl>
     <w:lvl w:ilvl="3">
@@ -2657,7 +2667,7 @@
         <w:ind w:start="2880" w:hanging="360"/>
       </w:pPr>
       <w:rPr>
-        <w:rFonts w:ascii="Symbol" w:hAnsi="Symbol" w:cs="Symbol" w:hint="default"/>
+        <w:rFonts w:hint="default" w:ascii="Symbol" w:hAnsi="Symbol" w:cs="Symbol"/>
       </w:rPr>
     </w:lvl>
     <w:lvl w:ilvl="4">
@@ -2672,7 +2682,7 @@
         <w:ind w:start="3600" w:hanging="360"/>
       </w:pPr>
       <w:rPr>
-        <w:rFonts w:ascii="Courier New" w:hAnsi="Courier New" w:cs="Courier New" w:hint="default"/>
+        <w:rFonts w:hint="default" w:ascii="Courier New" w:hAnsi="Courier New" w:cs="Courier New"/>
       </w:rPr>
     </w:lvl>
     <w:lvl w:ilvl="5">
@@ -2687,7 +2697,7 @@
         <w:ind w:start="4320" w:hanging="360"/>
       </w:pPr>
       <w:rPr>
-        <w:rFonts w:ascii="Wingdings" w:hAnsi="Wingdings" w:cs="Wingdings" w:hint="default"/>
+        <w:rFonts w:hint="default" w:ascii="Wingdings" w:hAnsi="Wingdings" w:cs="Wingdings"/>
       </w:rPr>
     </w:lvl>
     <w:lvl w:ilvl="6">
@@ -2702,7 +2712,7 @@
         <w:ind w:start="5040" w:hanging="360"/>
       </w:pPr>
       <w:rPr>
-        <w:rFonts w:ascii="Symbol" w:hAnsi="Symbol" w:cs="Symbol" w:hint="default"/>
+        <w:rFonts w:hint="default" w:ascii="Symbol" w:hAnsi="Symbol" w:cs="Symbol"/>
       </w:rPr>
     </w:lvl>
     <w:lvl w:ilvl="7">
@@ -2717,7 +2727,7 @@
         <w:ind w:start="5760" w:hanging="360"/>
       </w:pPr>
       <w:rPr>
-        <w:rFonts w:ascii="Courier New" w:hAnsi="Courier New" w:cs="Courier New" w:hint="default"/>
+        <w:rFonts w:hint="default" w:ascii="Courier New" w:hAnsi="Courier New" w:cs="Courier New"/>
       </w:rPr>
     </w:lvl>
     <w:lvl w:ilvl="8">
@@ -2732,9 +2742,10 @@
         <w:ind w:start="6480" w:hanging="360"/>
       </w:pPr>
       <w:rPr>
-        <w:rFonts w:ascii="Wingdings" w:hAnsi="Wingdings" w:cs="Wingdings" w:hint="default"/>
-      </w:rPr>
-    </w:lvl>
+        <w:rFonts w:hint="default" w:ascii="Wingdings" w:hAnsi="Wingdings" w:cs="Wingdings"/>
+      </w:rPr>
+    </w:lvl>
+    <w:nsid w:val="3b0e9abe"/>
   </w:abstractNum>
   <w:abstractNum w:abstractNumId="5">
     <w:lvl w:ilvl="0">
@@ -2749,7 +2760,7 @@
         <w:ind w:start="720" w:hanging="360"/>
       </w:pPr>
       <w:rPr>
-        <w:rFonts w:ascii="Symbol" w:hAnsi="Symbol" w:cs="Symbol" w:hint="default"/>
+        <w:rFonts w:hint="default" w:ascii="Symbol" w:hAnsi="Symbol" w:cs="Symbol"/>
       </w:rPr>
     </w:lvl>
     <w:lvl w:ilvl="1">
@@ -2764,7 +2775,7 @@
         <w:ind w:start="1440" w:hanging="360"/>
       </w:pPr>
       <w:rPr>
-        <w:rFonts w:ascii="Courier New" w:hAnsi="Courier New" w:cs="Courier New" w:hint="default"/>
+        <w:rFonts w:hint="default" w:ascii="Courier New" w:hAnsi="Courier New" w:cs="Courier New"/>
       </w:rPr>
     </w:lvl>
     <w:lvl w:ilvl="2">
@@ -2779,7 +2790,7 @@
         <w:ind w:start="2160" w:hanging="360"/>
       </w:pPr>
       <w:rPr>
-        <w:rFonts w:ascii="Wingdings" w:hAnsi="Wingdings" w:cs="Wingdings" w:hint="default"/>
+        <w:rFonts w:hint="default" w:ascii="Wingdings" w:hAnsi="Wingdings" w:cs="Wingdings"/>
       </w:rPr>
     </w:lvl>
     <w:lvl w:ilvl="3">
@@ -2794,7 +2805,7 @@
         <w:ind w:start="2880" w:hanging="360"/>
       </w:pPr>
       <w:rPr>
-        <w:rFonts w:ascii="Symbol" w:hAnsi="Symbol" w:cs="Symbol" w:hint="default"/>
+        <w:rFonts w:hint="default" w:ascii="Symbol" w:hAnsi="Symbol" w:cs="Symbol"/>
       </w:rPr>
     </w:lvl>
     <w:lvl w:ilvl="4">
@@ -2809,7 +2820,7 @@
         <w:ind w:start="3600" w:hanging="360"/>
       </w:pPr>
       <w:rPr>
-        <w:rFonts w:ascii="Courier New" w:hAnsi="Courier New" w:cs="Courier New" w:hint="default"/>
+        <w:rFonts w:hint="default" w:ascii="Courier New" w:hAnsi="Courier New" w:cs="Courier New"/>
       </w:rPr>
     </w:lvl>
     <w:lvl w:ilvl="5">
@@ -2824,7 +2835,7 @@
         <w:ind w:start="4320" w:hanging="360"/>
       </w:pPr>
       <w:rPr>
-        <w:rFonts w:ascii="Wingdings" w:hAnsi="Wingdings" w:cs="Wingdings" w:hint="default"/>
+        <w:rFonts w:hint="default" w:ascii="Wingdings" w:hAnsi="Wingdings" w:cs="Wingdings"/>
       </w:rPr>
     </w:lvl>
     <w:lvl w:ilvl="6">
@@ -2839,7 +2850,7 @@
         <w:ind w:start="5040" w:hanging="360"/>
       </w:pPr>
       <w:rPr>
-        <w:rFonts w:ascii="Symbol" w:hAnsi="Symbol" w:cs="Symbol" w:hint="default"/>
+        <w:rFonts w:hint="default" w:ascii="Symbol" w:hAnsi="Symbol" w:cs="Symbol"/>
       </w:rPr>
     </w:lvl>
     <w:lvl w:ilvl="7">
@@ -2854,7 +2865,7 @@
         <w:ind w:start="5760" w:hanging="360"/>
       </w:pPr>
       <w:rPr>
-        <w:rFonts w:ascii="Courier New" w:hAnsi="Courier New" w:cs="Courier New" w:hint="default"/>
+        <w:rFonts w:hint="default" w:ascii="Courier New" w:hAnsi="Courier New" w:cs="Courier New"/>
       </w:rPr>
     </w:lvl>
     <w:lvl w:ilvl="8">
@@ -2869,9 +2880,10 @@
         <w:ind w:start="6480" w:hanging="360"/>
       </w:pPr>
       <w:rPr>
-        <w:rFonts w:ascii="Wingdings" w:hAnsi="Wingdings" w:cs="Wingdings" w:hint="default"/>
-      </w:rPr>
-    </w:lvl>
+        <w:rFonts w:hint="default" w:ascii="Wingdings" w:hAnsi="Wingdings" w:cs="Wingdings"/>
+      </w:rPr>
+    </w:lvl>
+    <w:nsid w:val="710038ee"/>
   </w:abstractNum>
   <w:abstractNum w:abstractNumId="6">
     <w:lvl w:ilvl="0">
@@ -2886,7 +2898,7 @@
         <w:ind w:start="720" w:hanging="360"/>
       </w:pPr>
       <w:rPr>
-        <w:rFonts w:ascii="Symbol" w:hAnsi="Symbol" w:cs="Symbol" w:hint="default"/>
+        <w:rFonts w:hint="default" w:ascii="Symbol" w:hAnsi="Symbol" w:cs="Symbol"/>
         <w:sz w:val="20"/>
       </w:rPr>
     </w:lvl>
@@ -2902,7 +2914,7 @@
         <w:ind w:start="1440" w:hanging="360"/>
       </w:pPr>
       <w:rPr>
-        <w:rFonts w:ascii="Courier New" w:hAnsi="Courier New" w:cs="Courier New" w:hint="default"/>
+        <w:rFonts w:hint="default" w:ascii="Courier New" w:hAnsi="Courier New" w:cs="Courier New"/>
         <w:sz w:val="20"/>
       </w:rPr>
     </w:lvl>
@@ -2918,7 +2930,7 @@
         <w:ind w:start="2160" w:hanging="360"/>
       </w:pPr>
       <w:rPr>
-        <w:rFonts w:ascii="Wingdings" w:hAnsi="Wingdings" w:cs="Wingdings" w:hint="default"/>
+        <w:rFonts w:hint="default" w:ascii="Wingdings" w:hAnsi="Wingdings" w:cs="Wingdings"/>
         <w:sz w:val="20"/>
       </w:rPr>
     </w:lvl>
@@ -2934,7 +2946,7 @@
         <w:ind w:start="2880" w:hanging="360"/>
       </w:pPr>
       <w:rPr>
-        <w:rFonts w:ascii="Wingdings" w:hAnsi="Wingdings" w:cs="Wingdings" w:hint="default"/>
+        <w:rFonts w:hint="default" w:ascii="Wingdings" w:hAnsi="Wingdings" w:cs="Wingdings"/>
         <w:sz w:val="20"/>
       </w:rPr>
     </w:lvl>
@@ -2950,7 +2962,7 @@
         <w:ind w:start="3600" w:hanging="360"/>
       </w:pPr>
       <w:rPr>
-        <w:rFonts w:ascii="Wingdings" w:hAnsi="Wingdings" w:cs="Wingdings" w:hint="default"/>
+        <w:rFonts w:hint="default" w:ascii="Wingdings" w:hAnsi="Wingdings" w:cs="Wingdings"/>
         <w:sz w:val="20"/>
       </w:rPr>
     </w:lvl>
@@ -2966,7 +2978,7 @@
         <w:ind w:start="4320" w:hanging="360"/>
       </w:pPr>
       <w:rPr>
-        <w:rFonts w:ascii="Wingdings" w:hAnsi="Wingdings" w:cs="Wingdings" w:hint="default"/>
+        <w:rFonts w:hint="default" w:ascii="Wingdings" w:hAnsi="Wingdings" w:cs="Wingdings"/>
         <w:sz w:val="20"/>
       </w:rPr>
     </w:lvl>
@@ -2982,7 +2994,7 @@
         <w:ind w:start="5040" w:hanging="360"/>
       </w:pPr>
       <w:rPr>
-        <w:rFonts w:ascii="Wingdings" w:hAnsi="Wingdings" w:cs="Wingdings" w:hint="default"/>
+        <w:rFonts w:hint="default" w:ascii="Wingdings" w:hAnsi="Wingdings" w:cs="Wingdings"/>
         <w:sz w:val="20"/>
       </w:rPr>
     </w:lvl>
@@ -2998,7 +3010,7 @@
         <w:ind w:start="5760" w:hanging="360"/>
       </w:pPr>
       <w:rPr>
-        <w:rFonts w:ascii="Wingdings" w:hAnsi="Wingdings" w:cs="Wingdings" w:hint="default"/>
+        <w:rFonts w:hint="default" w:ascii="Wingdings" w:hAnsi="Wingdings" w:cs="Wingdings"/>
         <w:sz w:val="20"/>
       </w:rPr>
     </w:lvl>
@@ -3014,10 +3026,11 @@
         <w:ind w:start="6480" w:hanging="360"/>
       </w:pPr>
       <w:rPr>
-        <w:rFonts w:ascii="Wingdings" w:hAnsi="Wingdings" w:cs="Wingdings" w:hint="default"/>
+        <w:rFonts w:hint="default" w:ascii="Wingdings" w:hAnsi="Wingdings" w:cs="Wingdings"/>
         <w:sz w:val="20"/>
       </w:rPr>
     </w:lvl>
+    <w:nsid w:val="5745c8d4"/>
   </w:abstractNum>
   <w:abstractNum w:abstractNumId="7">
     <w:lvl w:ilvl="0">
@@ -3032,7 +3045,7 @@
         <w:ind w:start="720" w:hanging="360"/>
       </w:pPr>
       <w:rPr>
-        <w:rFonts w:ascii="Symbol" w:hAnsi="Symbol" w:cs="Symbol" w:hint="default"/>
+        <w:rFonts w:hint="default" w:ascii="Symbol" w:hAnsi="Symbol" w:cs="Symbol"/>
         <w:sz w:val="20"/>
       </w:rPr>
     </w:lvl>
@@ -3048,7 +3061,7 @@
         <w:ind w:start="1440" w:hanging="360"/>
       </w:pPr>
       <w:rPr>
-        <w:rFonts w:ascii="Courier New" w:hAnsi="Courier New" w:cs="Courier New" w:hint="default"/>
+        <w:rFonts w:hint="default" w:ascii="Courier New" w:hAnsi="Courier New" w:cs="Courier New"/>
         <w:sz w:val="20"/>
       </w:rPr>
     </w:lvl>
@@ -3064,7 +3077,7 @@
         <w:ind w:start="2160" w:hanging="360"/>
       </w:pPr>
       <w:rPr>
-        <w:rFonts w:ascii="Wingdings" w:hAnsi="Wingdings" w:cs="Wingdings" w:hint="default"/>
+        <w:rFonts w:hint="default" w:ascii="Wingdings" w:hAnsi="Wingdings" w:cs="Wingdings"/>
         <w:sz w:val="20"/>
       </w:rPr>
     </w:lvl>
@@ -3080,7 +3093,7 @@
         <w:ind w:start="2880" w:hanging="360"/>
       </w:pPr>
       <w:rPr>
-        <w:rFonts w:ascii="Wingdings" w:hAnsi="Wingdings" w:cs="Wingdings" w:hint="default"/>
+        <w:rFonts w:hint="default" w:ascii="Wingdings" w:hAnsi="Wingdings" w:cs="Wingdings"/>
         <w:sz w:val="20"/>
       </w:rPr>
     </w:lvl>
@@ -3096,7 +3109,7 @@
         <w:ind w:start="3600" w:hanging="360"/>
       </w:pPr>
       <w:rPr>
-        <w:rFonts w:ascii="Wingdings" w:hAnsi="Wingdings" w:cs="Wingdings" w:hint="default"/>
+        <w:rFonts w:hint="default" w:ascii="Wingdings" w:hAnsi="Wingdings" w:cs="Wingdings"/>
         <w:sz w:val="20"/>
       </w:rPr>
     </w:lvl>
@@ -3112,7 +3125,7 @@
         <w:ind w:start="4320" w:hanging="360"/>
       </w:pPr>
       <w:rPr>
-        <w:rFonts w:ascii="Wingdings" w:hAnsi="Wingdings" w:cs="Wingdings" w:hint="default"/>
+        <w:rFonts w:hint="default" w:ascii="Wingdings" w:hAnsi="Wingdings" w:cs="Wingdings"/>
         <w:sz w:val="20"/>
       </w:rPr>
     </w:lvl>
@@ -3128,7 +3141,7 @@
         <w:ind w:start="5040" w:hanging="360"/>
       </w:pPr>
       <w:rPr>
-        <w:rFonts w:ascii="Wingdings" w:hAnsi="Wingdings" w:cs="Wingdings" w:hint="default"/>
+        <w:rFonts w:hint="default" w:ascii="Wingdings" w:hAnsi="Wingdings" w:cs="Wingdings"/>
         <w:sz w:val="20"/>
       </w:rPr>
     </w:lvl>
@@ -3144,7 +3157,7 @@
         <w:ind w:start="5760" w:hanging="360"/>
       </w:pPr>
       <w:rPr>
-        <w:rFonts w:ascii="Wingdings" w:hAnsi="Wingdings" w:cs="Wingdings" w:hint="default"/>
+        <w:rFonts w:hint="default" w:ascii="Wingdings" w:hAnsi="Wingdings" w:cs="Wingdings"/>
         <w:sz w:val="20"/>
       </w:rPr>
     </w:lvl>
@@ -3160,10 +3173,11 @@
         <w:ind w:start="6480" w:hanging="360"/>
       </w:pPr>
       <w:rPr>
-        <w:rFonts w:ascii="Wingdings" w:hAnsi="Wingdings" w:cs="Wingdings" w:hint="default"/>
+        <w:rFonts w:hint="default" w:ascii="Wingdings" w:hAnsi="Wingdings" w:cs="Wingdings"/>
         <w:sz w:val="20"/>
       </w:rPr>
     </w:lvl>
+    <w:nsid w:val="2f15a8d9"/>
   </w:abstractNum>
   <w:abstractNum w:abstractNumId="8">
     <w:lvl w:ilvl="0">
@@ -3178,7 +3192,7 @@
         <w:ind w:start="720" w:hanging="360"/>
       </w:pPr>
       <w:rPr>
-        <w:rFonts w:ascii="Symbol" w:hAnsi="Symbol" w:cs="Symbol" w:hint="default"/>
+        <w:rFonts w:hint="default" w:ascii="Symbol" w:hAnsi="Symbol" w:cs="Symbol"/>
         <w:sz w:val="20"/>
       </w:rPr>
     </w:lvl>
@@ -3194,7 +3208,7 @@
         <w:ind w:start="1440" w:hanging="360"/>
       </w:pPr>
       <w:rPr>
-        <w:rFonts w:ascii="Courier New" w:hAnsi="Courier New" w:cs="Courier New" w:hint="default"/>
+        <w:rFonts w:hint="default" w:ascii="Courier New" w:hAnsi="Courier New" w:cs="Courier New"/>
         <w:sz w:val="20"/>
       </w:rPr>
     </w:lvl>
@@ -3210,7 +3224,7 @@
         <w:ind w:start="2160" w:hanging="360"/>
       </w:pPr>
       <w:rPr>
-        <w:rFonts w:ascii="Wingdings" w:hAnsi="Wingdings" w:cs="Wingdings" w:hint="default"/>
+        <w:rFonts w:hint="default" w:ascii="Wingdings" w:hAnsi="Wingdings" w:cs="Wingdings"/>
         <w:sz w:val="20"/>
       </w:rPr>
     </w:lvl>
@@ -3226,7 +3240,7 @@
         <w:ind w:start="2880" w:hanging="360"/>
       </w:pPr>
       <w:rPr>
-        <w:rFonts w:ascii="Wingdings" w:hAnsi="Wingdings" w:cs="Wingdings" w:hint="default"/>
+        <w:rFonts w:hint="default" w:ascii="Wingdings" w:hAnsi="Wingdings" w:cs="Wingdings"/>
         <w:sz w:val="20"/>
       </w:rPr>
     </w:lvl>
@@ -3242,7 +3256,7 @@
         <w:ind w:start="3600" w:hanging="360"/>
       </w:pPr>
       <w:rPr>
-        <w:rFonts w:ascii="Wingdings" w:hAnsi="Wingdings" w:cs="Wingdings" w:hint="default"/>
+        <w:rFonts w:hint="default" w:ascii="Wingdings" w:hAnsi="Wingdings" w:cs="Wingdings"/>
         <w:sz w:val="20"/>
       </w:rPr>
     </w:lvl>
@@ -3258,7 +3272,7 @@
         <w:ind w:start="4320" w:hanging="360"/>
       </w:pPr>
       <w:rPr>
-        <w:rFonts w:ascii="Wingdings" w:hAnsi="Wingdings" w:cs="Wingdings" w:hint="default"/>
+        <w:rFonts w:hint="default" w:ascii="Wingdings" w:hAnsi="Wingdings" w:cs="Wingdings"/>
         <w:sz w:val="20"/>
       </w:rPr>
     </w:lvl>
@@ -3274,7 +3288,7 @@
         <w:ind w:start="5040" w:hanging="360"/>
       </w:pPr>
       <w:rPr>
-        <w:rFonts w:ascii="Wingdings" w:hAnsi="Wingdings" w:cs="Wingdings" w:hint="default"/>
+        <w:rFonts w:hint="default" w:ascii="Wingdings" w:hAnsi="Wingdings" w:cs="Wingdings"/>
         <w:sz w:val="20"/>
       </w:rPr>
     </w:lvl>
@@ -3290,7 +3304,7 @@
         <w:ind w:start="5760" w:hanging="360"/>
       </w:pPr>
       <w:rPr>
-        <w:rFonts w:ascii="Wingdings" w:hAnsi="Wingdings" w:cs="Wingdings" w:hint="default"/>
+        <w:rFonts w:hint="default" w:ascii="Wingdings" w:hAnsi="Wingdings" w:cs="Wingdings"/>
         <w:sz w:val="20"/>
       </w:rPr>
     </w:lvl>
@@ -3306,10 +3320,11 @@
         <w:ind w:start="6480" w:hanging="360"/>
       </w:pPr>
       <w:rPr>
-        <w:rFonts w:ascii="Wingdings" w:hAnsi="Wingdings" w:cs="Wingdings" w:hint="default"/>
+        <w:rFonts w:hint="default" w:ascii="Wingdings" w:hAnsi="Wingdings" w:cs="Wingdings"/>
         <w:sz w:val="20"/>
       </w:rPr>
     </w:lvl>
+    <w:nsid w:val="796a64a2"/>
   </w:abstractNum>
   <w:abstractNum w:abstractNumId="9">
     <w:lvl w:ilvl="0">
@@ -3324,7 +3339,7 @@
         <w:ind w:start="720" w:hanging="360"/>
       </w:pPr>
       <w:rPr>
-        <w:rFonts w:ascii="Symbol" w:hAnsi="Symbol" w:cs="Symbol" w:hint="default"/>
+        <w:rFonts w:hint="default" w:ascii="Symbol" w:hAnsi="Symbol" w:cs="Symbol"/>
         <w:sz w:val="20"/>
       </w:rPr>
     </w:lvl>
@@ -3340,7 +3355,7 @@
         <w:ind w:start="1440" w:hanging="360"/>
       </w:pPr>
       <w:rPr>
-        <w:rFonts w:ascii="Courier New" w:hAnsi="Courier New" w:cs="Courier New" w:hint="default"/>
+        <w:rFonts w:hint="default" w:ascii="Courier New" w:hAnsi="Courier New" w:cs="Courier New"/>
         <w:sz w:val="20"/>
       </w:rPr>
     </w:lvl>
@@ -3356,7 +3371,7 @@
         <w:ind w:start="2160" w:hanging="360"/>
       </w:pPr>
       <w:rPr>
-        <w:rFonts w:ascii="Wingdings" w:hAnsi="Wingdings" w:cs="Wingdings" w:hint="default"/>
+        <w:rFonts w:hint="default" w:ascii="Wingdings" w:hAnsi="Wingdings" w:cs="Wingdings"/>
         <w:sz w:val="20"/>
       </w:rPr>
     </w:lvl>
@@ -3372,7 +3387,7 @@
         <w:ind w:start="2880" w:hanging="360"/>
       </w:pPr>
       <w:rPr>
-        <w:rFonts w:ascii="Wingdings" w:hAnsi="Wingdings" w:cs="Wingdings" w:hint="default"/>
+        <w:rFonts w:hint="default" w:ascii="Wingdings" w:hAnsi="Wingdings" w:cs="Wingdings"/>
         <w:sz w:val="20"/>
       </w:rPr>
     </w:lvl>
@@ -3388,7 +3403,7 @@
         <w:ind w:start="3600" w:hanging="360"/>
       </w:pPr>
       <w:rPr>
-        <w:rFonts w:ascii="Wingdings" w:hAnsi="Wingdings" w:cs="Wingdings" w:hint="default"/>
+        <w:rFonts w:hint="default" w:ascii="Wingdings" w:hAnsi="Wingdings" w:cs="Wingdings"/>
         <w:sz w:val="20"/>
       </w:rPr>
     </w:lvl>
@@ -3404,7 +3419,7 @@
         <w:ind w:start="4320" w:hanging="360"/>
       </w:pPr>
       <w:rPr>
-        <w:rFonts w:ascii="Wingdings" w:hAnsi="Wingdings" w:cs="Wingdings" w:hint="default"/>
+        <w:rFonts w:hint="default" w:ascii="Wingdings" w:hAnsi="Wingdings" w:cs="Wingdings"/>
         <w:sz w:val="20"/>
       </w:rPr>
     </w:lvl>
@@ -3420,7 +3435,7 @@
         <w:ind w:start="5040" w:hanging="360"/>
       </w:pPr>
       <w:rPr>
-        <w:rFonts w:ascii="Wingdings" w:hAnsi="Wingdings" w:cs="Wingdings" w:hint="default"/>
+        <w:rFonts w:hint="default" w:ascii="Wingdings" w:hAnsi="Wingdings" w:cs="Wingdings"/>
         <w:sz w:val="20"/>
       </w:rPr>
     </w:lvl>
@@ -3436,7 +3451,7 @@
         <w:ind w:start="5760" w:hanging="360"/>
       </w:pPr>
       <w:rPr>
-        <w:rFonts w:ascii="Wingdings" w:hAnsi="Wingdings" w:cs="Wingdings" w:hint="default"/>
+        <w:rFonts w:hint="default" w:ascii="Wingdings" w:hAnsi="Wingdings" w:cs="Wingdings"/>
         <w:sz w:val="20"/>
       </w:rPr>
     </w:lvl>
@@ -3452,10 +3467,11 @@
         <w:ind w:start="6480" w:hanging="360"/>
       </w:pPr>
       <w:rPr>
-        <w:rFonts w:ascii="Wingdings" w:hAnsi="Wingdings" w:cs="Wingdings" w:hint="default"/>
+        <w:rFonts w:hint="default" w:ascii="Wingdings" w:hAnsi="Wingdings" w:cs="Wingdings"/>
         <w:sz w:val="20"/>
       </w:rPr>
     </w:lvl>
+    <w:nsid w:val="5bd88be4"/>
   </w:abstractNum>
   <w:abstractNum w:abstractNumId="10">
     <w:lvl w:ilvl="0">
@@ -3470,7 +3486,7 @@
         <w:ind w:start="720" w:hanging="360"/>
       </w:pPr>
       <w:rPr>
-        <w:rFonts w:ascii="Symbol" w:hAnsi="Symbol" w:cs="Symbol" w:hint="default"/>
+        <w:rFonts w:hint="default" w:ascii="Symbol" w:hAnsi="Symbol" w:cs="Symbol"/>
         <w:sz w:val="20"/>
       </w:rPr>
     </w:lvl>
@@ -3486,7 +3502,7 @@
         <w:ind w:start="1440" w:hanging="360"/>
       </w:pPr>
       <w:rPr>
-        <w:rFonts w:ascii="Courier New" w:hAnsi="Courier New" w:cs="Courier New" w:hint="default"/>
+        <w:rFonts w:hint="default" w:ascii="Courier New" w:hAnsi="Courier New" w:cs="Courier New"/>
         <w:sz w:val="20"/>
       </w:rPr>
     </w:lvl>
@@ -3502,7 +3518,7 @@
         <w:ind w:start="2160" w:hanging="360"/>
       </w:pPr>
       <w:rPr>
-        <w:rFonts w:ascii="Wingdings" w:hAnsi="Wingdings" w:cs="Wingdings" w:hint="default"/>
+        <w:rFonts w:hint="default" w:ascii="Wingdings" w:hAnsi="Wingdings" w:cs="Wingdings"/>
         <w:sz w:val="20"/>
       </w:rPr>
     </w:lvl>
@@ -3518,7 +3534,7 @@
         <w:ind w:start="2880" w:hanging="360"/>
       </w:pPr>
       <w:rPr>
-        <w:rFonts w:ascii="Wingdings" w:hAnsi="Wingdings" w:cs="Wingdings" w:hint="default"/>
+        <w:rFonts w:hint="default" w:ascii="Wingdings" w:hAnsi="Wingdings" w:cs="Wingdings"/>
         <w:sz w:val="20"/>
       </w:rPr>
     </w:lvl>
@@ -3534,7 +3550,7 @@
         <w:ind w:start="3600" w:hanging="360"/>
       </w:pPr>
       <w:rPr>
-        <w:rFonts w:ascii="Wingdings" w:hAnsi="Wingdings" w:cs="Wingdings" w:hint="default"/>
+        <w:rFonts w:hint="default" w:ascii="Wingdings" w:hAnsi="Wingdings" w:cs="Wingdings"/>
         <w:sz w:val="20"/>
       </w:rPr>
     </w:lvl>
@@ -3550,7 +3566,7 @@
         <w:ind w:start="4320" w:hanging="360"/>
       </w:pPr>
       <w:rPr>
-        <w:rFonts w:ascii="Wingdings" w:hAnsi="Wingdings" w:cs="Wingdings" w:hint="default"/>
+        <w:rFonts w:hint="default" w:ascii="Wingdings" w:hAnsi="Wingdings" w:cs="Wingdings"/>
         <w:sz w:val="20"/>
       </w:rPr>
     </w:lvl>
@@ -3566,7 +3582,7 @@
         <w:ind w:start="5040" w:hanging="360"/>
       </w:pPr>
       <w:rPr>
-        <w:rFonts w:ascii="Wingdings" w:hAnsi="Wingdings" w:cs="Wingdings" w:hint="default"/>
+        <w:rFonts w:hint="default" w:ascii="Wingdings" w:hAnsi="Wingdings" w:cs="Wingdings"/>
         <w:sz w:val="20"/>
       </w:rPr>
     </w:lvl>
@@ -3582,7 +3598,7 @@
         <w:ind w:start="5760" w:hanging="360"/>
       </w:pPr>
       <w:rPr>
-        <w:rFonts w:ascii="Wingdings" w:hAnsi="Wingdings" w:cs="Wingdings" w:hint="default"/>
+        <w:rFonts w:hint="default" w:ascii="Wingdings" w:hAnsi="Wingdings" w:cs="Wingdings"/>
         <w:sz w:val="20"/>
       </w:rPr>
     </w:lvl>
@@ -3598,10 +3614,11 @@
         <w:ind w:start="6480" w:hanging="360"/>
       </w:pPr>
       <w:rPr>
-        <w:rFonts w:ascii="Wingdings" w:hAnsi="Wingdings" w:cs="Wingdings" w:hint="default"/>
+        <w:rFonts w:hint="default" w:ascii="Wingdings" w:hAnsi="Wingdings" w:cs="Wingdings"/>
         <w:sz w:val="20"/>
       </w:rPr>
     </w:lvl>
+    <w:nsid w:val="46f84fd5"/>
   </w:abstractNum>
   <w:abstractNum w:abstractNumId="11">
     <w:lvl w:ilvl="0">
@@ -3616,7 +3633,7 @@
         <w:ind w:start="720" w:hanging="360"/>
       </w:pPr>
       <w:rPr>
-        <w:rFonts w:ascii="Symbol" w:hAnsi="Symbol" w:cs="Symbol" w:hint="default"/>
+        <w:rFonts w:hint="default" w:ascii="Symbol" w:hAnsi="Symbol" w:cs="Symbol"/>
         <w:sz w:val="20"/>
       </w:rPr>
     </w:lvl>
@@ -3632,7 +3649,7 @@
         <w:ind w:start="1440" w:hanging="360"/>
       </w:pPr>
       <w:rPr>
-        <w:rFonts w:ascii="Courier New" w:hAnsi="Courier New" w:cs="Courier New" w:hint="default"/>
+        <w:rFonts w:hint="default" w:ascii="Courier New" w:hAnsi="Courier New" w:cs="Courier New"/>
         <w:sz w:val="20"/>
       </w:rPr>
     </w:lvl>
@@ -3648,7 +3665,7 @@
         <w:ind w:start="2160" w:hanging="360"/>
       </w:pPr>
       <w:rPr>
-        <w:rFonts w:ascii="Wingdings" w:hAnsi="Wingdings" w:cs="Wingdings" w:hint="default"/>
+        <w:rFonts w:hint="default" w:ascii="Wingdings" w:hAnsi="Wingdings" w:cs="Wingdings"/>
         <w:sz w:val="20"/>
       </w:rPr>
     </w:lvl>
@@ -3664,7 +3681,7 @@
         <w:ind w:start="2880" w:hanging="360"/>
       </w:pPr>
       <w:rPr>
-        <w:rFonts w:ascii="Wingdings" w:hAnsi="Wingdings" w:cs="Wingdings" w:hint="default"/>
+        <w:rFonts w:hint="default" w:ascii="Wingdings" w:hAnsi="Wingdings" w:cs="Wingdings"/>
         <w:sz w:val="20"/>
       </w:rPr>
     </w:lvl>
@@ -3680,7 +3697,7 @@
         <w:ind w:start="3600" w:hanging="360"/>
       </w:pPr>
       <w:rPr>
-        <w:rFonts w:ascii="Wingdings" w:hAnsi="Wingdings" w:cs="Wingdings" w:hint="default"/>
+        <w:rFonts w:hint="default" w:ascii="Wingdings" w:hAnsi="Wingdings" w:cs="Wingdings"/>
         <w:sz w:val="20"/>
       </w:rPr>
     </w:lvl>
@@ -3696,7 +3713,7 @@
         <w:ind w:start="4320" w:hanging="360"/>
       </w:pPr>
       <w:rPr>
-        <w:rFonts w:ascii="Wingdings" w:hAnsi="Wingdings" w:cs="Wingdings" w:hint="default"/>
+        <w:rFonts w:hint="default" w:ascii="Wingdings" w:hAnsi="Wingdings" w:cs="Wingdings"/>
         <w:sz w:val="20"/>
       </w:rPr>
     </w:lvl>
@@ -3712,7 +3729,7 @@
         <w:ind w:start="5040" w:hanging="360"/>
       </w:pPr>
       <w:rPr>
-        <w:rFonts w:ascii="Wingdings" w:hAnsi="Wingdings" w:cs="Wingdings" w:hint="default"/>
+        <w:rFonts w:hint="default" w:ascii="Wingdings" w:hAnsi="Wingdings" w:cs="Wingdings"/>
         <w:sz w:val="20"/>
       </w:rPr>
     </w:lvl>
@@ -3728,7 +3745,7 @@
         <w:ind w:start="5760" w:hanging="360"/>
       </w:pPr>
       <w:rPr>
-        <w:rFonts w:ascii="Wingdings" w:hAnsi="Wingdings" w:cs="Wingdings" w:hint="default"/>
+        <w:rFonts w:hint="default" w:ascii="Wingdings" w:hAnsi="Wingdings" w:cs="Wingdings"/>
         <w:sz w:val="20"/>
       </w:rPr>
     </w:lvl>
@@ -3744,10 +3761,11 @@
         <w:ind w:start="6480" w:hanging="360"/>
       </w:pPr>
       <w:rPr>
-        <w:rFonts w:ascii="Wingdings" w:hAnsi="Wingdings" w:cs="Wingdings" w:hint="default"/>
+        <w:rFonts w:hint="default" w:ascii="Wingdings" w:hAnsi="Wingdings" w:cs="Wingdings"/>
         <w:sz w:val="20"/>
       </w:rPr>
     </w:lvl>
+    <w:nsid w:val="3b5dc83f"/>
   </w:abstractNum>
   <w:abstractNum w:abstractNumId="12">
     <w:lvl w:ilvl="0">
@@ -3762,7 +3780,7 @@
         <w:ind w:start="709" w:hanging="283"/>
       </w:pPr>
       <w:rPr>
-        <w:rFonts w:ascii="Symbol" w:hAnsi="Symbol" w:cs="Symbol" w:hint="default"/>
+        <w:rFonts w:hint="default" w:ascii="Symbol" w:hAnsi="Symbol" w:cs="Symbol"/>
       </w:rPr>
     </w:lvl>
     <w:lvl w:ilvl="1">
@@ -3777,7 +3795,7 @@
         <w:ind w:start="1418" w:hanging="283"/>
       </w:pPr>
       <w:rPr>
-        <w:rFonts w:ascii="Symbol" w:hAnsi="Symbol" w:cs="Symbol" w:hint="default"/>
+        <w:rFonts w:hint="default" w:ascii="Symbol" w:hAnsi="Symbol" w:cs="Symbol"/>
       </w:rPr>
     </w:lvl>
     <w:lvl w:ilvl="2">
@@ -3792,7 +3810,7 @@
         <w:ind w:start="2127" w:hanging="283"/>
       </w:pPr>
       <w:rPr>
-        <w:rFonts w:ascii="Symbol" w:hAnsi="Symbol" w:cs="Symbol" w:hint="default"/>
+        <w:rFonts w:hint="default" w:ascii="Symbol" w:hAnsi="Symbol" w:cs="Symbol"/>
       </w:rPr>
     </w:lvl>
     <w:lvl w:ilvl="3">
@@ -3807,7 +3825,7 @@
         <w:ind w:start="2836" w:hanging="283"/>
       </w:pPr>
       <w:rPr>
-        <w:rFonts w:ascii="Symbol" w:hAnsi="Symbol" w:cs="Symbol" w:hint="default"/>
+        <w:rFonts w:hint="default" w:ascii="Symbol" w:hAnsi="Symbol" w:cs="Symbol"/>
       </w:rPr>
     </w:lvl>
     <w:lvl w:ilvl="4">
@@ -3822,7 +3840,7 @@
         <w:ind w:start="3545" w:hanging="283"/>
       </w:pPr>
       <w:rPr>
-        <w:rFonts w:ascii="Symbol" w:hAnsi="Symbol" w:cs="Symbol" w:hint="default"/>
+        <w:rFonts w:hint="default" w:ascii="Symbol" w:hAnsi="Symbol" w:cs="Symbol"/>
       </w:rPr>
     </w:lvl>
     <w:lvl w:ilvl="5">
@@ -3837,7 +3855,7 @@
         <w:ind w:start="4254" w:hanging="283"/>
       </w:pPr>
       <w:rPr>
-        <w:rFonts w:ascii="Symbol" w:hAnsi="Symbol" w:cs="Symbol" w:hint="default"/>
+        <w:rFonts w:hint="default" w:ascii="Symbol" w:hAnsi="Symbol" w:cs="Symbol"/>
       </w:rPr>
     </w:lvl>
     <w:lvl w:ilvl="6">
@@ -3852,7 +3870,7 @@
         <w:ind w:start="4963" w:hanging="283"/>
       </w:pPr>
       <w:rPr>
-        <w:rFonts w:ascii="Symbol" w:hAnsi="Symbol" w:cs="Symbol" w:hint="default"/>
+        <w:rFonts w:hint="default" w:ascii="Symbol" w:hAnsi="Symbol" w:cs="Symbol"/>
       </w:rPr>
     </w:lvl>
     <w:lvl w:ilvl="7">
@@ -3867,7 +3885,7 @@
         <w:ind w:start="5672" w:hanging="283"/>
       </w:pPr>
       <w:rPr>
-        <w:rFonts w:ascii="Symbol" w:hAnsi="Symbol" w:cs="Symbol" w:hint="default"/>
+        <w:rFonts w:hint="default" w:ascii="Symbol" w:hAnsi="Symbol" w:cs="Symbol"/>
       </w:rPr>
     </w:lvl>
     <w:lvl w:ilvl="8">
@@ -3882,9 +3900,10 @@
         <w:ind w:start="6381" w:hanging="283"/>
       </w:pPr>
       <w:rPr>
-        <w:rFonts w:ascii="Symbol" w:hAnsi="Symbol" w:cs="Symbol" w:hint="default"/>
-      </w:rPr>
-    </w:lvl>
+        <w:rFonts w:hint="default" w:ascii="Symbol" w:hAnsi="Symbol" w:cs="Symbol"/>
+      </w:rPr>
+    </w:lvl>
+    <w:nsid w:val="28bacbda"/>
   </w:abstractNum>
   <w:abstractNum w:abstractNumId="13">
     <w:lvl w:ilvl="0">
@@ -3899,7 +3918,7 @@
         <w:ind w:start="709" w:hanging="283"/>
       </w:pPr>
       <w:rPr>
-        <w:rFonts w:ascii="Symbol" w:hAnsi="Symbol" w:cs="Symbol" w:hint="default"/>
+        <w:rFonts w:hint="default" w:ascii="Symbol" w:hAnsi="Symbol" w:cs="Symbol"/>
       </w:rPr>
     </w:lvl>
     <w:lvl w:ilvl="1">
@@ -3914,7 +3933,7 @@
         <w:ind w:start="1418" w:hanging="283"/>
       </w:pPr>
       <w:rPr>
-        <w:rFonts w:ascii="Symbol" w:hAnsi="Symbol" w:cs="Symbol" w:hint="default"/>
+        <w:rFonts w:hint="default" w:ascii="Symbol" w:hAnsi="Symbol" w:cs="Symbol"/>
       </w:rPr>
     </w:lvl>
     <w:lvl w:ilvl="2">
@@ -3929,7 +3948,7 @@
         <w:ind w:start="2127" w:hanging="283"/>
       </w:pPr>
       <w:rPr>
-        <w:rFonts w:ascii="Symbol" w:hAnsi="Symbol" w:cs="Symbol" w:hint="default"/>
+        <w:rFonts w:hint="default" w:ascii="Symbol" w:hAnsi="Symbol" w:cs="Symbol"/>
       </w:rPr>
     </w:lvl>
     <w:lvl w:ilvl="3">
@@ -3944,7 +3963,7 @@
         <w:ind w:start="2836" w:hanging="283"/>
       </w:pPr>
       <w:rPr>
-        <w:rFonts w:ascii="Symbol" w:hAnsi="Symbol" w:cs="Symbol" w:hint="default"/>
+        <w:rFonts w:hint="default" w:ascii="Symbol" w:hAnsi="Symbol" w:cs="Symbol"/>
       </w:rPr>
     </w:lvl>
     <w:lvl w:ilvl="4">
@@ -3959,7 +3978,7 @@
         <w:ind w:start="3545" w:hanging="283"/>
       </w:pPr>
       <w:rPr>
-        <w:rFonts w:ascii="Symbol" w:hAnsi="Symbol" w:cs="Symbol" w:hint="default"/>
+        <w:rFonts w:hint="default" w:ascii="Symbol" w:hAnsi="Symbol" w:cs="Symbol"/>
       </w:rPr>
     </w:lvl>
     <w:lvl w:ilvl="5">
@@ -3974,7 +3993,7 @@
         <w:ind w:start="4254" w:hanging="283"/>
       </w:pPr>
       <w:rPr>
-        <w:rFonts w:ascii="Symbol" w:hAnsi="Symbol" w:cs="Symbol" w:hint="default"/>
+        <w:rFonts w:hint="default" w:ascii="Symbol" w:hAnsi="Symbol" w:cs="Symbol"/>
       </w:rPr>
     </w:lvl>
     <w:lvl w:ilvl="6">
@@ -3989,7 +4008,7 @@
         <w:ind w:start="4963" w:hanging="283"/>
       </w:pPr>
       <w:rPr>
-        <w:rFonts w:ascii="Symbol" w:hAnsi="Symbol" w:cs="Symbol" w:hint="default"/>
+        <w:rFonts w:hint="default" w:ascii="Symbol" w:hAnsi="Symbol" w:cs="Symbol"/>
       </w:rPr>
     </w:lvl>
     <w:lvl w:ilvl="7">
@@ -4004,7 +4023,7 @@
         <w:ind w:start="5672" w:hanging="283"/>
       </w:pPr>
       <w:rPr>
-        <w:rFonts w:ascii="Symbol" w:hAnsi="Symbol" w:cs="Symbol" w:hint="default"/>
+        <w:rFonts w:hint="default" w:ascii="Symbol" w:hAnsi="Symbol" w:cs="Symbol"/>
       </w:rPr>
     </w:lvl>
     <w:lvl w:ilvl="8">
@@ -4019,9 +4038,10 @@
         <w:ind w:start="6381" w:hanging="283"/>
       </w:pPr>
       <w:rPr>
-        <w:rFonts w:ascii="Symbol" w:hAnsi="Symbol" w:cs="Symbol" w:hint="default"/>
-      </w:rPr>
-    </w:lvl>
+        <w:rFonts w:hint="default" w:ascii="Symbol" w:hAnsi="Symbol" w:cs="Symbol"/>
+      </w:rPr>
+    </w:lvl>
+    <w:nsid w:val="28967045"/>
   </w:abstractNum>
   <w:abstractNum w:abstractNumId="14">
     <w:lvl w:ilvl="0">
@@ -4036,7 +4056,7 @@
         <w:ind w:start="709" w:hanging="283"/>
       </w:pPr>
       <w:rPr>
-        <w:rFonts w:ascii="Symbol" w:hAnsi="Symbol" w:cs="Symbol" w:hint="default"/>
+        <w:rFonts w:hint="default" w:ascii="Symbol" w:hAnsi="Symbol" w:cs="Symbol"/>
       </w:rPr>
     </w:lvl>
     <w:lvl w:ilvl="1">
@@ -4051,7 +4071,7 @@
         <w:ind w:start="1418" w:hanging="283"/>
       </w:pPr>
       <w:rPr>
-        <w:rFonts w:ascii="Symbol" w:hAnsi="Symbol" w:cs="Symbol" w:hint="default"/>
+        <w:rFonts w:hint="default" w:ascii="Symbol" w:hAnsi="Symbol" w:cs="Symbol"/>
       </w:rPr>
     </w:lvl>
     <w:lvl w:ilvl="2">
@@ -4066,7 +4086,7 @@
         <w:ind w:start="2127" w:hanging="283"/>
       </w:pPr>
       <w:rPr>
-        <w:rFonts w:ascii="Symbol" w:hAnsi="Symbol" w:cs="Symbol" w:hint="default"/>
+        <w:rFonts w:hint="default" w:ascii="Symbol" w:hAnsi="Symbol" w:cs="Symbol"/>
       </w:rPr>
     </w:lvl>
     <w:lvl w:ilvl="3">
@@ -4081,7 +4101,7 @@
         <w:ind w:start="2836" w:hanging="283"/>
       </w:pPr>
       <w:rPr>
-        <w:rFonts w:ascii="Symbol" w:hAnsi="Symbol" w:cs="Symbol" w:hint="default"/>
+        <w:rFonts w:hint="default" w:ascii="Symbol" w:hAnsi="Symbol" w:cs="Symbol"/>
       </w:rPr>
     </w:lvl>
     <w:lvl w:ilvl="4">
@@ -4096,7 +4116,7 @@
         <w:ind w:start="3545" w:hanging="283"/>
       </w:pPr>
       <w:rPr>
-        <w:rFonts w:ascii="Symbol" w:hAnsi="Symbol" w:cs="Symbol" w:hint="default"/>
+        <w:rFonts w:hint="default" w:ascii="Symbol" w:hAnsi="Symbol" w:cs="Symbol"/>
       </w:rPr>
     </w:lvl>
     <w:lvl w:ilvl="5">
@@ -4111,7 +4131,7 @@
         <w:ind w:start="4254" w:hanging="283"/>
       </w:pPr>
       <w:rPr>
-        <w:rFonts w:ascii="Symbol" w:hAnsi="Symbol" w:cs="Symbol" w:hint="default"/>
+        <w:rFonts w:hint="default" w:ascii="Symbol" w:hAnsi="Symbol" w:cs="Symbol"/>
       </w:rPr>
     </w:lvl>
     <w:lvl w:ilvl="6">
@@ -4126,7 +4146,7 @@
         <w:ind w:start="4963" w:hanging="283"/>
       </w:pPr>
       <w:rPr>
-        <w:rFonts w:ascii="Symbol" w:hAnsi="Symbol" w:cs="Symbol" w:hint="default"/>
+        <w:rFonts w:hint="default" w:ascii="Symbol" w:hAnsi="Symbol" w:cs="Symbol"/>
       </w:rPr>
     </w:lvl>
     <w:lvl w:ilvl="7">
@@ -4141,7 +4161,7 @@
         <w:ind w:start="5672" w:hanging="283"/>
       </w:pPr>
       <w:rPr>
-        <w:rFonts w:ascii="Symbol" w:hAnsi="Symbol" w:cs="Symbol" w:hint="default"/>
+        <w:rFonts w:hint="default" w:ascii="Symbol" w:hAnsi="Symbol" w:cs="Symbol"/>
       </w:rPr>
     </w:lvl>
     <w:lvl w:ilvl="8">
@@ -4156,9 +4176,10 @@
         <w:ind w:start="6381" w:hanging="283"/>
       </w:pPr>
       <w:rPr>
-        <w:rFonts w:ascii="Symbol" w:hAnsi="Symbol" w:cs="Symbol" w:hint="default"/>
-      </w:rPr>
-    </w:lvl>
+        <w:rFonts w:hint="default" w:ascii="Symbol" w:hAnsi="Symbol" w:cs="Symbol"/>
+      </w:rPr>
+    </w:lvl>
+    <w:nsid w:val="285579f3"/>
   </w:abstractNum>
   <w:abstractNum w:abstractNumId="15">
     <w:lvl w:ilvl="0">
@@ -4173,7 +4194,7 @@
         <w:ind w:start="709" w:hanging="283"/>
       </w:pPr>
       <w:rPr>
-        <w:rFonts w:ascii="Symbol" w:hAnsi="Symbol" w:cs="Symbol" w:hint="default"/>
+        <w:rFonts w:hint="default" w:ascii="Symbol" w:hAnsi="Symbol" w:cs="Symbol"/>
       </w:rPr>
     </w:lvl>
     <w:lvl w:ilvl="1">
@@ -4188,7 +4209,7 @@
         <w:ind w:start="1418" w:hanging="283"/>
       </w:pPr>
       <w:rPr>
-        <w:rFonts w:ascii="Symbol" w:hAnsi="Symbol" w:cs="Symbol" w:hint="default"/>
+        <w:rFonts w:hint="default" w:ascii="Symbol" w:hAnsi="Symbol" w:cs="Symbol"/>
       </w:rPr>
     </w:lvl>
     <w:lvl w:ilvl="2">
@@ -4203,7 +4224,7 @@
         <w:ind w:start="2127" w:hanging="283"/>
       </w:pPr>
       <w:rPr>
-        <w:rFonts w:ascii="Symbol" w:hAnsi="Symbol" w:cs="Symbol" w:hint="default"/>
+        <w:rFonts w:hint="default" w:ascii="Symbol" w:hAnsi="Symbol" w:cs="Symbol"/>
       </w:rPr>
     </w:lvl>
     <w:lvl w:ilvl="3">
@@ -4218,7 +4239,7 @@
         <w:ind w:start="2836" w:hanging="283"/>
       </w:pPr>
       <w:rPr>
-        <w:rFonts w:ascii="Symbol" w:hAnsi="Symbol" w:cs="Symbol" w:hint="default"/>
+        <w:rFonts w:hint="default" w:ascii="Symbol" w:hAnsi="Symbol" w:cs="Symbol"/>
       </w:rPr>
     </w:lvl>
     <w:lvl w:ilvl="4">
@@ -4233,7 +4254,7 @@
         <w:ind w:start="3545" w:hanging="283"/>
       </w:pPr>
       <w:rPr>
-        <w:rFonts w:ascii="Symbol" w:hAnsi="Symbol" w:cs="Symbol" w:hint="default"/>
+        <w:rFonts w:hint="default" w:ascii="Symbol" w:hAnsi="Symbol" w:cs="Symbol"/>
       </w:rPr>
     </w:lvl>
     <w:lvl w:ilvl="5">
@@ -4248,7 +4269,7 @@
         <w:ind w:start="4254" w:hanging="283"/>
       </w:pPr>
       <w:rPr>
-        <w:rFonts w:ascii="Symbol" w:hAnsi="Symbol" w:cs="Symbol" w:hint="default"/>
+        <w:rFonts w:hint="default" w:ascii="Symbol" w:hAnsi="Symbol" w:cs="Symbol"/>
       </w:rPr>
     </w:lvl>
     <w:lvl w:ilvl="6">
@@ -4263,7 +4284,7 @@
         <w:ind w:start="4963" w:hanging="283"/>
       </w:pPr>
       <w:rPr>
-        <w:rFonts w:ascii="Symbol" w:hAnsi="Symbol" w:cs="Symbol" w:hint="default"/>
+        <w:rFonts w:hint="default" w:ascii="Symbol" w:hAnsi="Symbol" w:cs="Symbol"/>
       </w:rPr>
     </w:lvl>
     <w:lvl w:ilvl="7">
@@ -4278,7 +4299,7 @@
         <w:ind w:start="5672" w:hanging="283"/>
       </w:pPr>
       <w:rPr>
-        <w:rFonts w:ascii="Symbol" w:hAnsi="Symbol" w:cs="Symbol" w:hint="default"/>
+        <w:rFonts w:hint="default" w:ascii="Symbol" w:hAnsi="Symbol" w:cs="Symbol"/>
       </w:rPr>
     </w:lvl>
     <w:lvl w:ilvl="8">
@@ -4293,9 +4314,10 @@
         <w:ind w:start="6381" w:hanging="283"/>
       </w:pPr>
       <w:rPr>
-        <w:rFonts w:ascii="Symbol" w:hAnsi="Symbol" w:cs="Symbol" w:hint="default"/>
-      </w:rPr>
-    </w:lvl>
+        <w:rFonts w:hint="default" w:ascii="Symbol" w:hAnsi="Symbol" w:cs="Symbol"/>
+      </w:rPr>
+    </w:lvl>
+    <w:nsid w:val="5d57f1f"/>
   </w:abstractNum>
   <w:abstractNum w:abstractNumId="16">
     <w:lvl w:ilvl="0">
@@ -4310,7 +4332,7 @@
         <w:ind w:start="709" w:hanging="283"/>
       </w:pPr>
       <w:rPr>
-        <w:rFonts w:ascii="Symbol" w:hAnsi="Symbol" w:cs="Symbol" w:hint="default"/>
+        <w:rFonts w:hint="default" w:ascii="Symbol" w:hAnsi="Symbol" w:cs="Symbol"/>
       </w:rPr>
     </w:lvl>
     <w:lvl w:ilvl="1">
@@ -4325,7 +4347,7 @@
         <w:ind w:start="1418" w:hanging="283"/>
       </w:pPr>
       <w:rPr>
-        <w:rFonts w:ascii="Symbol" w:hAnsi="Symbol" w:cs="Symbol" w:hint="default"/>
+        <w:rFonts w:hint="default" w:ascii="Symbol" w:hAnsi="Symbol" w:cs="Symbol"/>
       </w:rPr>
     </w:lvl>
     <w:lvl w:ilvl="2">
@@ -4340,7 +4362,7 @@
         <w:ind w:start="2127" w:hanging="283"/>
       </w:pPr>
       <w:rPr>
-        <w:rFonts w:ascii="Symbol" w:hAnsi="Symbol" w:cs="Symbol" w:hint="default"/>
+        <w:rFonts w:hint="default" w:ascii="Symbol" w:hAnsi="Symbol" w:cs="Symbol"/>
       </w:rPr>
     </w:lvl>
     <w:lvl w:ilvl="3">
@@ -4355,7 +4377,7 @@
         <w:ind w:start="2836" w:hanging="283"/>
       </w:pPr>
       <w:rPr>
-        <w:rFonts w:ascii="Symbol" w:hAnsi="Symbol" w:cs="Symbol" w:hint="default"/>
+        <w:rFonts w:hint="default" w:ascii="Symbol" w:hAnsi="Symbol" w:cs="Symbol"/>
       </w:rPr>
     </w:lvl>
     <w:lvl w:ilvl="4">
@@ -4370,7 +4392,7 @@
         <w:ind w:start="3545" w:hanging="283"/>
       </w:pPr>
       <w:rPr>
-        <w:rFonts w:ascii="Symbol" w:hAnsi="Symbol" w:cs="Symbol" w:hint="default"/>
+        <w:rFonts w:hint="default" w:ascii="Symbol" w:hAnsi="Symbol" w:cs="Symbol"/>
       </w:rPr>
     </w:lvl>
     <w:lvl w:ilvl="5">
@@ -4385,7 +4407,7 @@
         <w:ind w:start="4254" w:hanging="283"/>
       </w:pPr>
       <w:rPr>
-        <w:rFonts w:ascii="Symbol" w:hAnsi="Symbol" w:cs="Symbol" w:hint="default"/>
+        <w:rFonts w:hint="default" w:ascii="Symbol" w:hAnsi="Symbol" w:cs="Symbol"/>
       </w:rPr>
     </w:lvl>
     <w:lvl w:ilvl="6">
@@ -4400,7 +4422,7 @@
         <w:ind w:start="4963" w:hanging="283"/>
       </w:pPr>
       <w:rPr>
-        <w:rFonts w:ascii="Symbol" w:hAnsi="Symbol" w:cs="Symbol" w:hint="default"/>
+        <w:rFonts w:hint="default" w:ascii="Symbol" w:hAnsi="Symbol" w:cs="Symbol"/>
       </w:rPr>
     </w:lvl>
     <w:lvl w:ilvl="7">
@@ -4415,7 +4437,7 @@
         <w:ind w:start="5672" w:hanging="283"/>
       </w:pPr>
       <w:rPr>
-        <w:rFonts w:ascii="Symbol" w:hAnsi="Symbol" w:cs="Symbol" w:hint="default"/>
+        <w:rFonts w:hint="default" w:ascii="Symbol" w:hAnsi="Symbol" w:cs="Symbol"/>
       </w:rPr>
     </w:lvl>
     <w:lvl w:ilvl="8">
@@ -4430,9 +4452,10 @@
         <w:ind w:start="6381" w:hanging="283"/>
       </w:pPr>
       <w:rPr>
-        <w:rFonts w:ascii="Symbol" w:hAnsi="Symbol" w:cs="Symbol" w:hint="default"/>
-      </w:rPr>
-    </w:lvl>
+        <w:rFonts w:hint="default" w:ascii="Symbol" w:hAnsi="Symbol" w:cs="Symbol"/>
+      </w:rPr>
+    </w:lvl>
+    <w:nsid w:val="4e62d264"/>
   </w:abstractNum>
   <w:abstractNum w:abstractNumId="17">
     <w:lvl w:ilvl="0">
@@ -4447,7 +4470,7 @@
         <w:ind w:start="709" w:hanging="283"/>
       </w:pPr>
       <w:rPr>
-        <w:rFonts w:ascii="Symbol" w:hAnsi="Symbol" w:cs="Symbol" w:hint="default"/>
+        <w:rFonts w:hint="default" w:ascii="Symbol" w:hAnsi="Symbol" w:cs="Symbol"/>
       </w:rPr>
     </w:lvl>
     <w:lvl w:ilvl="1">
@@ -4462,7 +4485,7 @@
         <w:ind w:start="1418" w:hanging="283"/>
       </w:pPr>
       <w:rPr>
-        <w:rFonts w:ascii="Symbol" w:hAnsi="Symbol" w:cs="Symbol" w:hint="default"/>
+        <w:rFonts w:hint="default" w:ascii="Symbol" w:hAnsi="Symbol" w:cs="Symbol"/>
       </w:rPr>
     </w:lvl>
     <w:lvl w:ilvl="2">
@@ -4477,7 +4500,7 @@
         <w:ind w:start="2127" w:hanging="283"/>
       </w:pPr>
       <w:rPr>
-        <w:rFonts w:ascii="Symbol" w:hAnsi="Symbol" w:cs="Symbol" w:hint="default"/>
+        <w:rFonts w:hint="default" w:ascii="Symbol" w:hAnsi="Symbol" w:cs="Symbol"/>
       </w:rPr>
     </w:lvl>
     <w:lvl w:ilvl="3">
@@ -4492,7 +4515,7 @@
         <w:ind w:start="2836" w:hanging="283"/>
       </w:pPr>
       <w:rPr>
-        <w:rFonts w:ascii="Symbol" w:hAnsi="Symbol" w:cs="Symbol" w:hint="default"/>
+        <w:rFonts w:hint="default" w:ascii="Symbol" w:hAnsi="Symbol" w:cs="Symbol"/>
       </w:rPr>
     </w:lvl>
     <w:lvl w:ilvl="4">
@@ -4507,7 +4530,7 @@
         <w:ind w:start="3545" w:hanging="283"/>
       </w:pPr>
       <w:rPr>
-        <w:rFonts w:ascii="Symbol" w:hAnsi="Symbol" w:cs="Symbol" w:hint="default"/>
+        <w:rFonts w:hint="default" w:ascii="Symbol" w:hAnsi="Symbol" w:cs="Symbol"/>
       </w:rPr>
     </w:lvl>
     <w:lvl w:ilvl="5">
@@ -4522,7 +4545,7 @@
         <w:ind w:start="4254" w:hanging="283"/>
       </w:pPr>
       <w:rPr>
-        <w:rFonts w:ascii="Symbol" w:hAnsi="Symbol" w:cs="Symbol" w:hint="default"/>
+        <w:rFonts w:hint="default" w:ascii="Symbol" w:hAnsi="Symbol" w:cs="Symbol"/>
       </w:rPr>
     </w:lvl>
     <w:lvl w:ilvl="6">
@@ -4537,7 +4560,7 @@
         <w:ind w:start="4963" w:hanging="283"/>
       </w:pPr>
       <w:rPr>
-        <w:rFonts w:ascii="Symbol" w:hAnsi="Symbol" w:cs="Symbol" w:hint="default"/>
+        <w:rFonts w:hint="default" w:ascii="Symbol" w:hAnsi="Symbol" w:cs="Symbol"/>
       </w:rPr>
     </w:lvl>
     <w:lvl w:ilvl="7">
@@ -4552,7 +4575,7 @@
         <w:ind w:start="5672" w:hanging="283"/>
       </w:pPr>
       <w:rPr>
-        <w:rFonts w:ascii="Symbol" w:hAnsi="Symbol" w:cs="Symbol" w:hint="default"/>
+        <w:rFonts w:hint="default" w:ascii="Symbol" w:hAnsi="Symbol" w:cs="Symbol"/>
       </w:rPr>
     </w:lvl>
     <w:lvl w:ilvl="8">
@@ -4567,9 +4590,10 @@
         <w:ind w:start="6381" w:hanging="283"/>
       </w:pPr>
       <w:rPr>
-        <w:rFonts w:ascii="Symbol" w:hAnsi="Symbol" w:cs="Symbol" w:hint="default"/>
-      </w:rPr>
-    </w:lvl>
+        <w:rFonts w:hint="default" w:ascii="Symbol" w:hAnsi="Symbol" w:cs="Symbol"/>
+      </w:rPr>
+    </w:lvl>
+    <w:nsid w:val="15973d89"/>
   </w:abstractNum>
   <w:abstractNum w:abstractNumId="18">
     <w:lvl w:ilvl="0">
@@ -4584,7 +4608,7 @@
         <w:ind w:start="709" w:hanging="283"/>
       </w:pPr>
       <w:rPr>
-        <w:rFonts w:ascii="Symbol" w:hAnsi="Symbol" w:cs="Symbol" w:hint="default"/>
+        <w:rFonts w:hint="default" w:ascii="Symbol" w:hAnsi="Symbol" w:cs="Symbol"/>
       </w:rPr>
     </w:lvl>
     <w:lvl w:ilvl="1">
@@ -4599,7 +4623,7 @@
         <w:ind w:start="1418" w:hanging="283"/>
       </w:pPr>
       <w:rPr>
-        <w:rFonts w:ascii="Symbol" w:hAnsi="Symbol" w:cs="Symbol" w:hint="default"/>
+        <w:rFonts w:hint="default" w:ascii="Symbol" w:hAnsi="Symbol" w:cs="Symbol"/>
       </w:rPr>
     </w:lvl>
     <w:lvl w:ilvl="2">
@@ -4614,7 +4638,7 @@
         <w:ind w:start="2127" w:hanging="283"/>
       </w:pPr>
       <w:rPr>
-        <w:rFonts w:ascii="Symbol" w:hAnsi="Symbol" w:cs="Symbol" w:hint="default"/>
+        <w:rFonts w:hint="default" w:ascii="Symbol" w:hAnsi="Symbol" w:cs="Symbol"/>
       </w:rPr>
     </w:lvl>
     <w:lvl w:ilvl="3">
@@ -4629,7 +4653,7 @@
         <w:ind w:start="2836" w:hanging="283"/>
       </w:pPr>
       <w:rPr>
-        <w:rFonts w:ascii="Symbol" w:hAnsi="Symbol" w:cs="Symbol" w:hint="default"/>
+        <w:rFonts w:hint="default" w:ascii="Symbol" w:hAnsi="Symbol" w:cs="Symbol"/>
       </w:rPr>
     </w:lvl>
     <w:lvl w:ilvl="4">
@@ -4644,7 +4668,7 @@
         <w:ind w:start="3545" w:hanging="283"/>
       </w:pPr>
       <w:rPr>
-        <w:rFonts w:ascii="Symbol" w:hAnsi="Symbol" w:cs="Symbol" w:hint="default"/>
+        <w:rFonts w:hint="default" w:ascii="Symbol" w:hAnsi="Symbol" w:cs="Symbol"/>
       </w:rPr>
     </w:lvl>
     <w:lvl w:ilvl="5">
@@ -4659,7 +4683,7 @@
         <w:ind w:start="4254" w:hanging="283"/>
       </w:pPr>
       <w:rPr>
-        <w:rFonts w:ascii="Symbol" w:hAnsi="Symbol" w:cs="Symbol" w:hint="default"/>
+        <w:rFonts w:hint="default" w:ascii="Symbol" w:hAnsi="Symbol" w:cs="Symbol"/>
       </w:rPr>
     </w:lvl>
     <w:lvl w:ilvl="6">
@@ -4674,7 +4698,7 @@
         <w:ind w:start="4963" w:hanging="283"/>
       </w:pPr>
       <w:rPr>
-        <w:rFonts w:ascii="Symbol" w:hAnsi="Symbol" w:cs="Symbol" w:hint="default"/>
+        <w:rFonts w:hint="default" w:ascii="Symbol" w:hAnsi="Symbol" w:cs="Symbol"/>
       </w:rPr>
     </w:lvl>
     <w:lvl w:ilvl="7">
@@ -4689,7 +4713,7 @@
         <w:ind w:start="5672" w:hanging="283"/>
       </w:pPr>
       <w:rPr>
-        <w:rFonts w:ascii="Symbol" w:hAnsi="Symbol" w:cs="Symbol" w:hint="default"/>
+        <w:rFonts w:hint="default" w:ascii="Symbol" w:hAnsi="Symbol" w:cs="Symbol"/>
       </w:rPr>
     </w:lvl>
     <w:lvl w:ilvl="8">
@@ -4704,9 +4728,10 @@
         <w:ind w:start="6381" w:hanging="283"/>
       </w:pPr>
       <w:rPr>
-        <w:rFonts w:ascii="Symbol" w:hAnsi="Symbol" w:cs="Symbol" w:hint="default"/>
-      </w:rPr>
-    </w:lvl>
+        <w:rFonts w:hint="default" w:ascii="Symbol" w:hAnsi="Symbol" w:cs="Symbol"/>
+      </w:rPr>
+    </w:lvl>
+    <w:nsid w:val="32614ec7"/>
   </w:abstractNum>
   <w:abstractNum w:abstractNumId="19">
     <w:lvl w:ilvl="0">
@@ -4826,6 +4851,7 @@
         <w:ind w:start="0" w:hanging="0"/>
       </w:pPr>
     </w:lvl>
+    <w:nsid w:val="2e48182f"/>
   </w:abstractNum>
   <w:num w:numId="1">
     <w:abstractNumId w:val="1"/>
@@ -4888,11 +4914,11 @@
 </file>
 
 <file path=word/styles.xml><?xml version="1.0" encoding="utf-8"?>
-<w:styles xmlns:w="http://schemas.openxmlformats.org/wordprocessingml/2006/main" xmlns:w14="http://schemas.microsoft.com/office/word/2010/wordml" xmlns:mc="http://schemas.openxmlformats.org/markup-compatibility/2006" mc:Ignorable="w14">
+<w:styles xmlns:wp14="http://schemas.microsoft.com/office/word/2010/wordprocessingDrawing" xmlns:w="http://schemas.openxmlformats.org/wordprocessingml/2006/main" xmlns:w14="http://schemas.microsoft.com/office/word/2010/wordml" xmlns:mc="http://schemas.openxmlformats.org/markup-compatibility/2006" mc:Ignorable="w14 wp14">
   <w:docDefaults>
     <w:rPrDefault>
       <w:rPr>
-        <w:rFonts w:ascii="Aptos" w:hAnsi="Aptos" w:eastAsia="Aptos" w:cs="" w:asciiTheme="minorHAnsi" w:cstheme="minorBidi" w:eastAsiaTheme="minorHAnsi" w:hAnsiTheme="minorHAnsi"/>
+        <w:rFonts w:ascii="Aptos" w:hAnsi="Aptos" w:eastAsia="Aptos" w:cs="" w:asciiTheme="minorHAnsi" w:hAnsiTheme="minorHAnsi" w:eastAsiaTheme="minorHAnsi" w:cstheme="minorBidi"/>
         <w:kern w:val="2"/>
         <w:sz w:val="24"/>
         <w:szCs w:val="24"/>
@@ -5291,11 +5317,11 @@
       <w:widowControl/>
       <w:suppressAutoHyphens w:val="true"/>
       <w:bidi w:val="0"/>
-      <w:spacing w:lineRule="auto" w:line="278" w:before="0" w:after="160"/>
+      <w:spacing w:before="0" w:after="160" w:line="278" w:lineRule="auto"/>
       <w:jc w:val="start"/>
     </w:pPr>
     <w:rPr>
-      <w:rFonts w:ascii="Aptos" w:hAnsi="Aptos" w:eastAsia="Aptos" w:cs="" w:asciiTheme="minorHAnsi" w:cstheme="minorBidi" w:eastAsiaTheme="minorHAnsi" w:hAnsiTheme="minorHAnsi"/>
+      <w:rFonts w:ascii="Aptos" w:hAnsi="Aptos" w:eastAsia="Aptos" w:cs="" w:asciiTheme="minorHAnsi" w:hAnsiTheme="minorHAnsi" w:eastAsiaTheme="minorHAnsi" w:cstheme="minorBidi"/>
       <w:color w:val="auto"/>
       <w:kern w:val="2"/>
       <w:sz w:val="24"/>
@@ -5319,8 +5345,8 @@
       <w:outlineLvl w:val="0"/>
     </w:pPr>
     <w:rPr>
-      <w:rFonts w:ascii="Aptos Display" w:hAnsi="Aptos Display" w:eastAsia="" w:cs="" w:asciiTheme="majorHAnsi" w:cstheme="majorBidi" w:eastAsiaTheme="majorEastAsia" w:hAnsiTheme="majorHAnsi"/>
-      <w:color w:themeColor="accent1" w:themeShade="bf" w:val="0F4761"/>
+      <w:rFonts w:ascii="Aptos Display" w:hAnsi="Aptos Display" w:eastAsia="" w:cs="" w:asciiTheme="majorHAnsi" w:hAnsiTheme="majorHAnsi" w:eastAsiaTheme="majorEastAsia" w:cstheme="majorBidi"/>
+      <w:color w:val="0F4761" w:themeColor="accent1" w:themeShade="bf"/>
       <w:sz w:val="40"/>
       <w:szCs w:val="40"/>
     </w:rPr>
@@ -5342,8 +5368,8 @@
       <w:outlineLvl w:val="1"/>
     </w:pPr>
     <w:rPr>
-      <w:rFonts w:ascii="Aptos Display" w:hAnsi="Aptos Display" w:eastAsia="" w:cs="" w:asciiTheme="majorHAnsi" w:cstheme="majorBidi" w:eastAsiaTheme="majorEastAsia" w:hAnsiTheme="majorHAnsi"/>
-      <w:color w:themeColor="accent1" w:themeShade="bf" w:val="0F4761"/>
+      <w:rFonts w:ascii="Aptos Display" w:hAnsi="Aptos Display" w:eastAsia="" w:cs="" w:asciiTheme="majorHAnsi" w:hAnsiTheme="majorHAnsi" w:eastAsiaTheme="majorEastAsia" w:cstheme="majorBidi"/>
+      <w:color w:val="0F4761" w:themeColor="accent1" w:themeShade="bf"/>
       <w:sz w:val="32"/>
       <w:szCs w:val="32"/>
     </w:rPr>
@@ -5365,8 +5391,8 @@
       <w:outlineLvl w:val="2"/>
     </w:pPr>
     <w:rPr>
-      <w:rFonts w:eastAsia="" w:cs="" w:cstheme="majorBidi" w:eastAsiaTheme="majorEastAsia"/>
-      <w:color w:themeColor="accent1" w:themeShade="bf" w:val="0F4761"/>
+      <w:rFonts w:eastAsia="" w:cs="" w:eastAsiaTheme="majorEastAsia" w:cstheme="majorBidi"/>
+      <w:color w:val="0F4761" w:themeColor="accent1" w:themeShade="bf"/>
       <w:sz w:val="28"/>
       <w:szCs w:val="28"/>
     </w:rPr>
@@ -5388,10 +5414,10 @@
       <w:outlineLvl w:val="3"/>
     </w:pPr>
     <w:rPr>
-      <w:rFonts w:eastAsia="" w:cs="" w:cstheme="majorBidi" w:eastAsiaTheme="majorEastAsia"/>
+      <w:rFonts w:eastAsia="" w:cs="" w:eastAsiaTheme="majorEastAsia" w:cstheme="majorBidi"/>
       <w:i/>
       <w:iCs/>
-      <w:color w:themeColor="accent1" w:themeShade="bf" w:val="0F4761"/>
+      <w:color w:val="0F4761" w:themeColor="accent1" w:themeShade="bf"/>
     </w:rPr>
   </w:style>
   <w:style w:type="paragraph" w:styleId="Heading5">
@@ -5411,8 +5437,8 @@
       <w:outlineLvl w:val="4"/>
     </w:pPr>
     <w:rPr>
-      <w:rFonts w:eastAsia="" w:cs="" w:cstheme="majorBidi" w:eastAsiaTheme="majorEastAsia"/>
-      <w:color w:themeColor="accent1" w:themeShade="bf" w:val="0F4761"/>
+      <w:rFonts w:eastAsia="" w:cs="" w:eastAsiaTheme="majorEastAsia" w:cstheme="majorBidi"/>
+      <w:color w:val="0F4761" w:themeColor="accent1" w:themeShade="bf"/>
     </w:rPr>
   </w:style>
   <w:style w:type="paragraph" w:styleId="Heading6">
@@ -5432,10 +5458,10 @@
       <w:outlineLvl w:val="5"/>
     </w:pPr>
     <w:rPr>
-      <w:rFonts w:eastAsia="" w:cs="" w:cstheme="majorBidi" w:eastAsiaTheme="majorEastAsia"/>
+      <w:rFonts w:eastAsia="" w:cs="" w:eastAsiaTheme="majorEastAsia" w:cstheme="majorBidi"/>
       <w:i/>
       <w:iCs/>
-      <w:color w:themeColor="text1" w:themeTint="a6" w:val="595959"/>
+      <w:color w:val="595959" w:themeColor="text1" w:themeTint="a6"/>
     </w:rPr>
   </w:style>
   <w:style w:type="paragraph" w:styleId="Heading7">
@@ -5455,8 +5481,8 @@
       <w:outlineLvl w:val="6"/>
     </w:pPr>
     <w:rPr>
-      <w:rFonts w:eastAsia="" w:cs="" w:cstheme="majorBidi" w:eastAsiaTheme="majorEastAsia"/>
-      <w:color w:themeColor="text1" w:themeTint="a6" w:val="595959"/>
+      <w:rFonts w:eastAsia="" w:cs="" w:eastAsiaTheme="majorEastAsia" w:cstheme="majorBidi"/>
+      <w:color w:val="595959" w:themeColor="text1" w:themeTint="a6"/>
     </w:rPr>
   </w:style>
   <w:style w:type="paragraph" w:styleId="Heading8">
@@ -5476,10 +5502,10 @@
       <w:outlineLvl w:val="7"/>
     </w:pPr>
     <w:rPr>
-      <w:rFonts w:eastAsia="" w:cs="" w:cstheme="majorBidi" w:eastAsiaTheme="majorEastAsia"/>
+      <w:rFonts w:eastAsia="" w:cs="" w:eastAsiaTheme="majorEastAsia" w:cstheme="majorBidi"/>
       <w:i/>
       <w:iCs/>
-      <w:color w:themeColor="text1" w:themeTint="d8" w:val="272727"/>
+      <w:color w:val="272727" w:themeColor="text1" w:themeTint="d8"/>
     </w:rPr>
   </w:style>
   <w:style w:type="paragraph" w:styleId="Heading9">
@@ -5499,8 +5525,8 @@
       <w:outlineLvl w:val="8"/>
     </w:pPr>
     <w:rPr>
-      <w:rFonts w:eastAsia="" w:cs="" w:cstheme="majorBidi" w:eastAsiaTheme="majorEastAsia"/>
-      <w:color w:themeColor="text1" w:themeTint="d8" w:val="272727"/>
+      <w:rFonts w:eastAsia="" w:cs="" w:eastAsiaTheme="majorEastAsia" w:cstheme="majorBidi"/>
+      <w:color w:val="272727" w:themeColor="text1" w:themeTint="d8"/>
     </w:rPr>
   </w:style>
   <w:style w:type="character" w:styleId="DefaultParagraphFont" w:default="1">
@@ -5518,8 +5544,8 @@
     <w:qFormat/>
     <w:rsid w:val="008062cc"/>
     <w:rPr>
-      <w:rFonts w:ascii="Aptos Display" w:hAnsi="Aptos Display" w:eastAsia="" w:cs="" w:asciiTheme="majorHAnsi" w:cstheme="majorBidi" w:eastAsiaTheme="majorEastAsia" w:hAnsiTheme="majorHAnsi"/>
-      <w:color w:themeColor="accent1" w:themeShade="bf" w:val="0F4761"/>
+      <w:rFonts w:ascii="Aptos Display" w:hAnsi="Aptos Display" w:eastAsia="" w:cs="" w:asciiTheme="majorHAnsi" w:hAnsiTheme="majorHAnsi" w:eastAsiaTheme="majorEastAsia" w:cstheme="majorBidi"/>
+      <w:color w:val="0F4761" w:themeColor="accent1" w:themeShade="bf"/>
       <w:sz w:val="40"/>
       <w:szCs w:val="40"/>
     </w:rPr>
@@ -5532,8 +5558,8 @@
     <w:qFormat/>
     <w:rsid w:val="008062cc"/>
     <w:rPr>
-      <w:rFonts w:ascii="Aptos Display" w:hAnsi="Aptos Display" w:eastAsia="" w:cs="" w:asciiTheme="majorHAnsi" w:cstheme="majorBidi" w:eastAsiaTheme="majorEastAsia" w:hAnsiTheme="majorHAnsi"/>
-      <w:color w:themeColor="accent1" w:themeShade="bf" w:val="0F4761"/>
+      <w:rFonts w:ascii="Aptos Display" w:hAnsi="Aptos Display" w:eastAsia="" w:cs="" w:asciiTheme="majorHAnsi" w:hAnsiTheme="majorHAnsi" w:eastAsiaTheme="majorEastAsia" w:cstheme="majorBidi"/>
+      <w:color w:val="0F4761" w:themeColor="accent1" w:themeShade="bf"/>
       <w:sz w:val="32"/>
       <w:szCs w:val="32"/>
     </w:rPr>
@@ -5546,8 +5572,8 @@
     <w:qFormat/>
     <w:rsid w:val="008062cc"/>
     <w:rPr>
-      <w:rFonts w:eastAsia="" w:cs="" w:cstheme="majorBidi" w:eastAsiaTheme="majorEastAsia"/>
-      <w:color w:themeColor="accent1" w:themeShade="bf" w:val="0F4761"/>
+      <w:rFonts w:eastAsia="" w:cs="" w:eastAsiaTheme="majorEastAsia" w:cstheme="majorBidi"/>
+      <w:color w:val="0F4761" w:themeColor="accent1" w:themeShade="bf"/>
       <w:sz w:val="28"/>
       <w:szCs w:val="28"/>
     </w:rPr>
@@ -5560,10 +5586,10 @@
     <w:qFormat/>
     <w:rsid w:val="008062cc"/>
     <w:rPr>
-      <w:rFonts w:eastAsia="" w:cs="" w:cstheme="majorBidi" w:eastAsiaTheme="majorEastAsia"/>
+      <w:rFonts w:eastAsia="" w:cs="" w:eastAsiaTheme="majorEastAsia" w:cstheme="majorBidi"/>
       <w:i/>
       <w:iCs/>
-      <w:color w:themeColor="accent1" w:themeShade="bf" w:val="0F4761"/>
+      <w:color w:val="0F4761" w:themeColor="accent1" w:themeShade="bf"/>
     </w:rPr>
   </w:style>
   <w:style w:type="character" w:styleId="Nagwek5Znak" w:customStyle="1">
@@ -5574,8 +5600,8 @@
     <w:qFormat/>
     <w:rsid w:val="008062cc"/>
     <w:rPr>
-      <w:rFonts w:eastAsia="" w:cs="" w:cstheme="majorBidi" w:eastAsiaTheme="majorEastAsia"/>
-      <w:color w:themeColor="accent1" w:themeShade="bf" w:val="0F4761"/>
+      <w:rFonts w:eastAsia="" w:cs="" w:eastAsiaTheme="majorEastAsia" w:cstheme="majorBidi"/>
+      <w:color w:val="0F4761" w:themeColor="accent1" w:themeShade="bf"/>
     </w:rPr>
   </w:style>
   <w:style w:type="character" w:styleId="Nagwek6Znak" w:customStyle="1">
@@ -5586,10 +5612,10 @@
     <w:qFormat/>
     <w:rsid w:val="008062cc"/>
     <w:rPr>
-      <w:rFonts w:eastAsia="" w:cs="" w:cstheme="majorBidi" w:eastAsiaTheme="majorEastAsia"/>
+      <w:rFonts w:eastAsia="" w:cs="" w:eastAsiaTheme="majorEastAsia" w:cstheme="majorBidi"/>
       <w:i/>
       <w:iCs/>
-      <w:color w:themeColor="text1" w:themeTint="a6" w:val="595959"/>
+      <w:color w:val="595959" w:themeColor="text1" w:themeTint="a6"/>
     </w:rPr>
   </w:style>
   <w:style w:type="character" w:styleId="Nagwek7Znak" w:customStyle="1">
@@ -5600,8 +5626,8 @@
     <w:qFormat/>
     <w:rsid w:val="008062cc"/>
     <w:rPr>
-      <w:rFonts w:eastAsia="" w:cs="" w:cstheme="majorBidi" w:eastAsiaTheme="majorEastAsia"/>
-      <w:color w:themeColor="text1" w:themeTint="a6" w:val="595959"/>
+      <w:rFonts w:eastAsia="" w:cs="" w:eastAsiaTheme="majorEastAsia" w:cstheme="majorBidi"/>
+      <w:color w:val="595959" w:themeColor="text1" w:themeTint="a6"/>
     </w:rPr>
   </w:style>
   <w:style w:type="character" w:styleId="Nagwek8Znak" w:customStyle="1">
@@ -5612,10 +5638,10 @@
     <w:qFormat/>
     <w:rsid w:val="008062cc"/>
     <w:rPr>
-      <w:rFonts w:eastAsia="" w:cs="" w:cstheme="majorBidi" w:eastAsiaTheme="majorEastAsia"/>
+      <w:rFonts w:eastAsia="" w:cs="" w:eastAsiaTheme="majorEastAsia" w:cstheme="majorBidi"/>
       <w:i/>
       <w:iCs/>
-      <w:color w:themeColor="text1" w:themeTint="d8" w:val="272727"/>
+      <w:color w:val="272727" w:themeColor="text1" w:themeTint="d8"/>
     </w:rPr>
   </w:style>
   <w:style w:type="character" w:styleId="Nagwek9Znak" w:customStyle="1">
@@ -5626,8 +5652,8 @@
     <w:qFormat/>
     <w:rsid w:val="008062cc"/>
     <w:rPr>
-      <w:rFonts w:eastAsia="" w:cs="" w:cstheme="majorBidi" w:eastAsiaTheme="majorEastAsia"/>
-      <w:color w:themeColor="text1" w:themeTint="d8" w:val="272727"/>
+      <w:rFonts w:eastAsia="" w:cs="" w:eastAsiaTheme="majorEastAsia" w:cstheme="majorBidi"/>
+      <w:color w:val="272727" w:themeColor="text1" w:themeTint="d8"/>
     </w:rPr>
   </w:style>
   <w:style w:type="character" w:styleId="TytuZnak" w:customStyle="1">
@@ -5637,7 +5663,7 @@
     <w:qFormat/>
     <w:rsid w:val="008062cc"/>
     <w:rPr>
-      <w:rFonts w:ascii="Aptos Display" w:hAnsi="Aptos Display" w:eastAsia="" w:cs="" w:asciiTheme="majorHAnsi" w:cstheme="majorBidi" w:eastAsiaTheme="majorEastAsia" w:hAnsiTheme="majorHAnsi"/>
+      <w:rFonts w:ascii="Aptos Display" w:hAnsi="Aptos Display" w:eastAsia="" w:cs="" w:asciiTheme="majorHAnsi" w:hAnsiTheme="majorHAnsi" w:eastAsiaTheme="majorEastAsia" w:cstheme="majorBidi"/>
       <w:spacing w:val="-10"/>
       <w:kern w:val="2"/>
       <w:sz w:val="56"/>
@@ -5651,8 +5677,8 @@
     <w:qFormat/>
     <w:rsid w:val="008062cc"/>
     <w:rPr>
-      <w:rFonts w:eastAsia="" w:cs="" w:cstheme="majorBidi" w:eastAsiaTheme="majorEastAsia"/>
-      <w:color w:themeColor="text1" w:themeTint="a6" w:val="595959"/>
+      <w:rFonts w:eastAsia="" w:cs="" w:eastAsiaTheme="majorEastAsia" w:cstheme="majorBidi"/>
+      <w:color w:val="595959" w:themeColor="text1" w:themeTint="a6"/>
       <w:spacing w:val="15"/>
       <w:sz w:val="28"/>
       <w:szCs w:val="28"/>
@@ -5668,7 +5694,7 @@
     <w:rPr>
       <w:i/>
       <w:iCs/>
-      <w:color w:themeColor="text1" w:themeTint="bf" w:val="404040"/>
+      <w:color w:val="404040" w:themeColor="text1" w:themeTint="bf"/>
     </w:rPr>
   </w:style>
   <w:style w:type="character" w:styleId="IntenseEmphasis">
@@ -5680,7 +5706,7 @@
     <w:rPr>
       <w:i/>
       <w:iCs/>
-      <w:color w:themeColor="accent1" w:themeShade="bf" w:val="0F4761"/>
+      <w:color w:val="0F4761" w:themeColor="accent1" w:themeShade="bf"/>
     </w:rPr>
   </w:style>
   <w:style w:type="character" w:styleId="CytatintensywnyZnak" w:customStyle="1">
@@ -5693,7 +5719,7 @@
     <w:rPr>
       <w:i/>
       <w:iCs/>
-      <w:color w:themeColor="accent1" w:themeShade="bf" w:val="0F4761"/>
+      <w:color w:val="0F4761" w:themeColor="accent1" w:themeShade="bf"/>
     </w:rPr>
   </w:style>
   <w:style w:type="character" w:styleId="IntenseReference">
@@ -5706,7 +5732,7 @@
       <w:b/>
       <w:bCs/>
       <w:smallCaps/>
-      <w:color w:themeColor="accent1" w:themeShade="bf" w:val="0F4761"/>
+      <w:color w:val="0F4761" w:themeColor="accent1" w:themeShade="bf"/>
       <w:spacing w:val="5"/>
     </w:rPr>
   </w:style>
@@ -5788,7 +5814,7 @@
     <w:name w:val="Body Text"/>
     <w:basedOn w:val="Normal"/>
     <w:pPr>
-      <w:spacing w:lineRule="auto" w:line="276" w:before="0" w:after="0"/>
+      <w:spacing w:before="0" w:after="0" w:line="276" w:lineRule="auto"/>
     </w:pPr>
     <w:rPr/>
   </w:style>
@@ -5867,11 +5893,11 @@
     <w:qFormat/>
     <w:rsid w:val="008062cc"/>
     <w:pPr>
-      <w:spacing w:lineRule="auto" w:line="240" w:before="0" w:after="80"/>
+      <w:spacing w:before="0" w:after="80" w:line="240" w:lineRule="auto"/>
       <w:contextualSpacing/>
     </w:pPr>
     <w:rPr>
-      <w:rFonts w:ascii="Aptos Display" w:hAnsi="Aptos Display" w:eastAsia="" w:cs="" w:asciiTheme="majorHAnsi" w:cstheme="majorBidi" w:eastAsiaTheme="majorEastAsia" w:hAnsiTheme="majorHAnsi"/>
+      <w:rFonts w:ascii="Aptos Display" w:hAnsi="Aptos Display" w:eastAsia="" w:cs="" w:asciiTheme="majorHAnsi" w:hAnsiTheme="majorHAnsi" w:eastAsiaTheme="majorEastAsia" w:cstheme="majorBidi"/>
       <w:spacing w:val="-10"/>
       <w:sz w:val="56"/>
       <w:szCs w:val="56"/>
@@ -5887,8 +5913,8 @@
     <w:rsid w:val="008062cc"/>
     <w:pPr/>
     <w:rPr>
-      <w:rFonts w:eastAsia="" w:cs="" w:cstheme="majorBidi" w:eastAsiaTheme="majorEastAsia"/>
-      <w:color w:themeColor="text1" w:themeTint="a6" w:val="595959"/>
+      <w:rFonts w:eastAsia="" w:cs="" w:eastAsiaTheme="majorEastAsia" w:cstheme="majorBidi"/>
+      <w:color w:val="595959" w:themeColor="text1" w:themeTint="a6"/>
       <w:spacing w:val="15"/>
       <w:sz w:val="28"/>
       <w:szCs w:val="28"/>
@@ -5909,7 +5935,7 @@
     <w:rPr>
       <w:i/>
       <w:iCs/>
-      <w:color w:themeColor="text1" w:themeTint="bf" w:val="404040"/>
+      <w:color w:val="404040" w:themeColor="text1" w:themeTint="bf"/>
     </w:rPr>
   </w:style>
   <w:style w:type="paragraph" w:styleId="ListParagraph">
@@ -5935,8 +5961,8 @@
     <w:rsid w:val="008062cc"/>
     <w:pPr>
       <w:pBdr>
-        <w:top w:val="single" w:sz="4" w:space="10" w:color="0F4761" w:themeColor="accent1" w:themeShade="bf"/>
-        <w:bottom w:val="single" w:sz="4" w:space="10" w:color="0F4761" w:themeColor="accent1" w:themeShade="bf"/>
+        <w:top w:val="single" w:color="0F4761" w:themeColor="accent1" w:themeShade="bf" w:sz="4" w:space="10"/>
+        <w:bottom w:val="single" w:color="0F4761" w:themeColor="accent1" w:themeShade="bf" w:sz="4" w:space="10"/>
       </w:pBdr>
       <w:spacing w:before="360" w:after="360"/>
       <w:ind w:start="864" w:end="864"/>
@@ -5945,7 +5971,7 @@
     <w:rPr>
       <w:i/>
       <w:iCs/>
-      <w:color w:themeColor="accent1" w:themeShade="bf" w:val="0F4761"/>
+      <w:color w:val="0F4761" w:themeColor="accent1" w:themeShade="bf"/>
     </w:rPr>
   </w:style>
   <w:style w:type="paragraph" w:styleId="EndnoteText">
@@ -5957,7 +5983,7 @@
     <w:unhideWhenUsed/>
     <w:rsid w:val="008062cc"/>
     <w:pPr>
-      <w:spacing w:lineRule="auto" w:line="240" w:before="0" w:after="0"/>
+      <w:spacing w:before="0" w:after="0" w:line="240" w:lineRule="auto"/>
     </w:pPr>
     <w:rPr>
       <w:sz w:val="20"/>
@@ -5971,7 +5997,7 @@
     <w:unhideWhenUsed/>
     <w:qFormat/>
   </w:style>
-  <w:style w:type="table" w:default="1" w:styleId="Standardowy">
+  <w:style w:type="table" w:styleId="Standardowy" w:default="1">
     <w:name w:val="Normal Table"/>
     <w:uiPriority w:val="99"/>
     <w:semiHidden/>

</xml_diff>